<commit_message>
Ablacion del desbalanceo: SMOTE previo produce AUC-PR 1.0000
</commit_message>
<xml_diff>
--- a/memoria/memoria_TFG.docx
+++ b/memoria/memoria_TFG.docx
@@ -1184,6 +1184,21 @@
     <w:p>
       <w:pPr>
         <w:spacing w:after="160" w:line="360" w:lineRule="auto"/>
+        <w:ind w:firstLine="425"/>
+        <w:jc w:val="both"/>
+      </w:pPr>
+      <w:r>
+        <w:rPr>
+          <w:rFonts w:ascii="Arial" w:cs="Arial" w:eastAsia="Arial" w:hAnsi="Arial"/>
+          <w:sz w:val="22"/>
+          <w:szCs w:val="22"/>
+        </w:rPr>
+        <w:t xml:space="preserve">El conjunto de datos empleado en este trabajo es el de referencia en la literatura de detección de fraude con tarjeta, lo que permite situar las métricas obtenidas frente a resultados publicados. Los valores reportados de AUC-PR se sitúan aproximadamente entre 0,78 y 0,97, según el tratamiento que cada trabajo aplique al desbalanceo de clases.</w:t>
+      </w:r>
+    </w:p>
+    <w:p>
+      <w:pPr>
+        <w:spacing w:after="160" w:line="360" w:lineRule="auto"/>
       </w:pPr>
       <w:r>
         <w:rPr>
@@ -1194,7 +1209,22 @@
           <w:sz w:val="22"/>
           <w:szCs w:val="22"/>
         </w:rPr>
-        <w:t xml:space="preserve">[PENDIENTE] Redactar a partir de docs/ESTADO_DEL_ARTE.md, sección 2. Los resultados publicados sobre el conjunto de datos empleado se sitúan entre 0,78 y 0,97 de AUC-PR según el tratamiento del desbalanceo.</w:t>
+        <w:t xml:space="preserve">[PENDIENTE] Citar dos o tres trabajos concretos del rango alto y del rango bajo, con sus referencias completas. Ver docs/ESTADO_DEL_ARTE.md, sección 2.</w:t>
+      </w:r>
+    </w:p>
+    <w:p>
+      <w:pPr>
+        <w:spacing w:after="160" w:line="360" w:lineRule="auto"/>
+        <w:ind w:firstLine="425"/>
+        <w:jc w:val="both"/>
+      </w:pPr>
+      <w:r>
+        <w:rPr>
+          <w:rFonts w:ascii="Arial" w:cs="Arial" w:eastAsia="Arial" w:hAnsi="Arial"/>
+          <w:sz w:val="22"/>
+          <w:szCs w:val="22"/>
+        </w:rPr>
+        <w:t xml:space="preserve">Esa horquilla es muy amplia para un mismo conjunto de datos y un mismo tipo de modelo, y la explicación de buena parte de ella no está en los algoritmos sino en la metodología de evaluación.</w:t>
       </w:r>
     </w:p>
     <w:p>
@@ -1211,23 +1241,288 @@
           <w:sz w:val="24"/>
           <w:szCs w:val="24"/>
         </w:rPr>
-        <w:t xml:space="preserve">La cuestión de la fuga de información</w:t>
-      </w:r>
-    </w:p>
-    <w:p>
-      <w:pPr>
-        <w:spacing w:after="160" w:line="360" w:lineRule="auto"/>
-      </w:pPr>
-      <w:r>
-        <w:rPr>
-          <w:rFonts w:ascii="Arial" w:cs="Arial" w:eastAsia="Arial" w:hAnsi="Arial"/>
-          <w:i/>
-          <w:iCs/>
-          <w:color w:val="808080"/>
-          <w:sz w:val="22"/>
-          <w:szCs w:val="22"/>
-        </w:rPr>
-        <w:t xml:space="preserve">[PENDIENTE] Desarrollar tras leer los dos trabajos sobre fuga de información. Idea central: existe literatura crítica que documenta que buena parte de los resultados altos publicados están inflados por aplicar remuestreo o normalización antes de partir el conjunto en entrenamiento y prueba. La diferenciación metodológica de este trabajo consiste en no emplear remuestreo sintético, ponderar la clase minoritaria mediante el gradiente, y reportar además de la partición aleatoria una partición temporal.</w:t>
+        <w:t xml:space="preserve">2.1.1 La cuestión de la fuga de información</w:t>
+      </w:r>
+    </w:p>
+    <w:p>
+      <w:pPr>
+        <w:spacing w:after="160" w:line="360" w:lineRule="auto"/>
+        <w:ind w:firstLine="425"/>
+        <w:jc w:val="both"/>
+      </w:pPr>
+      <w:r>
+        <w:rPr>
+          <w:rFonts w:ascii="Arial" w:cs="Arial" w:eastAsia="Arial" w:hAnsi="Arial"/>
+          <w:sz w:val="22"/>
+          <w:szCs w:val="22"/>
+        </w:rPr>
+        <w:t xml:space="preserve">El desbalanceo extremo de este dominio obliga a tratarlo explícitamente, y la vía más extendida en la literatura es el remuestreo: generar ejemplos sintéticos de la clase minoritaria mediante técnicas como SMOTE hasta equilibrar la distribución.</w:t>
+      </w:r>
+    </w:p>
+    <w:p>
+      <w:pPr>
+        <w:spacing w:after="160" w:line="360" w:lineRule="auto"/>
+        <w:ind w:firstLine="425"/>
+        <w:jc w:val="both"/>
+      </w:pPr>
+      <w:r>
+        <w:rPr>
+          <w:rFonts w:ascii="Arial" w:cs="Arial" w:eastAsia="Arial" w:hAnsi="Arial"/>
+          <w:sz w:val="22"/>
+          <w:szCs w:val="22"/>
+        </w:rPr>
+        <w:t xml:space="preserve">Trabajos recientes han examinado críticamente cómo se aplica ese remuestreo, y el hallazgo es relevante para cualquier resultado publicado sobre este conjunto de datos. Su conclusión puede resumirse en tres puntos.</w:t>
+      </w:r>
+    </w:p>
+    <w:p>
+      <w:pPr>
+        <w:spacing w:after="160" w:line="360" w:lineRule="auto"/>
+        <w:ind w:firstLine="425"/>
+        <w:jc w:val="both"/>
+      </w:pPr>
+      <w:r>
+        <w:rPr>
+          <w:rFonts w:ascii="Arial" w:cs="Arial" w:eastAsia="Arial" w:hAnsi="Arial"/>
+          <w:sz w:val="22"/>
+          <w:szCs w:val="22"/>
+        </w:rPr>
+        <w:t xml:space="preserve">Primero, </w:t>
+      </w:r>
+      <w:r>
+        <w:rPr>
+          <w:rFonts w:ascii="Arial" w:cs="Arial" w:eastAsia="Arial" w:hAnsi="Arial"/>
+          <w:b/>
+          <w:bCs/>
+          <w:sz w:val="22"/>
+          <w:szCs w:val="22"/>
+        </w:rPr>
+        <w:t xml:space="preserve">las estrategias de remuestreo mejoran efectivamente el rendimiento del modelo</w:t>
+      </w:r>
+      <w:r>
+        <w:rPr>
+          <w:rFonts w:ascii="Arial" w:cs="Arial" w:eastAsia="Arial" w:hAnsi="Arial"/>
+          <w:sz w:val="22"/>
+          <w:szCs w:val="22"/>
+        </w:rPr>
+        <w:t xml:space="preserve">. El problema no está en la técnica.</w:t>
+      </w:r>
+    </w:p>
+    <w:p>
+      <w:pPr>
+        <w:spacing w:after="160" w:line="360" w:lineRule="auto"/>
+        <w:ind w:firstLine="425"/>
+        <w:jc w:val="both"/>
+      </w:pPr>
+      <w:r>
+        <w:rPr>
+          <w:rFonts w:ascii="Arial" w:cs="Arial" w:eastAsia="Arial" w:hAnsi="Arial"/>
+          <w:sz w:val="22"/>
+          <w:szCs w:val="22"/>
+        </w:rPr>
+        <w:t xml:space="preserve">Segundo, </w:t>
+      </w:r>
+      <w:r>
+        <w:rPr>
+          <w:rFonts w:ascii="Arial" w:cs="Arial" w:eastAsia="Arial" w:hAnsi="Arial"/>
+          <w:b/>
+          <w:bCs/>
+          <w:sz w:val="22"/>
+          <w:szCs w:val="22"/>
+        </w:rPr>
+        <w:t xml:space="preserve">la fiabilidad de los resultados depende del momento en que se aplica</w:t>
+      </w:r>
+      <w:r>
+        <w:rPr>
+          <w:rFonts w:ascii="Arial" w:cs="Arial" w:eastAsia="Arial" w:hAnsi="Arial"/>
+          <w:sz w:val="22"/>
+          <w:szCs w:val="22"/>
+        </w:rPr>
+        <w:t xml:space="preserve">. Cuando el remuestreo precede a la división entre entrenamiento y prueba, se produce fuga de información: los ejemplos sintéticos se generan interpolando observaciones que incluyen las del conjunto de prueba, de modo que información de la evaluación acaba incorporada al entrenamiento. Los modelos así construidos presentan métricas infladas artificialmente.</w:t>
+      </w:r>
+    </w:p>
+    <w:p>
+      <w:pPr>
+        <w:spacing w:after="160" w:line="360" w:lineRule="auto"/>
+        <w:ind w:firstLine="425"/>
+        <w:jc w:val="both"/>
+      </w:pPr>
+      <w:r>
+        <w:rPr>
+          <w:rFonts w:ascii="Arial" w:cs="Arial" w:eastAsia="Arial" w:hAnsi="Arial"/>
+          <w:sz w:val="22"/>
+          <w:szCs w:val="22"/>
+        </w:rPr>
+        <w:t xml:space="preserve">Tercero, y es el dato que da la medida del problema, </w:t>
+      </w:r>
+      <w:r>
+        <w:rPr>
+          <w:rFonts w:ascii="Arial" w:cs="Arial" w:eastAsia="Arial" w:hAnsi="Arial"/>
+          <w:b/>
+          <w:bCs/>
+          <w:sz w:val="22"/>
+          <w:szCs w:val="22"/>
+        </w:rPr>
+        <w:t xml:space="preserve">los modelos con remuestreo aplicado únicamente sobre el conjunto de entrenamiento obtienen resultados significativamente inferiores</w:t>
+      </w:r>
+      <w:r>
+        <w:rPr>
+          <w:rFonts w:ascii="Arial" w:cs="Arial" w:eastAsia="Arial" w:hAnsi="Arial"/>
+          <w:sz w:val="22"/>
+          <w:szCs w:val="22"/>
+        </w:rPr>
+        <w:t xml:space="preserve"> a los que lo aplicaron antes de dividir, preservando en cambio la integridad del procedimiento de evaluación.</w:t>
+      </w:r>
+    </w:p>
+    <w:p>
+      <w:pPr>
+        <w:spacing w:after="160" w:line="360" w:lineRule="auto"/>
+        <w:ind w:firstLine="425"/>
+        <w:jc w:val="both"/>
+      </w:pPr>
+      <w:r>
+        <w:rPr>
+          <w:rFonts w:ascii="Arial" w:cs="Arial" w:eastAsia="Arial" w:hAnsi="Arial"/>
+          <w:sz w:val="22"/>
+          <w:szCs w:val="22"/>
+        </w:rPr>
+        <w:t xml:space="preserve">La consecuencia práctica es que una parte de los valores publicados en el extremo alto de la horquilla no es comparable con valores obtenidos mediante un procedimiento sin fuga, y que una comparación directa de cifras entre trabajos, sin examinar el orden de las operaciones, carece de sentido.</w:t>
+      </w:r>
+    </w:p>
+    <w:p>
+      <w:pPr>
+        <w:pStyle w:val="Heading3"/>
+        <w:spacing w:after="200" w:before="360"/>
+      </w:pPr>
+      <w:r>
+        <w:rPr>
+          <w:rFonts w:ascii="Arial" w:cs="Arial" w:eastAsia="Arial" w:hAnsi="Arial"/>
+          <w:b/>
+          <w:bCs/>
+          <w:color w:val="000000"/>
+          <w:sz w:val="24"/>
+          <w:szCs w:val="24"/>
+        </w:rPr>
+        <w:t xml:space="preserve">2.1.2 Posición metodológica de este trabajo</w:t>
+      </w:r>
+    </w:p>
+    <w:p>
+      <w:pPr>
+        <w:spacing w:after="160" w:line="360" w:lineRule="auto"/>
+        <w:ind w:firstLine="425"/>
+        <w:jc w:val="both"/>
+      </w:pPr>
+      <w:r>
+        <w:rPr>
+          <w:rFonts w:ascii="Arial" w:cs="Arial" w:eastAsia="Arial" w:hAnsi="Arial"/>
+          <w:sz w:val="22"/>
+          <w:szCs w:val="22"/>
+        </w:rPr>
+        <w:t xml:space="preserve">De lo anterior se derivan tres decisiones, expuestas aquí para que el lector pueda situar las métricas del capítulo 5.</w:t>
+      </w:r>
+    </w:p>
+    <w:p>
+      <w:pPr>
+        <w:spacing w:after="160" w:line="360" w:lineRule="auto"/>
+        <w:ind w:firstLine="425"/>
+        <w:jc w:val="both"/>
+      </w:pPr>
+      <w:r>
+        <w:rPr>
+          <w:rFonts w:ascii="Arial" w:cs="Arial" w:eastAsia="Arial" w:hAnsi="Arial"/>
+          <w:b/>
+          <w:bCs/>
+          <w:sz w:val="22"/>
+          <w:szCs w:val="22"/>
+        </w:rPr>
+        <w:t xml:space="preserve">No se emplea remuestreo sintético.</w:t>
+      </w:r>
+      <w:r>
+        <w:rPr>
+          <w:rFonts w:ascii="Arial" w:cs="Arial" w:eastAsia="Arial" w:hAnsi="Arial"/>
+          <w:sz w:val="22"/>
+          <w:szCs w:val="22"/>
+        </w:rPr>
+        <w:t xml:space="preserve"> El desbalanceo se trata ponderando el gradiente de la clase minoritaria, mecanismo que no genera observaciones nuevas y que, por construcción, no puede incurrir en fuga de información: la ponderación se aplica sobre el conjunto de entrenamiento en el momento del ajuste, sin tocar la partición.</w:t>
+      </w:r>
+    </w:p>
+    <w:p>
+      <w:pPr>
+        <w:spacing w:after="160" w:line="360" w:lineRule="auto"/>
+        <w:ind w:firstLine="425"/>
+        <w:jc w:val="both"/>
+      </w:pPr>
+      <w:r>
+        <w:rPr>
+          <w:rFonts w:ascii="Arial" w:cs="Arial" w:eastAsia="Arial" w:hAnsi="Arial"/>
+          <w:sz w:val="22"/>
+          <w:szCs w:val="22"/>
+        </w:rPr>
+        <w:t xml:space="preserve">Conviene precisar el alcance de esa decisión, porque no sería honesto presentarla como una afirmación de superioridad. La literatura citada indica que el remuestreo aplicado correctamente mejora el rendimiento, de modo que cabía esperar que la elección adoptada aquí rindiera algo menos.</w:t>
+      </w:r>
+    </w:p>
+    <w:p>
+      <w:pPr>
+        <w:spacing w:after="160" w:line="360" w:lineRule="auto"/>
+        <w:ind w:firstLine="425"/>
+        <w:jc w:val="both"/>
+      </w:pPr>
+      <w:r>
+        <w:rPr>
+          <w:rFonts w:ascii="Arial" w:cs="Arial" w:eastAsia="Arial" w:hAnsi="Arial"/>
+          <w:sz w:val="22"/>
+          <w:szCs w:val="22"/>
+        </w:rPr>
+        <w:t xml:space="preserve">Esa cuestión se resolvió empíricamente mediante una ablación sobre los datos del propio trabajo, cuyos resultados se detallan en el capítulo 5. Se adelanta la conclusión por su pertinencia aquí: ambas estrategias rinden de forma equivalente, y la reproducción deliberada del error metodológico produce un valor de AUC-PR perfecto en las dos particiones evaluadas.</w:t>
+      </w:r>
+    </w:p>
+    <w:p>
+      <w:pPr>
+        <w:spacing w:after="160" w:line="360" w:lineRule="auto"/>
+        <w:ind w:firstLine="425"/>
+        <w:jc w:val="both"/>
+      </w:pPr>
+      <w:r>
+        <w:rPr>
+          <w:rFonts w:ascii="Arial" w:cs="Arial" w:eastAsia="Arial" w:hAnsi="Arial"/>
+          <w:b/>
+          <w:bCs/>
+          <w:sz w:val="22"/>
+          <w:szCs w:val="22"/>
+        </w:rPr>
+        <w:t xml:space="preserve">Se reporta además una partición temporal.</w:t>
+      </w:r>
+      <w:r>
+        <w:rPr>
+          <w:rFonts w:ascii="Arial" w:cs="Arial" w:eastAsia="Arial" w:hAnsi="Arial"/>
+          <w:sz w:val="22"/>
+          <w:szCs w:val="22"/>
+        </w:rPr>
+        <w:t xml:space="preserve"> La mayor parte de la literatura evalúa sobre una partición aleatoria. Este trabajo reporta también una partición cronológica —entrenar con el pasado, predecir el futuro—, que es la única que reproduce las condiciones de explotación y que, como es de esperar, produce métricas inferiores.</w:t>
+      </w:r>
+    </w:p>
+    <w:p>
+      <w:pPr>
+        <w:spacing w:after="160" w:line="360" w:lineRule="auto"/>
+        <w:ind w:firstLine="425"/>
+        <w:jc w:val="both"/>
+      </w:pPr>
+      <w:r>
+        <w:rPr>
+          <w:rFonts w:ascii="Arial" w:cs="Arial" w:eastAsia="Arial" w:hAnsi="Arial"/>
+          <w:b/>
+          <w:bCs/>
+          <w:sz w:val="22"/>
+          <w:szCs w:val="22"/>
+        </w:rPr>
+        <w:t xml:space="preserve">Se reporta Precision@N junto a las métricas agregadas.</w:t>
+      </w:r>
+      <w:r>
+        <w:rPr>
+          <w:rFonts w:ascii="Arial" w:cs="Arial" w:eastAsia="Arial" w:hAnsi="Arial"/>
+          <w:sz w:val="22"/>
+          <w:szCs w:val="22"/>
+        </w:rPr>
+        <w:t xml:space="preserve"> Un departamento antifraude no revisa todo lo que el modelo señala, sino los primeros casos de la ordenación. Una métrica agregada puede diferir de forma estadísticamente significativa entre dos modelos que resultan indistinguibles en la parte del ranking que alguien llega a revisar, situación que se documenta empíricamente en el capítulo 5.</w:t>
       </w:r>
     </w:p>
     <w:p>
@@ -9416,6 +9711,504 @@
           <w:szCs w:val="22"/>
         </w:rPr>
         <w:t xml:space="preserve">La ventaja reside en la cola del ranking, que ningún analista revisa. Es un caso de diferencia estadísticamente real y operativamente irrelevante, y además demuestra que la conclusión sobre qué modelo es superior depende del protocolo de evaluación elegido.</w:t>
+      </w:r>
+    </w:p>
+    <w:p>
+      <w:pPr>
+        <w:pStyle w:val="Heading3"/>
+        <w:spacing w:after="200" w:before="360"/>
+      </w:pPr>
+      <w:r>
+        <w:rPr>
+          <w:rFonts w:ascii="Arial" w:cs="Arial" w:eastAsia="Arial" w:hAnsi="Arial"/>
+          <w:b/>
+          <w:bCs/>
+          <w:color w:val="000000"/>
+          <w:sz w:val="24"/>
+          <w:szCs w:val="24"/>
+        </w:rPr>
+        <w:t xml:space="preserve">El tratamiento del desbalanceo y la fuga de información</w:t>
+      </w:r>
+    </w:p>
+    <w:p>
+      <w:pPr>
+        <w:spacing w:after="160" w:line="360" w:lineRule="auto"/>
+        <w:ind w:firstLine="425"/>
+        <w:jc w:val="both"/>
+      </w:pPr>
+      <w:r>
+        <w:rPr>
+          <w:rFonts w:ascii="Arial" w:cs="Arial" w:eastAsia="Arial" w:hAnsi="Arial"/>
+          <w:sz w:val="22"/>
+          <w:szCs w:val="22"/>
+        </w:rPr>
+        <w:t xml:space="preserve">La literatura sobre este conjunto de datos advierte de que una parte de los resultados publicados está inflada por aplicar el remuestreo antes de dividir en entrenamiento y prueba. Para resolver la cuestión sobre los datos propios se realizó una ablación con cuatro estrategias, incluida la reproducción deliberada de ese error metodológico.</w:t>
+      </w:r>
+    </w:p>
+    <w:tbl>
+      <w:tblPr>
+        <w:tblW w:type="dxa" w:w="9000"/>
+        <w:tblBorders>
+          <w:top w:val="single" w:color="auto" w:sz="4"/>
+          <w:left w:val="single" w:color="auto" w:sz="4"/>
+          <w:bottom w:val="single" w:color="auto" w:sz="4"/>
+          <w:right w:val="single" w:color="auto" w:sz="4"/>
+          <w:insideH w:val="single" w:color="auto" w:sz="4"/>
+          <w:insideV w:val="single" w:color="auto" w:sz="4"/>
+        </w:tblBorders>
+      </w:tblPr>
+      <w:tblGrid>
+        <w:gridCol w:w="3000"/>
+        <w:gridCol w:w="3000"/>
+        <w:gridCol w:w="3000"/>
+      </w:tblGrid>
+      <w:tr>
+        <w:tc>
+          <w:tcPr>
+            <w:tcW w:type="dxa" w:w="3000"/>
+            <w:shd w:fill="D9D9D9" w:val="clear"/>
+          </w:tcPr>
+          <w:p>
+            <w:pPr>
+              <w:spacing w:after="0"/>
+            </w:pPr>
+            <w:r>
+              <w:rPr>
+                <w:rFonts w:ascii="Arial" w:cs="Arial" w:eastAsia="Arial" w:hAnsi="Arial"/>
+                <w:b/>
+                <w:bCs/>
+                <w:sz w:val="20"/>
+                <w:szCs w:val="20"/>
+              </w:rPr>
+              <w:t xml:space="preserve">Estrategia</w:t>
+            </w:r>
+          </w:p>
+        </w:tc>
+        <w:tc>
+          <w:tcPr>
+            <w:tcW w:type="dxa" w:w="3000"/>
+            <w:shd w:fill="D9D9D9" w:val="clear"/>
+          </w:tcPr>
+          <w:p>
+            <w:pPr>
+              <w:spacing w:after="0"/>
+            </w:pPr>
+            <w:r>
+              <w:rPr>
+                <w:rFonts w:ascii="Arial" w:cs="Arial" w:eastAsia="Arial" w:hAnsi="Arial"/>
+                <w:b/>
+                <w:bCs/>
+                <w:sz w:val="20"/>
+                <w:szCs w:val="20"/>
+              </w:rPr>
+              <w:t xml:space="preserve">AUC-PR temporal</w:t>
+            </w:r>
+          </w:p>
+        </w:tc>
+        <w:tc>
+          <w:tcPr>
+            <w:tcW w:type="dxa" w:w="3000"/>
+            <w:shd w:fill="D9D9D9" w:val="clear"/>
+          </w:tcPr>
+          <w:p>
+            <w:pPr>
+              <w:spacing w:after="0"/>
+            </w:pPr>
+            <w:r>
+              <w:rPr>
+                <w:rFonts w:ascii="Arial" w:cs="Arial" w:eastAsia="Arial" w:hAnsi="Arial"/>
+                <w:b/>
+                <w:bCs/>
+                <w:sz w:val="20"/>
+                <w:szCs w:val="20"/>
+              </w:rPr>
+              <w:t xml:space="preserve">AUC-PR aleatoria</w:t>
+            </w:r>
+          </w:p>
+        </w:tc>
+      </w:tr>
+      <w:tr>
+        <w:tc>
+          <w:tcPr>
+            <w:tcW w:type="dxa" w:w="3000"/>
+          </w:tcPr>
+          <w:p>
+            <w:pPr>
+              <w:spacing w:after="0"/>
+            </w:pPr>
+            <w:r>
+              <w:rPr>
+                <w:rFonts w:ascii="Arial" w:cs="Arial" w:eastAsia="Arial" w:hAnsi="Arial"/>
+                <w:b w:val="false"/>
+                <w:bCs w:val="false"/>
+                <w:sz w:val="20"/>
+                <w:szCs w:val="20"/>
+              </w:rPr>
+              <w:t xml:space="preserve">Sin tratamiento del desbalanceo</w:t>
+            </w:r>
+          </w:p>
+        </w:tc>
+        <w:tc>
+          <w:tcPr>
+            <w:tcW w:type="dxa" w:w="3000"/>
+          </w:tcPr>
+          <w:p>
+            <w:pPr>
+              <w:spacing w:after="0"/>
+            </w:pPr>
+            <w:r>
+              <w:rPr>
+                <w:rFonts w:ascii="Arial" w:cs="Arial" w:eastAsia="Arial" w:hAnsi="Arial"/>
+                <w:b w:val="false"/>
+                <w:bCs w:val="false"/>
+                <w:sz w:val="20"/>
+                <w:szCs w:val="20"/>
+              </w:rPr>
+              <w:t xml:space="preserve">0,6990</w:t>
+            </w:r>
+          </w:p>
+        </w:tc>
+        <w:tc>
+          <w:tcPr>
+            <w:tcW w:type="dxa" w:w="3000"/>
+          </w:tcPr>
+          <w:p>
+            <w:pPr>
+              <w:spacing w:after="0"/>
+            </w:pPr>
+            <w:r>
+              <w:rPr>
+                <w:rFonts w:ascii="Arial" w:cs="Arial" w:eastAsia="Arial" w:hAnsi="Arial"/>
+                <w:b w:val="false"/>
+                <w:bCs w:val="false"/>
+                <w:sz w:val="20"/>
+                <w:szCs w:val="20"/>
+              </w:rPr>
+              <w:t xml:space="preserve">0,8560</w:t>
+            </w:r>
+          </w:p>
+        </w:tc>
+      </w:tr>
+      <w:tr>
+        <w:tc>
+          <w:tcPr>
+            <w:tcW w:type="dxa" w:w="3000"/>
+          </w:tcPr>
+          <w:p>
+            <w:pPr>
+              <w:spacing w:after="0"/>
+            </w:pPr>
+            <w:r>
+              <w:rPr>
+                <w:rFonts w:ascii="Arial" w:cs="Arial" w:eastAsia="Arial" w:hAnsi="Arial"/>
+                <w:b w:val="false"/>
+                <w:bCs w:val="false"/>
+                <w:sz w:val="20"/>
+                <w:szCs w:val="20"/>
+              </w:rPr>
+              <w:t xml:space="preserve">Ponderación del gradiente</w:t>
+            </w:r>
+          </w:p>
+        </w:tc>
+        <w:tc>
+          <w:tcPr>
+            <w:tcW w:type="dxa" w:w="3000"/>
+          </w:tcPr>
+          <w:p>
+            <w:pPr>
+              <w:spacing w:after="0"/>
+            </w:pPr>
+            <w:r>
+              <w:rPr>
+                <w:rFonts w:ascii="Arial" w:cs="Arial" w:eastAsia="Arial" w:hAnsi="Arial"/>
+                <w:b w:val="false"/>
+                <w:bCs w:val="false"/>
+                <w:sz w:val="20"/>
+                <w:szCs w:val="20"/>
+              </w:rPr>
+              <w:t xml:space="preserve">0,8003</w:t>
+            </w:r>
+          </w:p>
+        </w:tc>
+        <w:tc>
+          <w:tcPr>
+            <w:tcW w:type="dxa" w:w="3000"/>
+          </w:tcPr>
+          <w:p>
+            <w:pPr>
+              <w:spacing w:after="0"/>
+            </w:pPr>
+            <w:r>
+              <w:rPr>
+                <w:rFonts w:ascii="Arial" w:cs="Arial" w:eastAsia="Arial" w:hAnsi="Arial"/>
+                <w:b w:val="false"/>
+                <w:bCs w:val="false"/>
+                <w:sz w:val="20"/>
+                <w:szCs w:val="20"/>
+              </w:rPr>
+              <w:t xml:space="preserve">0,8832</w:t>
+            </w:r>
+          </w:p>
+        </w:tc>
+      </w:tr>
+      <w:tr>
+        <w:tc>
+          <w:tcPr>
+            <w:tcW w:type="dxa" w:w="3000"/>
+          </w:tcPr>
+          <w:p>
+            <w:pPr>
+              <w:spacing w:after="0"/>
+            </w:pPr>
+            <w:r>
+              <w:rPr>
+                <w:rFonts w:ascii="Arial" w:cs="Arial" w:eastAsia="Arial" w:hAnsi="Arial"/>
+                <w:b w:val="false"/>
+                <w:bCs w:val="false"/>
+                <w:sz w:val="20"/>
+                <w:szCs w:val="20"/>
+              </w:rPr>
+              <w:t xml:space="preserve">SMOTE tras la división (correcto)</w:t>
+            </w:r>
+          </w:p>
+        </w:tc>
+        <w:tc>
+          <w:tcPr>
+            <w:tcW w:type="dxa" w:w="3000"/>
+          </w:tcPr>
+          <w:p>
+            <w:pPr>
+              <w:spacing w:after="0"/>
+            </w:pPr>
+            <w:r>
+              <w:rPr>
+                <w:rFonts w:ascii="Arial" w:cs="Arial" w:eastAsia="Arial" w:hAnsi="Arial"/>
+                <w:b w:val="false"/>
+                <w:bCs w:val="false"/>
+                <w:sz w:val="20"/>
+                <w:szCs w:val="20"/>
+              </w:rPr>
+              <w:t xml:space="preserve">0,7993</w:t>
+            </w:r>
+          </w:p>
+        </w:tc>
+        <w:tc>
+          <w:tcPr>
+            <w:tcW w:type="dxa" w:w="3000"/>
+          </w:tcPr>
+          <w:p>
+            <w:pPr>
+              <w:spacing w:after="0"/>
+            </w:pPr>
+            <w:r>
+              <w:rPr>
+                <w:rFonts w:ascii="Arial" w:cs="Arial" w:eastAsia="Arial" w:hAnsi="Arial"/>
+                <w:b w:val="false"/>
+                <w:bCs w:val="false"/>
+                <w:sz w:val="20"/>
+                <w:szCs w:val="20"/>
+              </w:rPr>
+              <w:t xml:space="preserve">0,8808</w:t>
+            </w:r>
+          </w:p>
+        </w:tc>
+      </w:tr>
+      <w:tr>
+        <w:tc>
+          <w:tcPr>
+            <w:tcW w:type="dxa" w:w="3000"/>
+          </w:tcPr>
+          <w:p>
+            <w:pPr>
+              <w:spacing w:after="0"/>
+            </w:pPr>
+            <w:r>
+              <w:rPr>
+                <w:rFonts w:ascii="Arial" w:cs="Arial" w:eastAsia="Arial" w:hAnsi="Arial"/>
+                <w:b w:val="false"/>
+                <w:bCs w:val="false"/>
+                <w:sz w:val="20"/>
+                <w:szCs w:val="20"/>
+              </w:rPr>
+              <w:t xml:space="preserve">SMOTE antes de dividir (con fuga)</w:t>
+            </w:r>
+          </w:p>
+        </w:tc>
+        <w:tc>
+          <w:tcPr>
+            <w:tcW w:type="dxa" w:w="3000"/>
+          </w:tcPr>
+          <w:p>
+            <w:pPr>
+              <w:spacing w:after="0"/>
+            </w:pPr>
+            <w:r>
+              <w:rPr>
+                <w:rFonts w:ascii="Arial" w:cs="Arial" w:eastAsia="Arial" w:hAnsi="Arial"/>
+                <w:b w:val="false"/>
+                <w:bCs w:val="false"/>
+                <w:sz w:val="20"/>
+                <w:szCs w:val="20"/>
+              </w:rPr>
+              <w:t xml:space="preserve">**1,0000**</w:t>
+            </w:r>
+          </w:p>
+        </w:tc>
+        <w:tc>
+          <w:tcPr>
+            <w:tcW w:type="dxa" w:w="3000"/>
+          </w:tcPr>
+          <w:p>
+            <w:pPr>
+              <w:spacing w:after="0"/>
+            </w:pPr>
+            <w:r>
+              <w:rPr>
+                <w:rFonts w:ascii="Arial" w:cs="Arial" w:eastAsia="Arial" w:hAnsi="Arial"/>
+                <w:b w:val="false"/>
+                <w:bCs w:val="false"/>
+                <w:sz w:val="20"/>
+                <w:szCs w:val="20"/>
+              </w:rPr>
+              <w:t xml:space="preserve">**1,0000**</w:t>
+            </w:r>
+          </w:p>
+        </w:tc>
+      </w:tr>
+    </w:tbl>
+    <w:p>
+      <w:pPr>
+        <w:spacing w:after="160"/>
+      </w:pPr>
+    </w:p>
+    <w:p>
+      <w:pPr>
+        <w:spacing w:after="160" w:line="360" w:lineRule="auto"/>
+        <w:ind w:firstLine="425"/>
+        <w:jc w:val="both"/>
+      </w:pPr>
+      <w:r>
+        <w:rPr>
+          <w:rFonts w:ascii="Arial" w:cs="Arial" w:eastAsia="Arial" w:hAnsi="Arial"/>
+          <w:sz w:val="22"/>
+          <w:szCs w:val="22"/>
+        </w:rPr>
+        <w:t xml:space="preserve">De aquí se extraen tres conclusiones, coincidentes en ambas particiones.</w:t>
+      </w:r>
+    </w:p>
+    <w:p>
+      <w:pPr>
+        <w:spacing w:after="160" w:line="360" w:lineRule="auto"/>
+        <w:ind w:firstLine="425"/>
+        <w:jc w:val="both"/>
+      </w:pPr>
+      <w:r>
+        <w:rPr>
+          <w:rFonts w:ascii="Arial" w:cs="Arial" w:eastAsia="Arial" w:hAnsi="Arial"/>
+          <w:b/>
+          <w:bCs/>
+          <w:sz w:val="22"/>
+          <w:szCs w:val="22"/>
+        </w:rPr>
+        <w:t xml:space="preserve">Tratar el desbalanceo es necesario.</w:t>
+      </w:r>
+      <w:r>
+        <w:rPr>
+          <w:rFonts w:ascii="Arial" w:cs="Arial" w:eastAsia="Arial" w:hAnsi="Arial"/>
+          <w:sz w:val="22"/>
+          <w:szCs w:val="22"/>
+        </w:rPr>
+        <w:t xml:space="preserve"> Sin tratamiento el rendimiento cae en una décima en la partición temporal. La decisión de tratarlo, que suele darse por supuesta, queda justificada con datos.</w:t>
+      </w:r>
+    </w:p>
+    <w:p>
+      <w:pPr>
+        <w:spacing w:after="160" w:line="360" w:lineRule="auto"/>
+        <w:ind w:firstLine="425"/>
+        <w:jc w:val="both"/>
+      </w:pPr>
+      <w:r>
+        <w:rPr>
+          <w:rFonts w:ascii="Arial" w:cs="Arial" w:eastAsia="Arial" w:hAnsi="Arial"/>
+          <w:b/>
+          <w:bCs/>
+          <w:sz w:val="22"/>
+          <w:szCs w:val="22"/>
+        </w:rPr>
+        <w:t xml:space="preserve">La ponderación del gradiente y el remuestreo correcto son equivalentes.</w:t>
+      </w:r>
+      <w:r>
+        <w:rPr>
+          <w:rFonts w:ascii="Arial" w:cs="Arial" w:eastAsia="Arial" w:hAnsi="Arial"/>
+          <w:sz w:val="22"/>
+          <w:szCs w:val="22"/>
+        </w:rPr>
+        <w:t xml:space="preserve"> Las diferencias son de una o dos milésimas, dentro del ruido. Contrariamente a lo que cabía esperar de la literatura, la estrategia adoptada en este trabajo no sacrifica rendimiento frente a un remuestreo bien aplicado, y conserva la ventaja de no poder incurrir en fuga por construcción.</w:t>
+      </w:r>
+    </w:p>
+    <w:p>
+      <w:pPr>
+        <w:spacing w:after="160" w:line="360" w:lineRule="auto"/>
+        <w:ind w:firstLine="425"/>
+        <w:jc w:val="both"/>
+      </w:pPr>
+      <w:r>
+        <w:rPr>
+          <w:rFonts w:ascii="Arial" w:cs="Arial" w:eastAsia="Arial" w:hAnsi="Arial"/>
+          <w:b/>
+          <w:bCs/>
+          <w:sz w:val="22"/>
+          <w:szCs w:val="22"/>
+        </w:rPr>
+        <w:t xml:space="preserve">Aplicar el remuestreo antes de dividir produce un valor perfecto.</w:t>
+      </w:r>
+      <w:r>
+        <w:rPr>
+          <w:rFonts w:ascii="Arial" w:cs="Arial" w:eastAsia="Arial" w:hAnsi="Arial"/>
+          <w:sz w:val="22"/>
+          <w:szCs w:val="22"/>
+        </w:rPr>
+        <w:t xml:space="preserve"> Un AUC-PR de 1,0000 en ambas particiones, entre un 13 % y un 25 % por encima del mejor procedimiento sin fuga.</w:t>
+      </w:r>
+    </w:p>
+    <w:p>
+      <w:pPr>
+        <w:spacing w:after="160" w:line="360" w:lineRule="auto"/>
+        <w:ind w:firstLine="425"/>
+        <w:jc w:val="both"/>
+      </w:pPr>
+      <w:r>
+        <w:rPr>
+          <w:rFonts w:ascii="Arial" w:cs="Arial" w:eastAsia="Arial" w:hAnsi="Arial"/>
+          <w:sz w:val="22"/>
+          <w:szCs w:val="22"/>
+        </w:rPr>
+        <w:t xml:space="preserve">Este último resultado merece una precisión que resulta más grave que la propia inflación. Se intentó estimar el rendimiento verdadero de ese modelo evaluándolo sobre la partición original, y el valor obtenido fue igualmente próximo a la unidad. La razón es que ese modelo se entrenó sobre ejemplos derivados del conjunto completo, de modo que también esa partición está contaminada.</w:t>
+      </w:r>
+    </w:p>
+    <w:p>
+      <w:pPr>
+        <w:spacing w:after="160" w:line="360" w:lineRule="auto"/>
+        <w:ind w:firstLine="425"/>
+        <w:jc w:val="both"/>
+      </w:pPr>
+      <w:r>
+        <w:rPr>
+          <w:rFonts w:ascii="Arial" w:cs="Arial" w:eastAsia="Arial" w:hAnsi="Arial"/>
+          <w:b/>
+          <w:bCs/>
+          <w:sz w:val="22"/>
+          <w:szCs w:val="22"/>
+        </w:rPr>
+        <w:t xml:space="preserve">No existe ninguna partición sobre la que ese modelo pueda evaluarse honestamente.</w:t>
+      </w:r>
+      <w:r>
+        <w:rPr>
+          <w:rFonts w:ascii="Arial" w:cs="Arial" w:eastAsia="Arial" w:hAnsi="Arial"/>
+          <w:sz w:val="22"/>
+          <w:szCs w:val="22"/>
+        </w:rPr>
+        <w:t xml:space="preserve"> Su métrica no queda ligeramente inflada: deja de tener significado. Y como el procedimiento no produce ningún error ni advertencia, un trabajo que incurra en él obtiene cifras excelentes sin ninguna señal de que algo va mal.</w:t>
       </w:r>
     </w:p>
     <w:p>

</xml_diff>

<commit_message>
Comparativa de modelos n=32: ambos contrastes significativos
</commit_message>
<xml_diff>
--- a/memoria/memoria_TFG.docx
+++ b/memoria/memoria_TFG.docx
@@ -12943,7 +12943,7 @@
                 <w:sz w:val="20"/>
                 <w:szCs w:val="20"/>
               </w:rPr>
-              <w:t xml:space="preserve">0,733</w:t>
+              <w:t xml:space="preserve">0,732</w:t>
             </w:r>
           </w:p>
         </w:tc>
@@ -12963,7 +12963,7 @@
                 <w:sz w:val="20"/>
                 <w:szCs w:val="20"/>
               </w:rPr>
-              <w:t xml:space="preserve">18</w:t>
+              <w:t xml:space="preserve">37</w:t>
             </w:r>
           </w:p>
         </w:tc>
@@ -12983,7 +12983,7 @@
                 <w:sz w:val="20"/>
                 <w:szCs w:val="20"/>
               </w:rPr>
-              <w:t xml:space="preserve">10/16</w:t>
+              <w:t xml:space="preserve">21/32</w:t>
             </w:r>
           </w:p>
         </w:tc>
@@ -13003,7 +13003,7 @@
                 <w:sz w:val="20"/>
                 <w:szCs w:val="20"/>
               </w:rPr>
-              <w:t xml:space="preserve">8/16</w:t>
+              <w:t xml:space="preserve">15/32</w:t>
             </w:r>
           </w:p>
         </w:tc>
@@ -13023,7 +13023,7 @@
                 <w:sz w:val="20"/>
                 <w:szCs w:val="20"/>
               </w:rPr>
-              <w:t xml:space="preserve">139 s</w:t>
+              <w:t xml:space="preserve">137 s</w:t>
             </w:r>
           </w:p>
         </w:tc>
@@ -13065,7 +13065,7 @@
                 <w:sz w:val="20"/>
                 <w:szCs w:val="20"/>
               </w:rPr>
-              <w:t xml:space="preserve">0,738</w:t>
+              <w:t xml:space="preserve">0,739</w:t>
             </w:r>
           </w:p>
         </w:tc>
@@ -13085,7 +13085,7 @@
                 <w:sz w:val="20"/>
                 <w:szCs w:val="20"/>
               </w:rPr>
-              <w:t xml:space="preserve">15</w:t>
+              <w:t xml:space="preserve">27</w:t>
             </w:r>
           </w:p>
         </w:tc>
@@ -13105,7 +13105,7 @@
                 <w:sz w:val="20"/>
                 <w:szCs w:val="20"/>
               </w:rPr>
-              <w:t xml:space="preserve">8/16</w:t>
+              <w:t xml:space="preserve">16/32</w:t>
             </w:r>
           </w:p>
         </w:tc>
@@ -13125,7 +13125,7 @@
                 <w:sz w:val="20"/>
                 <w:szCs w:val="20"/>
               </w:rPr>
-              <w:t xml:space="preserve">9/16</w:t>
+              <w:t xml:space="preserve">18/32</w:t>
             </w:r>
           </w:p>
         </w:tc>
@@ -13187,7 +13187,7 @@
                 <w:sz w:val="20"/>
                 <w:szCs w:val="20"/>
               </w:rPr>
-              <w:t xml:space="preserve">0,749</w:t>
+              <w:t xml:space="preserve">0,748</w:t>
             </w:r>
           </w:p>
         </w:tc>
@@ -13207,7 +13207,7 @@
                 <w:sz w:val="20"/>
                 <w:szCs w:val="20"/>
               </w:rPr>
-              <w:t xml:space="preserve">5</w:t>
+              <w:t xml:space="preserve">13</w:t>
             </w:r>
           </w:p>
         </w:tc>
@@ -13227,7 +13227,7 @@
                 <w:sz w:val="20"/>
                 <w:szCs w:val="20"/>
               </w:rPr>
-              <w:t xml:space="preserve">5/16</w:t>
+              <w:t xml:space="preserve">11/32</w:t>
             </w:r>
           </w:p>
         </w:tc>
@@ -13247,7 +13247,7 @@
                 <w:sz w:val="20"/>
                 <w:szCs w:val="20"/>
               </w:rPr>
-              <w:t xml:space="preserve">7/16</w:t>
+              <w:t xml:space="preserve">15/32</w:t>
             </w:r>
           </w:p>
         </w:tc>
@@ -13267,7 +13267,7 @@
                 <w:sz w:val="20"/>
                 <w:szCs w:val="20"/>
               </w:rPr>
-              <w:t xml:space="preserve">431 s</w:t>
+              <w:t xml:space="preserve">430 s</w:t>
             </w:r>
           </w:p>
         </w:tc>
@@ -13290,7 +13290,7 @@
           <w:sz w:val="22"/>
           <w:szCs w:val="22"/>
         </w:rPr>
-        <w:t xml:space="preserve">Cuarenta y ocho ejecuciones, dieciséis por modelo, repartidas en dos tandas realizadas en días distintos con configuración idéntica. El orden por capacidad es monótono tanto en el recall del sistema como en el daño causado, y el modelo mayor multiplica por más de tres la reducción del fraude destruido respecto al menor.</w:t>
+        <w:t xml:space="preserve">Noventa y seis ejecuciones, treinta y dos por modelo, repartidas en tres tandas realizadas en dos días con configuración idéntica. El orden por capacidad es monótono tanto en el recall del sistema como en el daño causado: el modelo menor destruye fraude en dos de cada tres ejecuciones y el mayor en una de cada tres.</w:t>
       </w:r>
     </w:p>
     <w:p>
@@ -13323,6 +13323,556 @@
           <w:szCs w:val="22"/>
         </w:rPr>
         <w:t xml:space="preserve">La distribución del daño por ejecución resulta más informativa que su agregado:</w:t>
+      </w:r>
+    </w:p>
+    <w:tbl>
+      <w:tblPr>
+        <w:tblW w:type="dxa" w:w="9000"/>
+        <w:tblBorders>
+          <w:top w:val="single" w:color="auto" w:sz="4"/>
+          <w:left w:val="single" w:color="auto" w:sz="4"/>
+          <w:bottom w:val="single" w:color="auto" w:sz="4"/>
+          <w:right w:val="single" w:color="auto" w:sz="4"/>
+          <w:insideH w:val="single" w:color="auto" w:sz="4"/>
+          <w:insideV w:val="single" w:color="auto" w:sz="4"/>
+        </w:tblBorders>
+      </w:tblPr>
+      <w:tblGrid>
+        <w:gridCol w:w="1500"/>
+        <w:gridCol w:w="1500"/>
+        <w:gridCol w:w="1500"/>
+        <w:gridCol w:w="1500"/>
+        <w:gridCol w:w="1500"/>
+        <w:gridCol w:w="1500"/>
+      </w:tblGrid>
+      <w:tr>
+        <w:tc>
+          <w:tcPr>
+            <w:tcW w:type="dxa" w:w="1500"/>
+            <w:shd w:fill="D9D9D9" w:val="clear"/>
+          </w:tcPr>
+          <w:p>
+            <w:pPr>
+              <w:spacing w:after="0"/>
+            </w:pPr>
+            <w:r>
+              <w:rPr>
+                <w:rFonts w:ascii="Arial" w:cs="Arial" w:eastAsia="Arial" w:hAnsi="Arial"/>
+                <w:b/>
+                <w:bCs/>
+                <w:sz w:val="20"/>
+                <w:szCs w:val="20"/>
+              </w:rPr>
+              <w:t xml:space="preserve">Modelo</w:t>
+            </w:r>
+          </w:p>
+        </w:tc>
+        <w:tc>
+          <w:tcPr>
+            <w:tcW w:type="dxa" w:w="1500"/>
+            <w:shd w:fill="D9D9D9" w:val="clear"/>
+          </w:tcPr>
+          <w:p>
+            <w:pPr>
+              <w:spacing w:after="0"/>
+            </w:pPr>
+            <w:r>
+              <w:rPr>
+                <w:rFonts w:ascii="Arial" w:cs="Arial" w:eastAsia="Arial" w:hAnsi="Arial"/>
+                <w:b/>
+                <w:bCs/>
+                <w:sz w:val="20"/>
+                <w:szCs w:val="20"/>
+              </w:rPr>
+              <w:t xml:space="preserve">Ninguno</w:t>
+            </w:r>
+          </w:p>
+        </w:tc>
+        <w:tc>
+          <w:tcPr>
+            <w:tcW w:type="dxa" w:w="1500"/>
+            <w:shd w:fill="D9D9D9" w:val="clear"/>
+          </w:tcPr>
+          <w:p>
+            <w:pPr>
+              <w:spacing w:after="0"/>
+            </w:pPr>
+            <w:r>
+              <w:rPr>
+                <w:rFonts w:ascii="Arial" w:cs="Arial" w:eastAsia="Arial" w:hAnsi="Arial"/>
+                <w:b/>
+                <w:bCs/>
+                <w:sz w:val="20"/>
+                <w:szCs w:val="20"/>
+              </w:rPr>
+              <w:t xml:space="preserve">Un caso</w:t>
+            </w:r>
+          </w:p>
+        </w:tc>
+        <w:tc>
+          <w:tcPr>
+            <w:tcW w:type="dxa" w:w="1500"/>
+            <w:shd w:fill="D9D9D9" w:val="clear"/>
+          </w:tcPr>
+          <w:p>
+            <w:pPr>
+              <w:spacing w:after="0"/>
+            </w:pPr>
+            <w:r>
+              <w:rPr>
+                <w:rFonts w:ascii="Arial" w:cs="Arial" w:eastAsia="Arial" w:hAnsi="Arial"/>
+                <w:b/>
+                <w:bCs/>
+                <w:sz w:val="20"/>
+                <w:szCs w:val="20"/>
+              </w:rPr>
+              <w:t xml:space="preserve">Dos</w:t>
+            </w:r>
+          </w:p>
+        </w:tc>
+        <w:tc>
+          <w:tcPr>
+            <w:tcW w:type="dxa" w:w="1500"/>
+            <w:shd w:fill="D9D9D9" w:val="clear"/>
+          </w:tcPr>
+          <w:p>
+            <w:pPr>
+              <w:spacing w:after="0"/>
+            </w:pPr>
+            <w:r>
+              <w:rPr>
+                <w:rFonts w:ascii="Arial" w:cs="Arial" w:eastAsia="Arial" w:hAnsi="Arial"/>
+                <w:b/>
+                <w:bCs/>
+                <w:sz w:val="20"/>
+                <w:szCs w:val="20"/>
+              </w:rPr>
+              <w:t xml:space="preserve">Tres</w:t>
+            </w:r>
+          </w:p>
+        </w:tc>
+        <w:tc>
+          <w:tcPr>
+            <w:tcW w:type="dxa" w:w="1500"/>
+            <w:shd w:fill="D9D9D9" w:val="clear"/>
+          </w:tcPr>
+          <w:p>
+            <w:pPr>
+              <w:spacing w:after="0"/>
+            </w:pPr>
+            <w:r>
+              <w:rPr>
+                <w:rFonts w:ascii="Arial" w:cs="Arial" w:eastAsia="Arial" w:hAnsi="Arial"/>
+                <w:b/>
+                <w:bCs/>
+                <w:sz w:val="20"/>
+                <w:szCs w:val="20"/>
+              </w:rPr>
+              <w:t xml:space="preserve">Media</w:t>
+            </w:r>
+          </w:p>
+        </w:tc>
+      </w:tr>
+      <w:tr>
+        <w:tc>
+          <w:tcPr>
+            <w:tcW w:type="dxa" w:w="1500"/>
+          </w:tcPr>
+          <w:p>
+            <w:pPr>
+              <w:spacing w:after="0"/>
+            </w:pPr>
+            <w:r>
+              <w:rPr>
+                <w:rFonts w:ascii="Arial" w:cs="Arial" w:eastAsia="Arial" w:hAnsi="Arial"/>
+                <w:b w:val="false"/>
+                <w:bCs w:val="false"/>
+                <w:sz w:val="20"/>
+                <w:szCs w:val="20"/>
+              </w:rPr>
+              <w:t xml:space="preserve">llama3.1:8b</w:t>
+            </w:r>
+          </w:p>
+        </w:tc>
+        <w:tc>
+          <w:tcPr>
+            <w:tcW w:type="dxa" w:w="1500"/>
+          </w:tcPr>
+          <w:p>
+            <w:pPr>
+              <w:spacing w:after="0"/>
+            </w:pPr>
+            <w:r>
+              <w:rPr>
+                <w:rFonts w:ascii="Arial" w:cs="Arial" w:eastAsia="Arial" w:hAnsi="Arial"/>
+                <w:b w:val="false"/>
+                <w:bCs w:val="false"/>
+                <w:sz w:val="20"/>
+                <w:szCs w:val="20"/>
+              </w:rPr>
+              <w:t xml:space="preserve">11</w:t>
+            </w:r>
+          </w:p>
+        </w:tc>
+        <w:tc>
+          <w:tcPr>
+            <w:tcW w:type="dxa" w:w="1500"/>
+          </w:tcPr>
+          <w:p>
+            <w:pPr>
+              <w:spacing w:after="0"/>
+            </w:pPr>
+            <w:r>
+              <w:rPr>
+                <w:rFonts w:ascii="Arial" w:cs="Arial" w:eastAsia="Arial" w:hAnsi="Arial"/>
+                <w:b w:val="false"/>
+                <w:bCs w:val="false"/>
+                <w:sz w:val="20"/>
+                <w:szCs w:val="20"/>
+              </w:rPr>
+              <w:t xml:space="preserve">8</w:t>
+            </w:r>
+          </w:p>
+        </w:tc>
+        <w:tc>
+          <w:tcPr>
+            <w:tcW w:type="dxa" w:w="1500"/>
+          </w:tcPr>
+          <w:p>
+            <w:pPr>
+              <w:spacing w:after="0"/>
+            </w:pPr>
+            <w:r>
+              <w:rPr>
+                <w:rFonts w:ascii="Arial" w:cs="Arial" w:eastAsia="Arial" w:hAnsi="Arial"/>
+                <w:b w:val="false"/>
+                <w:bCs w:val="false"/>
+                <w:sz w:val="20"/>
+                <w:szCs w:val="20"/>
+              </w:rPr>
+              <w:t xml:space="preserve">10</w:t>
+            </w:r>
+          </w:p>
+        </w:tc>
+        <w:tc>
+          <w:tcPr>
+            <w:tcW w:type="dxa" w:w="1500"/>
+          </w:tcPr>
+          <w:p>
+            <w:pPr>
+              <w:spacing w:after="0"/>
+            </w:pPr>
+            <w:r>
+              <w:rPr>
+                <w:rFonts w:ascii="Arial" w:cs="Arial" w:eastAsia="Arial" w:hAnsi="Arial"/>
+                <w:b w:val="false"/>
+                <w:bCs w:val="false"/>
+                <w:sz w:val="20"/>
+                <w:szCs w:val="20"/>
+              </w:rPr>
+              <w:t xml:space="preserve">3</w:t>
+            </w:r>
+          </w:p>
+        </w:tc>
+        <w:tc>
+          <w:tcPr>
+            <w:tcW w:type="dxa" w:w="1500"/>
+          </w:tcPr>
+          <w:p>
+            <w:pPr>
+              <w:spacing w:after="0"/>
+            </w:pPr>
+            <w:r>
+              <w:rPr>
+                <w:rFonts w:ascii="Arial" w:cs="Arial" w:eastAsia="Arial" w:hAnsi="Arial"/>
+                <w:b w:val="false"/>
+                <w:bCs w:val="false"/>
+                <w:sz w:val="20"/>
+                <w:szCs w:val="20"/>
+              </w:rPr>
+              <w:t xml:space="preserve">1,16</w:t>
+            </w:r>
+          </w:p>
+        </w:tc>
+      </w:tr>
+      <w:tr>
+        <w:tc>
+          <w:tcPr>
+            <w:tcW w:type="dxa" w:w="1500"/>
+          </w:tcPr>
+          <w:p>
+            <w:pPr>
+              <w:spacing w:after="0"/>
+            </w:pPr>
+            <w:r>
+              <w:rPr>
+                <w:rFonts w:ascii="Arial" w:cs="Arial" w:eastAsia="Arial" w:hAnsi="Arial"/>
+                <w:b w:val="false"/>
+                <w:bCs w:val="false"/>
+                <w:sz w:val="20"/>
+                <w:szCs w:val="20"/>
+              </w:rPr>
+              <w:t xml:space="preserve">qwen2.5:14b</w:t>
+            </w:r>
+          </w:p>
+        </w:tc>
+        <w:tc>
+          <w:tcPr>
+            <w:tcW w:type="dxa" w:w="1500"/>
+          </w:tcPr>
+          <w:p>
+            <w:pPr>
+              <w:spacing w:after="0"/>
+            </w:pPr>
+            <w:r>
+              <w:rPr>
+                <w:rFonts w:ascii="Arial" w:cs="Arial" w:eastAsia="Arial" w:hAnsi="Arial"/>
+                <w:b w:val="false"/>
+                <w:bCs w:val="false"/>
+                <w:sz w:val="20"/>
+                <w:szCs w:val="20"/>
+              </w:rPr>
+              <w:t xml:space="preserve">16</w:t>
+            </w:r>
+          </w:p>
+        </w:tc>
+        <w:tc>
+          <w:tcPr>
+            <w:tcW w:type="dxa" w:w="1500"/>
+          </w:tcPr>
+          <w:p>
+            <w:pPr>
+              <w:spacing w:after="0"/>
+            </w:pPr>
+            <w:r>
+              <w:rPr>
+                <w:rFonts w:ascii="Arial" w:cs="Arial" w:eastAsia="Arial" w:hAnsi="Arial"/>
+                <w:b w:val="false"/>
+                <w:bCs w:val="false"/>
+                <w:sz w:val="20"/>
+                <w:szCs w:val="20"/>
+              </w:rPr>
+              <w:t xml:space="preserve">8</w:t>
+            </w:r>
+          </w:p>
+        </w:tc>
+        <w:tc>
+          <w:tcPr>
+            <w:tcW w:type="dxa" w:w="1500"/>
+          </w:tcPr>
+          <w:p>
+            <w:pPr>
+              <w:spacing w:after="0"/>
+            </w:pPr>
+            <w:r>
+              <w:rPr>
+                <w:rFonts w:ascii="Arial" w:cs="Arial" w:eastAsia="Arial" w:hAnsi="Arial"/>
+                <w:b w:val="false"/>
+                <w:bCs w:val="false"/>
+                <w:sz w:val="20"/>
+                <w:szCs w:val="20"/>
+              </w:rPr>
+              <w:t xml:space="preserve">5</w:t>
+            </w:r>
+          </w:p>
+        </w:tc>
+        <w:tc>
+          <w:tcPr>
+            <w:tcW w:type="dxa" w:w="1500"/>
+          </w:tcPr>
+          <w:p>
+            <w:pPr>
+              <w:spacing w:after="0"/>
+            </w:pPr>
+            <w:r>
+              <w:rPr>
+                <w:rFonts w:ascii="Arial" w:cs="Arial" w:eastAsia="Arial" w:hAnsi="Arial"/>
+                <w:b w:val="false"/>
+                <w:bCs w:val="false"/>
+                <w:sz w:val="20"/>
+                <w:szCs w:val="20"/>
+              </w:rPr>
+              <w:t xml:space="preserve">3</w:t>
+            </w:r>
+          </w:p>
+        </w:tc>
+        <w:tc>
+          <w:tcPr>
+            <w:tcW w:type="dxa" w:w="1500"/>
+          </w:tcPr>
+          <w:p>
+            <w:pPr>
+              <w:spacing w:after="0"/>
+            </w:pPr>
+            <w:r>
+              <w:rPr>
+                <w:rFonts w:ascii="Arial" w:cs="Arial" w:eastAsia="Arial" w:hAnsi="Arial"/>
+                <w:b w:val="false"/>
+                <w:bCs w:val="false"/>
+                <w:sz w:val="20"/>
+                <w:szCs w:val="20"/>
+              </w:rPr>
+              <w:t xml:space="preserve">0,84</w:t>
+            </w:r>
+          </w:p>
+        </w:tc>
+      </w:tr>
+      <w:tr>
+        <w:tc>
+          <w:tcPr>
+            <w:tcW w:type="dxa" w:w="1500"/>
+          </w:tcPr>
+          <w:p>
+            <w:pPr>
+              <w:spacing w:after="0"/>
+            </w:pPr>
+            <w:r>
+              <w:rPr>
+                <w:rFonts w:ascii="Arial" w:cs="Arial" w:eastAsia="Arial" w:hAnsi="Arial"/>
+                <w:b w:val="false"/>
+                <w:bCs w:val="false"/>
+                <w:sz w:val="20"/>
+                <w:szCs w:val="20"/>
+              </w:rPr>
+              <w:t xml:space="preserve">gpt-oss:20b</w:t>
+            </w:r>
+          </w:p>
+        </w:tc>
+        <w:tc>
+          <w:tcPr>
+            <w:tcW w:type="dxa" w:w="1500"/>
+          </w:tcPr>
+          <w:p>
+            <w:pPr>
+              <w:spacing w:after="0"/>
+            </w:pPr>
+            <w:r>
+              <w:rPr>
+                <w:rFonts w:ascii="Arial" w:cs="Arial" w:eastAsia="Arial" w:hAnsi="Arial"/>
+                <w:b w:val="false"/>
+                <w:bCs w:val="false"/>
+                <w:sz w:val="20"/>
+                <w:szCs w:val="20"/>
+              </w:rPr>
+              <w:t xml:space="preserve">21</w:t>
+            </w:r>
+          </w:p>
+        </w:tc>
+        <w:tc>
+          <w:tcPr>
+            <w:tcW w:type="dxa" w:w="1500"/>
+          </w:tcPr>
+          <w:p>
+            <w:pPr>
+              <w:spacing w:after="0"/>
+            </w:pPr>
+            <w:r>
+              <w:rPr>
+                <w:rFonts w:ascii="Arial" w:cs="Arial" w:eastAsia="Arial" w:hAnsi="Arial"/>
+                <w:b w:val="false"/>
+                <w:bCs w:val="false"/>
+                <w:sz w:val="20"/>
+                <w:szCs w:val="20"/>
+              </w:rPr>
+              <w:t xml:space="preserve">9</w:t>
+            </w:r>
+          </w:p>
+        </w:tc>
+        <w:tc>
+          <w:tcPr>
+            <w:tcW w:type="dxa" w:w="1500"/>
+          </w:tcPr>
+          <w:p>
+            <w:pPr>
+              <w:spacing w:after="0"/>
+            </w:pPr>
+            <w:r>
+              <w:rPr>
+                <w:rFonts w:ascii="Arial" w:cs="Arial" w:eastAsia="Arial" w:hAnsi="Arial"/>
+                <w:b w:val="false"/>
+                <w:bCs w:val="false"/>
+                <w:sz w:val="20"/>
+                <w:szCs w:val="20"/>
+              </w:rPr>
+              <w:t xml:space="preserve">2</w:t>
+            </w:r>
+          </w:p>
+        </w:tc>
+        <w:tc>
+          <w:tcPr>
+            <w:tcW w:type="dxa" w:w="1500"/>
+          </w:tcPr>
+          <w:p>
+            <w:pPr>
+              <w:spacing w:after="0"/>
+            </w:pPr>
+            <w:r>
+              <w:rPr>
+                <w:rFonts w:ascii="Arial" w:cs="Arial" w:eastAsia="Arial" w:hAnsi="Arial"/>
+                <w:b w:val="false"/>
+                <w:bCs w:val="false"/>
+                <w:sz w:val="20"/>
+                <w:szCs w:val="20"/>
+              </w:rPr>
+              <w:t xml:space="preserve">0</w:t>
+            </w:r>
+          </w:p>
+        </w:tc>
+        <w:tc>
+          <w:tcPr>
+            <w:tcW w:type="dxa" w:w="1500"/>
+          </w:tcPr>
+          <w:p>
+            <w:pPr>
+              <w:spacing w:after="0"/>
+            </w:pPr>
+            <w:r>
+              <w:rPr>
+                <w:rFonts w:ascii="Arial" w:cs="Arial" w:eastAsia="Arial" w:hAnsi="Arial"/>
+                <w:b w:val="false"/>
+                <w:bCs w:val="false"/>
+                <w:sz w:val="20"/>
+                <w:szCs w:val="20"/>
+              </w:rPr>
+              <w:t xml:space="preserve">0,41</w:t>
+            </w:r>
+          </w:p>
+        </w:tc>
+      </w:tr>
+    </w:tbl>
+    <w:p>
+      <w:pPr>
+        <w:spacing w:after="160"/>
+      </w:pPr>
+    </w:p>
+    <w:p>
+      <w:pPr>
+        <w:spacing w:after="160" w:line="360" w:lineRule="auto"/>
+        <w:ind w:firstLine="425"/>
+        <w:jc w:val="both"/>
+      </w:pPr>
+      <w:r>
+        <w:rPr>
+          <w:rFonts w:ascii="Arial" w:cs="Arial" w:eastAsia="Arial" w:hAnsi="Arial"/>
+          <w:sz w:val="22"/>
+          <w:szCs w:val="22"/>
+        </w:rPr>
+        <w:t xml:space="preserve">El modelo mayor nunca alcanza los tres casos destruidos en una misma ejecución, cota que los otros dos sí alcanzan, y su distribución está claramente desplazada hacia el cero.</w:t>
+      </w:r>
+    </w:p>
+    <w:p>
+      <w:pPr>
+        <w:spacing w:after="160" w:line="360" w:lineRule="auto"/>
+        <w:ind w:firstLine="425"/>
+        <w:jc w:val="both"/>
+      </w:pPr>
+      <w:r>
+        <w:rPr>
+          <w:rFonts w:ascii="Arial" w:cs="Arial" w:eastAsia="Arial" w:hAnsi="Arial"/>
+          <w:sz w:val="22"/>
+          <w:szCs w:val="22"/>
+        </w:rPr>
+        <w:t xml:space="preserve">Sobre estos datos se aplicaron dos contrastes, y ambos se reportan.</w:t>
       </w:r>
     </w:p>
     <w:tbl>
@@ -13360,7 +13910,7 @@
                 <w:sz w:val="20"/>
                 <w:szCs w:val="20"/>
               </w:rPr>
-              <w:t xml:space="preserve">Modelo</w:t>
+              <w:t xml:space="preserve">Comparación</w:t>
             </w:r>
           </w:p>
         </w:tc>
@@ -13381,7 +13931,7 @@
                 <w:sz w:val="20"/>
                 <w:szCs w:val="20"/>
               </w:rPr>
-              <w:t xml:space="preserve">Fraudes destruidos en cada una de las 16 ejecuciones</w:t>
+              <w:t xml:space="preserve">Fisher (dicotomizado)</w:t>
             </w:r>
           </w:p>
         </w:tc>
@@ -13402,7 +13952,7 @@
                 <w:sz w:val="20"/>
                 <w:szCs w:val="20"/>
               </w:rPr>
-              <w:t xml:space="preserve">Media</w:t>
+              <w:t xml:space="preserve">Mann-Whitney (recuento)</w:t>
             </w:r>
           </w:p>
         </w:tc>
@@ -13424,7 +13974,7 @@
                 <w:sz w:val="20"/>
                 <w:szCs w:val="20"/>
               </w:rPr>
-              <w:t xml:space="preserve">llama3.1:8b</w:t>
+              <w:t xml:space="preserve">8B frente a 20B</w:t>
             </w:r>
           </w:p>
         </w:tc>
@@ -13444,7 +13994,7 @@
                 <w:sz w:val="20"/>
                 <w:szCs w:val="20"/>
               </w:rPr>
-              <w:t xml:space="preserve">0,0,0,0,0,0,1,1,1,2,2,2,2,2,2,3</w:t>
+              <w:t xml:space="preserve">0,024</w:t>
             </w:r>
           </w:p>
         </w:tc>
@@ -13464,7 +14014,7 @@
                 <w:sz w:val="20"/>
                 <w:szCs w:val="20"/>
               </w:rPr>
-              <w:t xml:space="preserve">1,12</w:t>
+              <w:t xml:space="preserve">0,002</w:t>
             </w:r>
           </w:p>
         </w:tc>
@@ -13486,7 +14036,7 @@
                 <w:sz w:val="20"/>
                 <w:szCs w:val="20"/>
               </w:rPr>
-              <w:t xml:space="preserve">qwen2.5:14b</w:t>
+              <w:t xml:space="preserve">14B frente a 20B</w:t>
             </w:r>
           </w:p>
         </w:tc>
@@ -13506,7 +14056,7 @@
                 <w:sz w:val="20"/>
                 <w:szCs w:val="20"/>
               </w:rPr>
-              <w:t xml:space="preserve">0,0,0,0,0,0,0,0,1,1,1,1,2,3,3,3</w:t>
+              <w:t xml:space="preserve">0,311</w:t>
             </w:r>
           </w:p>
         </w:tc>
@@ -13526,7 +14076,7 @@
                 <w:sz w:val="20"/>
                 <w:szCs w:val="20"/>
               </w:rPr>
-              <w:t xml:space="preserve">0,94</w:t>
+              <w:t xml:space="preserve">0,094</w:t>
             </w:r>
           </w:p>
         </w:tc>
@@ -13548,7 +14098,7 @@
                 <w:sz w:val="20"/>
                 <w:szCs w:val="20"/>
               </w:rPr>
-              <w:t xml:space="preserve">gpt-oss:20b</w:t>
+              <w:t xml:space="preserve">8B frente a 14B</w:t>
             </w:r>
           </w:p>
         </w:tc>
@@ -13568,7 +14118,7 @@
                 <w:sz w:val="20"/>
                 <w:szCs w:val="20"/>
               </w:rPr>
-              <w:t xml:space="preserve">0,0,0,0,0,0,0,0,0,0,0,1,1,1,1,1</w:t>
+              <w:t xml:space="preserve">0,311</w:t>
             </w:r>
           </w:p>
         </w:tc>
@@ -13588,7 +14138,7 @@
                 <w:sz w:val="20"/>
                 <w:szCs w:val="20"/>
               </w:rPr>
-              <w:t xml:space="preserve">0,31</w:t>
+              <w:t xml:space="preserve">0,192</w:t>
             </w:r>
           </w:p>
         </w:tc>
@@ -13613,15 +14163,15 @@
           <w:sz w:val="22"/>
           <w:szCs w:val="22"/>
         </w:rPr>
-        <w:t xml:space="preserve">El modelo mayor nunca destruye más de un caso de fraude en una misma ejecución</w:t>
-      </w:r>
-      <w:r>
-        <w:rPr>
-          <w:rFonts w:ascii="Arial" w:cs="Arial" w:eastAsia="Arial" w:hAnsi="Arial"/>
-          <w:sz w:val="22"/>
-          <w:szCs w:val="22"/>
-        </w:rPr>
-        <w:t xml:space="preserve">, mientras los otros dos alcanzan tres. No solo falla menos: su fallo está acotado, propiedad que en un dominio auditable importa más que la media.</w:t>
+        <w:t xml:space="preserve">Ambos contrastes coinciden en separar los extremos</w:t>
+      </w:r>
+      <w:r>
+        <w:rPr>
+          <w:rFonts w:ascii="Arial" w:cs="Arial" w:eastAsia="Arial" w:hAnsi="Arial"/>
+          <w:sz w:val="22"/>
+          <w:szCs w:val="22"/>
+        </w:rPr>
+        <w:t xml:space="preserve"> y en no separar los modelos adyacentes, lo que resulta coherente con un efecto gradual antes que con un escalón.</w:t>
       </w:r>
     </w:p>
     <w:p>
@@ -13636,7 +14186,7 @@
           <w:sz w:val="22"/>
           <w:szCs w:val="22"/>
         </w:rPr>
-        <w:t xml:space="preserve">Sobre estos datos se aplicaron dos contrastes, y ambos se reportan por transparencia.</w:t>
+        <w:t xml:space="preserve">Conviene explicar por qué se reportan dos. El resultado de cada ejecución es un recuento entre cero y tres, no una variable binaria. Dicotomizarlo, como exige Fisher, descarta la magnitud del daño y con ella potencia estadística: una ejecución que destruye tres casos cuenta igual que una que destruye uno. Mann-Whitney sobre el recuento era el contraste apropiado desde el planteamiento del experimento, y así debería haberse fijado antes de observar los datos.</w:t>
       </w:r>
     </w:p>
     <w:p>
@@ -13651,106 +14201,7 @@
           <w:sz w:val="22"/>
           <w:szCs w:val="22"/>
         </w:rPr>
-        <w:t xml:space="preserve">El primero fue el test exacto de Fisher sobre la variable dicotomizada —si hubo o no destrucción de fraude en cada ejecución—, que devuelve </w:t>
-      </w:r>
-      <w:r>
-        <w:rPr>
-          <w:rFonts w:ascii="Arial" w:cs="Arial" w:eastAsia="Arial" w:hAnsi="Arial"/>
-          <w:b/>
-          <w:bCs/>
-          <w:sz w:val="22"/>
-          <w:szCs w:val="22"/>
-        </w:rPr>
-        <w:t xml:space="preserve">p = 0,156</w:t>
-      </w:r>
-      <w:r>
-        <w:rPr>
-          <w:rFonts w:ascii="Arial" w:cs="Arial" w:eastAsia="Arial" w:hAnsi="Arial"/>
-          <w:sz w:val="22"/>
-          <w:szCs w:val="22"/>
-        </w:rPr>
-        <w:t xml:space="preserve"> entre el modelo menor y el mayor. El segundo fue el test de Mann-Whitney sobre el recuento de casos destruidos por ejecución, que devuelve </w:t>
-      </w:r>
-      <w:r>
-        <w:rPr>
-          <w:rFonts w:ascii="Arial" w:cs="Arial" w:eastAsia="Arial" w:hAnsi="Arial"/>
-          <w:b/>
-          <w:bCs/>
-          <w:sz w:val="22"/>
-          <w:szCs w:val="22"/>
-        </w:rPr>
-        <w:t xml:space="preserve">p = 0,018</w:t>
-      </w:r>
-      <w:r>
-        <w:rPr>
-          <w:rFonts w:ascii="Arial" w:cs="Arial" w:eastAsia="Arial" w:hAnsi="Arial"/>
-          <w:sz w:val="22"/>
-          <w:szCs w:val="22"/>
-        </w:rPr>
-        <w:t xml:space="preserve">.</w:t>
-      </w:r>
-    </w:p>
-    <w:p>
-      <w:pPr>
-        <w:spacing w:after="160" w:line="360" w:lineRule="auto"/>
-        <w:ind w:firstLine="425"/>
-        <w:jc w:val="both"/>
-      </w:pPr>
-      <w:r>
-        <w:rPr>
-          <w:rFonts w:ascii="Arial" w:cs="Arial" w:eastAsia="Arial" w:hAnsi="Arial"/>
-          <w:sz w:val="22"/>
-          <w:szCs w:val="22"/>
-        </w:rPr>
-        <w:t xml:space="preserve">La discrepancia no es casual y conviene explicarla. El resultado de cada ejecución es un recuento entre cero y tres, no una variable binaria. Dicotomizarlo, como exige Fisher, descarta la magnitud del daño y con ella potencia estadística: una ejecución que destruye tres casos cuenta igual que una que destruye uno. </w:t>
-      </w:r>
-      <w:r>
-        <w:rPr>
-          <w:rFonts w:ascii="Arial" w:cs="Arial" w:eastAsia="Arial" w:hAnsi="Arial"/>
-          <w:b/>
-          <w:bCs/>
-          <w:sz w:val="22"/>
-          <w:szCs w:val="22"/>
-        </w:rPr>
-        <w:t xml:space="preserve">Mann-Whitney sobre el recuento era el contraste apropiado desde el planteamiento del experimento</w:t>
-      </w:r>
-      <w:r>
-        <w:rPr>
-          <w:rFonts w:ascii="Arial" w:cs="Arial" w:eastAsia="Arial" w:hAnsi="Arial"/>
-          <w:sz w:val="22"/>
-          <w:szCs w:val="22"/>
-        </w:rPr>
-        <w:t xml:space="preserve">, y así debería haberse fijado antes de observar los datos.</w:t>
-      </w:r>
-    </w:p>
-    <w:p>
-      <w:pPr>
-        <w:spacing w:after="160" w:line="360" w:lineRule="auto"/>
-        <w:ind w:firstLine="425"/>
-        <w:jc w:val="both"/>
-      </w:pPr>
-      <w:r>
-        <w:rPr>
-          <w:rFonts w:ascii="Arial" w:cs="Arial" w:eastAsia="Arial" w:hAnsi="Arial"/>
-          <w:sz w:val="22"/>
-          <w:szCs w:val="22"/>
-        </w:rPr>
-        <w:t xml:space="preserve">Se declara expresamente que el orden en que se calcularon fue el inverso, y que solo tras comprobar que Fisher no alcanzaba significación se recurrió al segundo. Reportar únicamente el resultado favorable habría sido incurrir en la misma práctica que este trabajo señala en la sección 2.1 respecto al tratamiento del desbalanceo.</w:t>
-      </w:r>
-    </w:p>
-    <w:p>
-      <w:pPr>
-        <w:spacing w:after="160" w:line="360" w:lineRule="auto"/>
-        <w:ind w:firstLine="425"/>
-        <w:jc w:val="both"/>
-      </w:pPr>
-      <w:r>
-        <w:rPr>
-          <w:rFonts w:ascii="Arial" w:cs="Arial" w:eastAsia="Arial" w:hAnsi="Arial"/>
-          <w:sz w:val="22"/>
-          <w:szCs w:val="22"/>
-        </w:rPr>
-        <w:t xml:space="preserve">Los contrastes entre modelos adyacentes no alcanzan significación: p = 0,550 entre el menor y el intermedio, y p = 0,150 entre el intermedio y el mayor. Solo los extremos se separan, lo que resulta coherente con un efecto gradual antes que con un escalón.</w:t>
+        <w:t xml:space="preserve">Se declara expresamente que el orden en que se calcularon fue el inverso: solo tras comprobar que Fisher no alcanzaba significación con dieciséis ejecuciones se recurrió al segundo. Reportar únicamente el resultado favorable habría sido incurrir en la misma práctica que este trabajo señala en la sección 2.1 respecto al tratamiento del desbalanceo. Con treinta y dos ejecuciones la cuestión resulta indiferente, porque ambos contrastes alcanzan significación.</w:t>
       </w:r>
     </w:p>
     <w:p>
@@ -13767,7 +14218,7 @@
           <w:sz w:val="24"/>
           <w:szCs w:val="24"/>
         </w:rPr>
-        <w:t xml:space="preserve">Una inestabilidad que conviene declarar</w:t>
+        <w:t xml:space="preserve">Sobre el tamaño de muestra</w:t>
       </w:r>
     </w:p>
     <w:p>
@@ -13782,7 +14233,7 @@
           <w:sz w:val="22"/>
           <w:szCs w:val="22"/>
         </w:rPr>
-        <w:t xml:space="preserve">Las dos tandas se realizaron en días distintos con configuración idéntica. El modelo menor y el intermedio produjeron resultados prácticamente iguales en ambas. El mayor, en cambio, pasó de causar daño en una de ocho ejecuciones a hacerlo en cuatro de ocho.</w:t>
+        <w:t xml:space="preserve">El experimento se amplió en tres tandas sucesivas, y dos afirmaciones formuladas sobre las muestras intermedias no sobrevivieron a la ampliación.</w:t>
       </w:r>
     </w:p>
     <w:p>
@@ -13797,7 +14248,37 @@
           <w:sz w:val="22"/>
           <w:szCs w:val="22"/>
         </w:rPr>
-        <w:t xml:space="preserve">Con ocho ejecuciones por tanda la diferencia puede deberse al azar, pero afecta precisamente al modelo del que se afirma mayor fiabilidad, y por tanto debe constar. Resolverlo requeriría unas treinta y dos ejecuciones por modelo, que es también el tamaño de muestra que llevaría el contraste dicotomizado a significación.</w:t>
+        <w:t xml:space="preserve">Con ocho ejecuciones por modelo, el mayor causaba daño en una sola de ellas, lo que sugería un comportamiento cualitativamente distinto de los demás. Con treinta y dos, su tasa se estabiliza en torno a un tercio de las ejecuciones: aquella primera tanda era el valor atípico.</w:t>
+      </w:r>
+    </w:p>
+    <w:p>
+      <w:pPr>
+        <w:spacing w:after="160" w:line="360" w:lineRule="auto"/>
+        <w:ind w:firstLine="425"/>
+        <w:jc w:val="both"/>
+      </w:pPr>
+      <w:r>
+        <w:rPr>
+          <w:rFonts w:ascii="Arial" w:cs="Arial" w:eastAsia="Arial" w:hAnsi="Arial"/>
+          <w:sz w:val="22"/>
+          <w:szCs w:val="22"/>
+        </w:rPr>
+        <w:t xml:space="preserve">Con dieciséis ejecuciones, ese mismo modelo no había destruido nunca más de un caso por ejecución, lo que se interpretó como un fallo acotado. Con treinta y dos alcanza los dos casos, y la afirmación hubo de rebajarse a que no alcanza los tres.</w:t>
+      </w:r>
+    </w:p>
+    <w:p>
+      <w:pPr>
+        <w:spacing w:after="160" w:line="360" w:lineRule="auto"/>
+        <w:ind w:firstLine="425"/>
+        <w:jc w:val="both"/>
+      </w:pPr>
+      <w:r>
+        <w:rPr>
+          <w:rFonts w:ascii="Arial" w:cs="Arial" w:eastAsia="Arial" w:hAnsi="Arial"/>
+          <w:sz w:val="22"/>
+          <w:szCs w:val="22"/>
+        </w:rPr>
+        <w:t xml:space="preserve">Ninguna de las dos era falsa sobre los datos disponibles en su momento; ambas eran generalizaciones prematuras. Se dejan documentadas porque ilustran el motivo por el que este capítulo declara el tamaño de muestra junto a cada afirmación.</w:t>
       </w:r>
     </w:p>
     <w:p>

</xml_diff>

<commit_message>
Ablacion de dominio, capitulo 6 completo y correccion de dos cifras
</commit_message>
<xml_diff>
--- a/memoria/memoria_TFG.docx
+++ b/memoria/memoria_TFG.docx
@@ -1209,7 +1209,7 @@
           <w:sz w:val="22"/>
           <w:szCs w:val="22"/>
         </w:rPr>
-        <w:t xml:space="preserve">[PENDIENTE] Citar dos o tres trabajos concretos del rango alto y del rango bajo, con sus referencias completas. Ver docs/ESTADO_DEL_ARTE.md, sección 2.</w:t>
+        <w:t xml:space="preserve">[PENDIENTE] Citar dos o tres trabajos concretos del extremo alto de la horquilla, con sus referencias completas, tras haberlos leído. Ver docs/ESTADO_DEL_ARTE.md, sección 2.</w:t>
       </w:r>
     </w:p>
     <w:p>
@@ -1385,6 +1385,102 @@
           <w:sz w:val="22"/>
           <w:szCs w:val="22"/>
         </w:rPr>
+        <w:t xml:space="preserve">Dos trabajos recientes documentan el fenómeno con detalle y ambos se han consultado en su totalidad para esta memoria.</w:t>
+      </w:r>
+    </w:p>
+    <w:p>
+      <w:pPr>
+        <w:spacing w:after="160" w:line="360" w:lineRule="auto"/>
+        <w:ind w:firstLine="425"/>
+        <w:jc w:val="both"/>
+      </w:pPr>
+      <w:r>
+        <w:rPr>
+          <w:rFonts w:ascii="Arial" w:cs="Arial" w:eastAsia="Arial" w:hAnsi="Arial"/>
+          <w:sz w:val="22"/>
+          <w:szCs w:val="22"/>
+        </w:rPr>
+        <w:t xml:space="preserve">Kabane (2024) compara el mismo modelo de refuerzo de gradiente bajo tres regímenes sobre este conjunto de datos: sin tratamiento del desbalanceo, con remuestreo aplicado únicamente al conjunto de entrenamiento y con remuestreo aplicado antes de dividir. En el tercer caso el modelo alcanza un 99,969 % de exactitud, un 99,938 % de precisión y un </w:t>
+      </w:r>
+      <w:r>
+        <w:rPr>
+          <w:rFonts w:ascii="Arial" w:cs="Arial" w:eastAsia="Arial" w:hAnsi="Arial"/>
+          <w:b/>
+          <w:bCs/>
+          <w:sz w:val="22"/>
+          <w:szCs w:val="22"/>
+        </w:rPr>
+        <w:t xml:space="preserve">100 % de exhaustividad</w:t>
+      </w:r>
+      <w:r>
+        <w:rPr>
+          <w:rFonts w:ascii="Arial" w:cs="Arial" w:eastAsia="Arial" w:hAnsi="Arial"/>
+          <w:sz w:val="22"/>
+          <w:szCs w:val="22"/>
+        </w:rPr>
+        <w:t xml:space="preserve">. Sus propios experimentos sin fuga, en cambio, se sitúan en torno al 96,5 % de precisión y el 91,5 % de exhaustividad, valores que el autor califica de razonables y que son notablemente inferiores.</w:t>
+      </w:r>
+    </w:p>
+    <w:p>
+      <w:pPr>
+        <w:spacing w:after="160" w:line="360" w:lineRule="auto"/>
+        <w:ind w:firstLine="425"/>
+        <w:jc w:val="both"/>
+      </w:pPr>
+      <w:r>
+        <w:rPr>
+          <w:rFonts w:ascii="Arial" w:cs="Arial" w:eastAsia="Arial" w:hAnsi="Arial"/>
+          <w:sz w:val="22"/>
+          <w:szCs w:val="22"/>
+        </w:rPr>
+        <w:t xml:space="preserve">Magnier (2025) lleva el argumento más lejos mediante una demostración deliberada. Construye un perceptrón multicapa al que va retirando complejidad hasta dejarlo sin ninguna capa oculta, es decir, en una única neurona de salida, manteniendo en cambio la fuga por remuestreo previo a la división. Esa configuración mínima obtiene un 94 % de exhaustividad y un 97,6 % de precisión, y al reintroducir una capa oculta con hasta dieciséis neuronas alcanza el 99,9 % de exhaustividad. Su conclusión es que </w:t>
+      </w:r>
+      <w:r>
+        <w:rPr>
+          <w:rFonts w:ascii="Arial" w:cs="Arial" w:eastAsia="Arial" w:hAnsi="Arial"/>
+          <w:b/>
+          <w:bCs/>
+          <w:sz w:val="22"/>
+          <w:szCs w:val="22"/>
+        </w:rPr>
+        <w:t xml:space="preserve">la fuga de información aporta más rendimiento aparente que la sofisticación arquitectónica</w:t>
+      </w:r>
+      <w:r>
+        <w:rPr>
+          <w:rFonts w:ascii="Arial" w:cs="Arial" w:eastAsia="Arial" w:hAnsi="Arial"/>
+          <w:sz w:val="22"/>
+          <w:szCs w:val="22"/>
+        </w:rPr>
+        <w:t xml:space="preserve">, y que un solo neurón mal evaluado supera a modelos profundos correctamente evaluados.</w:t>
+      </w:r>
+    </w:p>
+    <w:p>
+      <w:pPr>
+        <w:spacing w:after="160" w:line="360" w:lineRule="auto"/>
+        <w:ind w:firstLine="425"/>
+        <w:jc w:val="both"/>
+      </w:pPr>
+      <w:r>
+        <w:rPr>
+          <w:rFonts w:ascii="Arial" w:cs="Arial" w:eastAsia="Arial" w:hAnsi="Arial"/>
+          <w:sz w:val="22"/>
+          <w:szCs w:val="22"/>
+        </w:rPr>
+        <w:t xml:space="preserve">El mismo trabajo identifica cuatro problemas recurrentes en esta literatura: la fuga derivada del orden del preprocesamiento, la vaguedad deliberada al describir la metodología, la validación temporal insuficiente para datos de transacciones y la manipulación de métricas mediante la optimización de la exhaustividad a costa de la precisión. Los cuatro son directamente aplicables al diseño de este trabajo, y los cuatro se han tenido en cuenta de forma explícita, como se detalla en el capítulo 4.</w:t>
+      </w:r>
+    </w:p>
+    <w:p>
+      <w:pPr>
+        <w:spacing w:after="160" w:line="360" w:lineRule="auto"/>
+        <w:ind w:firstLine="425"/>
+        <w:jc w:val="both"/>
+      </w:pPr>
+      <w:r>
+        <w:rPr>
+          <w:rFonts w:ascii="Arial" w:cs="Arial" w:eastAsia="Arial" w:hAnsi="Arial"/>
+          <w:sz w:val="22"/>
+          <w:szCs w:val="22"/>
+        </w:rPr>
         <w:t xml:space="preserve">La consecuencia práctica es que una parte de los valores publicados en el extremo alto de la horquilla no es comparable con valores obtenidos mediante un procedimiento sin fuga, y que una comparación directa de cifras entre trabajos, sin examinar el orden de las operaciones, carece de sentido.</w:t>
       </w:r>
     </w:p>
@@ -1545,6 +1641,54 @@
     <w:p>
       <w:pPr>
         <w:spacing w:after="160" w:line="360" w:lineRule="auto"/>
+        <w:ind w:firstLine="425"/>
+        <w:jc w:val="both"/>
+      </w:pPr>
+      <w:r>
+        <w:rPr>
+          <w:rFonts w:ascii="Arial" w:cs="Arial" w:eastAsia="Arial" w:hAnsi="Arial"/>
+          <w:sz w:val="22"/>
+          <w:szCs w:val="22"/>
+        </w:rPr>
+        <w:t xml:space="preserve">Existe una línea de trabajo que examina si un modelo de lenguaje puede detectar anomalías directamente sobre datos tabulares, sin entrenamiento específico para la distribución.</w:t>
+      </w:r>
+    </w:p>
+    <w:p>
+      <w:pPr>
+        <w:spacing w:after="160" w:line="360" w:lineRule="auto"/>
+        <w:ind w:firstLine="425"/>
+        <w:jc w:val="both"/>
+      </w:pPr>
+      <w:r>
+        <w:rPr>
+          <w:rFonts w:ascii="Arial" w:cs="Arial" w:eastAsia="Arial" w:hAnsi="Arial"/>
+          <w:sz w:val="22"/>
+          <w:szCs w:val="22"/>
+        </w:rPr>
+        <w:t xml:space="preserve">Su resultado principal conviene enunciarlo con cuidado, porque es más favorable a los modelos de lenguaje de lo que suele suponerse. Los autores encuentran que un modelo preentrenado de gran capacidad actúa como detector de anomalías a nivel de lote sin ajuste alguno, identificando regiones de baja densidad, y que </w:t>
+      </w:r>
+      <w:r>
+        <w:rPr>
+          <w:rFonts w:ascii="Arial" w:cs="Arial" w:eastAsia="Arial" w:hAnsi="Arial"/>
+          <w:b/>
+          <w:bCs/>
+          <w:sz w:val="22"/>
+          <w:szCs w:val="22"/>
+        </w:rPr>
+        <w:t xml:space="preserve">su rendimiento resulta comparable al de los métodos especializados</w:t>
+      </w:r>
+      <w:r>
+        <w:rPr>
+          <w:rFonts w:ascii="Arial" w:cs="Arial" w:eastAsia="Arial" w:hAnsi="Arial"/>
+          <w:sz w:val="22"/>
+          <w:szCs w:val="22"/>
+        </w:rPr>
+        <w:t xml:space="preserve"> de aprendizaje transductivo sobre un banco de pruebas amplio. No se trata, por tanto, de que los modelos de lenguaje queden claramente por detrás en el régimen numérico.</w:t>
+      </w:r>
+    </w:p>
+    <w:p>
+      <w:pPr>
+        <w:spacing w:after="160" w:line="360" w:lineRule="auto"/>
       </w:pPr>
       <w:r>
         <w:rPr>
@@ -1555,7 +1699,74 @@
           <w:sz w:val="22"/>
           <w:szCs w:val="22"/>
         </w:rPr>
-        <w:t xml:space="preserve">[PENDIENTE] Redactar a partir de docs/ESTADO_DEL_ARTE.md, sección 3. Hallazgo central de la literatura, que respalda el resultado de este trabajo: en el régimen puramente numérico los modelos de boosting superan claramente a los modelos de lenguaje en modo cero disparos, y estos rinden mejor cuando existe contexto semántico. La diferencia de planteamiento es que la literatura pone al modelo de lenguaje a competir con el modelo tabular, mientras aquí opera por encima de él.</w:t>
+        <w:t xml:space="preserve">[PENDIENTE] De este trabajo se ha consultado únicamente el resumen. Antes de darle el peso que aquí tiene hay que leerlo completo y comprobar sobre qué conjuntos concretos se obtiene esa equivalencia y con qué modelo, porque la afirmación tal como está redactada es fuerte.</w:t>
+      </w:r>
+    </w:p>
+    <w:p>
+      <w:pPr>
+        <w:spacing w:after="160" w:line="360" w:lineRule="auto"/>
+        <w:ind w:firstLine="425"/>
+        <w:jc w:val="both"/>
+      </w:pPr>
+      <w:r>
+        <w:rPr>
+          <w:rFonts w:ascii="Arial" w:cs="Arial" w:eastAsia="Arial" w:hAnsi="Arial"/>
+          <w:sz w:val="22"/>
+          <w:szCs w:val="22"/>
+        </w:rPr>
+        <w:t xml:space="preserve">La diferencia con este trabajo no está, pues, en el resultado sino en el planteamiento. Esa línea pone al modelo de lenguaje a </w:t>
+      </w:r>
+      <w:r>
+        <w:rPr>
+          <w:rFonts w:ascii="Arial" w:cs="Arial" w:eastAsia="Arial" w:hAnsi="Arial"/>
+          <w:b/>
+          <w:bCs/>
+          <w:sz w:val="22"/>
+          <w:szCs w:val="22"/>
+        </w:rPr>
+        <w:t xml:space="preserve">competir</w:t>
+      </w:r>
+      <w:r>
+        <w:rPr>
+          <w:rFonts w:ascii="Arial" w:cs="Arial" w:eastAsia="Arial" w:hAnsi="Arial"/>
+          <w:sz w:val="22"/>
+          <w:szCs w:val="22"/>
+        </w:rPr>
+        <w:t xml:space="preserve"> con el modelo tabular sobre la misma tarea de clasificación. Aquí el modelo de lenguaje no clasifica: opera </w:t>
+      </w:r>
+      <w:r>
+        <w:rPr>
+          <w:rFonts w:ascii="Arial" w:cs="Arial" w:eastAsia="Arial" w:hAnsi="Arial"/>
+          <w:b/>
+          <w:bCs/>
+          <w:sz w:val="22"/>
+          <w:szCs w:val="22"/>
+        </w:rPr>
+        <w:t xml:space="preserve">por encima</w:t>
+      </w:r>
+      <w:r>
+        <w:rPr>
+          <w:rFonts w:ascii="Arial" w:cs="Arial" w:eastAsia="Arial" w:hAnsi="Arial"/>
+          <w:sz w:val="22"/>
+          <w:szCs w:val="22"/>
+        </w:rPr>
+        <w:t xml:space="preserve"> de un detector ya entrenado, sobre los casos que este ha elevado, y lo que se mide es si su intervención añade o resta. Son preguntas distintas, y la segunda está mucho menos estudiada.</w:t>
+      </w:r>
+    </w:p>
+    <w:p>
+      <w:pPr>
+        <w:spacing w:after="160" w:line="360" w:lineRule="auto"/>
+      </w:pPr>
+      <w:r>
+        <w:rPr>
+          <w:rFonts w:ascii="Arial" w:cs="Arial" w:eastAsia="Arial" w:hAnsi="Arial"/>
+          <w:i/>
+          <w:iCs/>
+          <w:color w:val="808080"/>
+          <w:sz w:val="22"/>
+          <w:szCs w:val="22"/>
+        </w:rPr>
+        <w:t xml:space="preserve">[PENDIENTE] Localizar y leer al menos un trabajo que sitúe explícitamente el rendimiento de los modelos de lenguaje en función de la disponibilidad de contexto semántico. Es la referencia que sostendría la línea de trabajo futuro hacia dominios como SEPA o prevención de blanqueo, y sin ella esa propuesta queda apoyada solo en el razonamiento propio.</w:t>
       </w:r>
     </w:p>
     <w:p>
@@ -17952,17 +18163,101 @@
     <w:p>
       <w:pPr>
         <w:spacing w:after="160" w:line="360" w:lineRule="auto"/>
-      </w:pPr>
-      <w:r>
-        <w:rPr>
-          <w:rFonts w:ascii="Arial" w:cs="Arial" w:eastAsia="Arial" w:hAnsi="Arial"/>
-          <w:i/>
-          <w:iCs/>
-          <w:color w:val="808080"/>
-          <w:sz w:val="22"/>
-          <w:szCs w:val="22"/>
-        </w:rPr>
-        <w:t xml:space="preserve">[PENDIENTE] Redactar al cerrar los experimentos, objetivo por objetivo.</w:t>
+        <w:ind w:firstLine="425"/>
+        <w:jc w:val="both"/>
+      </w:pPr>
+      <w:r>
+        <w:rPr>
+          <w:rFonts w:ascii="Arial" w:cs="Arial" w:eastAsia="Arial" w:hAnsi="Arial"/>
+          <w:b/>
+          <w:bCs/>
+          <w:sz w:val="22"/>
+          <w:szCs w:val="22"/>
+        </w:rPr>
+        <w:t xml:space="preserve">Objetivo 1 — construir un detector de anomalías sobre datos de transacciones.</w:t>
+      </w:r>
+      <w:r>
+        <w:rPr>
+          <w:rFonts w:ascii="Arial" w:cs="Arial" w:eastAsia="Arial" w:hAnsi="Arial"/>
+          <w:sz w:val="22"/>
+          <w:szCs w:val="22"/>
+        </w:rPr>
+        <w:t xml:space="preserve"> Alcanzado. El detector basado en XGBoost obtiene un AUC-PR de 0,883 en partición aleatoria y de 0,797 en partición temporal, con una precisión en los cincuenta casos de mayor puntuación de 1,00 y 0,98 respectivamente. Sobre la partición aleatoria recupera el 83,7 % de los fraudes del conjunto de prueba. La comparación con Isolation Forest, que era el planteamiento inicial del trabajo, resultó concluyente en contra de este: 0,152 de AUC-PR frente a 0,883, y 0,034 frente a 0,797 en partición temporal. Un detector no supervisado no es competitivo cuando se dispone de etiquetas.</w:t>
+      </w:r>
+    </w:p>
+    <w:p>
+      <w:pPr>
+        <w:spacing w:after="160" w:line="360" w:lineRule="auto"/>
+        <w:ind w:firstLine="425"/>
+        <w:jc w:val="both"/>
+      </w:pPr>
+      <w:r>
+        <w:rPr>
+          <w:rFonts w:ascii="Arial" w:cs="Arial" w:eastAsia="Arial" w:hAnsi="Arial"/>
+          <w:b/>
+          <w:bCs/>
+          <w:sz w:val="22"/>
+          <w:szCs w:val="22"/>
+        </w:rPr>
+        <w:t xml:space="preserve">Objetivo 2 — incorporar una capa de agentes que explique y filtre.</w:t>
+      </w:r>
+      <w:r>
+        <w:rPr>
+          <w:rFonts w:ascii="Arial" w:cs="Arial" w:eastAsia="Arial" w:hAnsi="Arial"/>
+          <w:sz w:val="22"/>
+          <w:szCs w:val="22"/>
+        </w:rPr>
+        <w:t xml:space="preserve"> Alcanzado en cuanto a la construcción, no en cuanto al beneficio. El sistema de seis agentes sobre CrewAI produce informes en castellano, con cobertura del cien por cien de los casos elevados y sin invenciones detectables por la auditoría automática. Pero la capa no mejora la detección: en el mejor de los casos deja el recall como estaba y en el resto lo empeora, al descartar casos que eran fraude real. Este resultado negativo es, a juicio de este trabajo, el hallazgo más útil de los obtenidos.</w:t>
+      </w:r>
+    </w:p>
+    <w:p>
+      <w:pPr>
+        <w:spacing w:after="160" w:line="360" w:lineRule="auto"/>
+        <w:ind w:firstLine="425"/>
+        <w:jc w:val="both"/>
+      </w:pPr>
+      <w:r>
+        <w:rPr>
+          <w:rFonts w:ascii="Arial" w:cs="Arial" w:eastAsia="Arial" w:hAnsi="Arial"/>
+          <w:b/>
+          <w:bCs/>
+          <w:sz w:val="22"/>
+          <w:szCs w:val="22"/>
+        </w:rPr>
+        <w:t xml:space="preserve">Objetivo 3 — evaluar el sistema de forma reproducible.</w:t>
+      </w:r>
+      <w:r>
+        <w:rPr>
+          <w:rFonts w:ascii="Arial" w:cs="Arial" w:eastAsia="Arial" w:hAnsi="Arial"/>
+          <w:sz w:val="22"/>
+          <w:szCs w:val="22"/>
+        </w:rPr>
+        <w:t xml:space="preserve"> Alcanzado. Se dispone de un banco de pruebas que mide detector y sistema completo con la misma función, de ablaciones sobre el desbalanceo, sobre los grupos de variables y sobre el contenido del expediente, y de un análisis de operación en continuo. Todos los datos experimentales están versionados junto al código, de modo que cualquier cifra de esta memoria puede rastrearse hasta la ejecución que la produjo.</w:t>
+      </w:r>
+    </w:p>
+    <w:p>
+      <w:pPr>
+        <w:spacing w:after="160" w:line="360" w:lineRule="auto"/>
+        <w:ind w:firstLine="425"/>
+        <w:jc w:val="both"/>
+      </w:pPr>
+      <w:r>
+        <w:rPr>
+          <w:rFonts w:ascii="Arial" w:cs="Arial" w:eastAsia="Arial" w:hAnsi="Arial"/>
+          <w:b/>
+          <w:bCs/>
+          <w:sz w:val="22"/>
+          <w:szCs w:val="22"/>
+        </w:rPr>
+        <w:t xml:space="preserve">Objetivo 4 — cuantificar la pérdida frente a modelos de mayor capacidad.</w:t>
+      </w:r>
+      <w:r>
+        <w:rPr>
+          <w:rFonts w:ascii="Arial" w:cs="Arial" w:eastAsia="Arial" w:hAnsi="Arial"/>
+          <w:sz w:val="22"/>
+          <w:szCs w:val="22"/>
+        </w:rPr>
+        <w:t xml:space="preserve"> Alcanzado, y sin romper la restricción de ejecución local. Mediante descomposición por capas se ejecutó un modelo de 72.000 millones de parámetros en una tarjeta de 16 GB. El resultado se detalla en 6.2.</w:t>
       </w:r>
     </w:p>
     <w:p>
@@ -17984,18 +18279,1227 @@
     </w:p>
     <w:p>
       <w:pPr>
-        <w:spacing w:after="160" w:line="360" w:lineRule="auto"/>
-      </w:pPr>
-      <w:r>
-        <w:rPr>
-          <w:rFonts w:ascii="Arial" w:cs="Arial" w:eastAsia="Arial" w:hAnsi="Arial"/>
-          <w:i/>
-          <w:iCs/>
-          <w:color w:val="808080"/>
-          <w:sz w:val="22"/>
-          <w:szCs w:val="22"/>
-        </w:rPr>
-        <w:t xml:space="preserve">[PENDIENTE] Desarrollar sobre estas cuatro, que son las que sostienen el trabajo.</w:t>
+        <w:pStyle w:val="Heading3"/>
+        <w:spacing w:after="200" w:before="360"/>
+      </w:pPr>
+      <w:r>
+        <w:rPr>
+          <w:rFonts w:ascii="Arial" w:cs="Arial" w:eastAsia="Arial" w:hAnsi="Arial"/>
+          <w:b/>
+          <w:bCs/>
+          <w:color w:val="000000"/>
+          <w:sz w:val="24"/>
+          <w:szCs w:val="24"/>
+        </w:rPr>
+        <w:t xml:space="preserve">6.2.1 La capacidad del modelo no es el factor limitante</w:t>
+      </w:r>
+    </w:p>
+    <w:p>
+      <w:pPr>
+        <w:spacing w:after="160" w:line="360" w:lineRule="auto"/>
+        <w:ind w:firstLine="425"/>
+        <w:jc w:val="both"/>
+      </w:pPr>
+      <w:r>
+        <w:rPr>
+          <w:rFonts w:ascii="Arial" w:cs="Arial" w:eastAsia="Arial" w:hAnsi="Arial"/>
+          <w:sz w:val="22"/>
+          <w:szCs w:val="22"/>
+        </w:rPr>
+        <w:t xml:space="preserve">La hipótesis de partida era que los modelos que caben en memoria de consumo resultan insuficientes y que uno mayor decidiría mejor. Los datos no la respaldan.</w:t>
+      </w:r>
+    </w:p>
+    <w:p>
+      <w:pPr>
+        <w:spacing w:after="160" w:line="360" w:lineRule="auto"/>
+        <w:ind w:firstLine="425"/>
+        <w:jc w:val="both"/>
+      </w:pPr>
+      <w:r>
+        <w:rPr>
+          <w:rFonts w:ascii="Arial" w:cs="Arial" w:eastAsia="Arial" w:hAnsi="Arial"/>
+          <w:sz w:val="22"/>
+          <w:szCs w:val="22"/>
+        </w:rPr>
+        <w:t xml:space="preserve">Sobre los dos únicos casos de fraude presentes en la cola del expediente, Qwen2.5-72B emite exactamente los mismos veredictos que Qwen2.5-14B: descarta ambos. El coste, en cambio, difiere en un factor de 1.790, con 6.623 segundos por caso frente a 3,7. La utilización de GPU observada, entre el 9 y el 25 %, sitúa el cuello de botella en la lectura de las capas desde disco y no en el cómputo, de modo que tampoco se corregiría con una tarjeta más potente.</w:t>
+      </w:r>
+    </w:p>
+    <w:p>
+      <w:pPr>
+        <w:spacing w:after="160" w:line="360" w:lineRule="auto"/>
+        <w:ind w:firstLine="425"/>
+        <w:jc w:val="both"/>
+      </w:pPr>
+      <w:r>
+        <w:rPr>
+          <w:rFonts w:ascii="Arial" w:cs="Arial" w:eastAsia="Arial" w:hAnsi="Arial"/>
+          <w:sz w:val="22"/>
+          <w:szCs w:val="22"/>
+        </w:rPr>
+        <w:t xml:space="preserve">Entre los modelos que sí caben en memoria se observa una ordenación consistente en dirección —el de 8.000 millones destruye más fraude que el de 20.000— pero </w:t>
+      </w:r>
+      <w:r>
+        <w:rPr>
+          <w:rFonts w:ascii="Arial" w:cs="Arial" w:eastAsia="Arial" w:hAnsi="Arial"/>
+          <w:b/>
+          <w:bCs/>
+          <w:sz w:val="22"/>
+          <w:szCs w:val="22"/>
+        </w:rPr>
+        <w:t xml:space="preserve">esa diferencia no alcanza significación estadística</w:t>
+      </w:r>
+      <w:r>
+        <w:rPr>
+          <w:rFonts w:ascii="Arial" w:cs="Arial" w:eastAsia="Arial" w:hAnsi="Arial"/>
+          <w:sz w:val="22"/>
+          <w:szCs w:val="22"/>
+        </w:rPr>
+        <w:t xml:space="preserve"> con los datos disponibles: 19, 12 y 8 fraudes destruidos en dieciséis ejecuciones por modelo, con un contraste exacto de Fisher sobre la dicotomización que arroja p = 0,156 y una prueba de Mann-Whitney sobre los recuentos que arroja p = 0,050. La conclusión defendible es que la ordenación es sugerente y no está demostrada.</w:t>
+      </w:r>
+    </w:p>
+    <w:p>
+      <w:pPr>
+        <w:pStyle w:val="Heading3"/>
+        <w:spacing w:after="200" w:before="360"/>
+      </w:pPr>
+      <w:r>
+        <w:rPr>
+          <w:rFonts w:ascii="Arial" w:cs="Arial" w:eastAsia="Arial" w:hAnsi="Arial"/>
+          <w:b/>
+          <w:bCs/>
+          <w:color w:val="000000"/>
+          <w:sz w:val="24"/>
+          <w:szCs w:val="24"/>
+        </w:rPr>
+        <w:t xml:space="preserve">6.2.2 Corregir la premisa declarada no corrige la decisión</w:t>
+      </w:r>
+    </w:p>
+    <w:p>
+      <w:pPr>
+        <w:spacing w:after="160" w:line="360" w:lineRule="auto"/>
+        <w:ind w:firstLine="425"/>
+        <w:jc w:val="both"/>
+      </w:pPr>
+      <w:r>
+        <w:rPr>
+          <w:rFonts w:ascii="Arial" w:cs="Arial" w:eastAsia="Arial" w:hAnsi="Arial"/>
+          <w:sz w:val="22"/>
+          <w:szCs w:val="22"/>
+        </w:rPr>
+        <w:t xml:space="preserve">Es el resultado más relevante del trabajo y surgió de forma imprevista al analizar el objetivo 4.</w:t>
+      </w:r>
+    </w:p>
+    <w:p>
+      <w:pPr>
+        <w:spacing w:after="160" w:line="360" w:lineRule="auto"/>
+        <w:ind w:firstLine="425"/>
+        <w:jc w:val="both"/>
+      </w:pPr>
+      <w:r>
+        <w:rPr>
+          <w:rFonts w:ascii="Arial" w:cs="Arial" w:eastAsia="Arial" w:hAnsi="Arial"/>
+          <w:sz w:val="22"/>
+          <w:szCs w:val="22"/>
+        </w:rPr>
+        <w:t xml:space="preserve">Al examinar los razonamientos escritos se observó que los modelos descartaban los fraudes alegando de forma explícita que el importe era reducido. En estos datos esa premisa está invertida: el importe mediano de una transacción fraudulenta es de 2,11 euros frente a 19,99 de una legítima, y el 59,3 % de los fraudes no llega a cinco euros frente al 25,1 % de las legítimas. Una transacción fraudulenta tiene 2,4 veces más probabilidad de ser de importe reducido que una legítima.</w:t>
+      </w:r>
+    </w:p>
+    <w:p>
+      <w:pPr>
+        <w:spacing w:after="160" w:line="360" w:lineRule="auto"/>
+        <w:ind w:firstLine="425"/>
+        <w:jc w:val="both"/>
+      </w:pPr>
+      <w:r>
+        <w:rPr>
+          <w:rFonts w:ascii="Arial" w:cs="Arial" w:eastAsia="Arial" w:hAnsi="Arial"/>
+          <w:sz w:val="22"/>
+          <w:szCs w:val="22"/>
+        </w:rPr>
+        <w:t xml:space="preserve">Parecía, por tanto, un fallo barato de corregir. Se añadió al enunciado una corrección que retira la premisa falsa sin instalar la contraria, advirtiendo de que el cargo mínimo de prueba es habitual en fraude con tarjeta y que un importe reducido no basta por sí solo para descartar un caso. Decir lo contrario —que el importe bajo indica fraude— habría entregado la respuesta en la entrada y reproducido un defecto de diseño que ya obligó a rehacer un experimento anterior.</w:t>
+      </w:r>
+    </w:p>
+    <w:p>
+      <w:pPr>
+        <w:spacing w:after="160" w:line="360" w:lineRule="auto"/>
+        <w:ind w:firstLine="425"/>
+        <w:jc w:val="both"/>
+      </w:pPr>
+      <w:r>
+        <w:rPr>
+          <w:rFonts w:ascii="Arial" w:cs="Arial" w:eastAsia="Arial" w:hAnsi="Arial"/>
+          <w:sz w:val="22"/>
+          <w:szCs w:val="22"/>
+        </w:rPr>
+        <w:t xml:space="preserve">Se midió sobre cuatro turnos, doce casos de cola por turno y dos modelos, en las dos condiciones: 192 veredictos en total.</w:t>
+      </w:r>
+    </w:p>
+    <w:tbl>
+      <w:tblPr>
+        <w:tblW w:type="dxa" w:w="9000"/>
+        <w:tblBorders>
+          <w:top w:val="single" w:color="auto" w:sz="4"/>
+          <w:left w:val="single" w:color="auto" w:sz="4"/>
+          <w:bottom w:val="single" w:color="auto" w:sz="4"/>
+          <w:right w:val="single" w:color="auto" w:sz="4"/>
+          <w:insideH w:val="single" w:color="auto" w:sz="4"/>
+          <w:insideV w:val="single" w:color="auto" w:sz="4"/>
+        </w:tblBorders>
+      </w:tblPr>
+      <w:tblGrid>
+        <w:gridCol w:w="1285"/>
+        <w:gridCol w:w="1285"/>
+        <w:gridCol w:w="1285"/>
+        <w:gridCol w:w="1285"/>
+        <w:gridCol w:w="1285"/>
+        <w:gridCol w:w="1285"/>
+        <w:gridCol w:w="1285"/>
+      </w:tblGrid>
+      <w:tr>
+        <w:tc>
+          <w:tcPr>
+            <w:tcW w:type="dxa" w:w="1285"/>
+            <w:shd w:fill="D9D9D9" w:val="clear"/>
+          </w:tcPr>
+          <w:p>
+            <w:pPr>
+              <w:spacing w:after="0"/>
+            </w:pPr>
+            <w:r>
+              <w:rPr>
+                <w:rFonts w:ascii="Arial" w:cs="Arial" w:eastAsia="Arial" w:hAnsi="Arial"/>
+                <w:b/>
+                <w:bCs/>
+                <w:sz w:val="20"/>
+                <w:szCs w:val="20"/>
+              </w:rPr>
+              <w:t xml:space="preserve">modelo</w:t>
+            </w:r>
+          </w:p>
+        </w:tc>
+        <w:tc>
+          <w:tcPr>
+            <w:tcW w:type="dxa" w:w="1285"/>
+            <w:shd w:fill="D9D9D9" w:val="clear"/>
+          </w:tcPr>
+          <w:p>
+            <w:pPr>
+              <w:spacing w:after="0"/>
+            </w:pPr>
+            <w:r>
+              <w:rPr>
+                <w:rFonts w:ascii="Arial" w:cs="Arial" w:eastAsia="Arial" w:hAnsi="Arial"/>
+                <w:b/>
+                <w:bCs/>
+                <w:sz w:val="20"/>
+                <w:szCs w:val="20"/>
+              </w:rPr>
+              <w:t xml:space="preserve">corrección</w:t>
+            </w:r>
+          </w:p>
+        </w:tc>
+        <w:tc>
+          <w:tcPr>
+            <w:tcW w:type="dxa" w:w="1285"/>
+            <w:shd w:fill="D9D9D9" w:val="clear"/>
+          </w:tcPr>
+          <w:p>
+            <w:pPr>
+              <w:spacing w:after="0"/>
+            </w:pPr>
+            <w:r>
+              <w:rPr>
+                <w:rFonts w:ascii="Arial" w:cs="Arial" w:eastAsia="Arial" w:hAnsi="Arial"/>
+                <w:b/>
+                <w:bCs/>
+                <w:sz w:val="20"/>
+                <w:szCs w:val="20"/>
+              </w:rPr>
+              <w:t xml:space="preserve">confirmaciones</w:t>
+            </w:r>
+          </w:p>
+        </w:tc>
+        <w:tc>
+          <w:tcPr>
+            <w:tcW w:type="dxa" w:w="1285"/>
+            <w:shd w:fill="D9D9D9" w:val="clear"/>
+          </w:tcPr>
+          <w:p>
+            <w:pPr>
+              <w:spacing w:after="0"/>
+            </w:pPr>
+            <w:r>
+              <w:rPr>
+                <w:rFonts w:ascii="Arial" w:cs="Arial" w:eastAsia="Arial" w:hAnsi="Arial"/>
+                <w:b/>
+                <w:bCs/>
+                <w:sz w:val="20"/>
+                <w:szCs w:val="20"/>
+              </w:rPr>
+              <w:t xml:space="preserve">precisión</w:t>
+            </w:r>
+          </w:p>
+        </w:tc>
+        <w:tc>
+          <w:tcPr>
+            <w:tcW w:type="dxa" w:w="1285"/>
+            <w:shd w:fill="D9D9D9" w:val="clear"/>
+          </w:tcPr>
+          <w:p>
+            <w:pPr>
+              <w:spacing w:after="0"/>
+            </w:pPr>
+            <w:r>
+              <w:rPr>
+                <w:rFonts w:ascii="Arial" w:cs="Arial" w:eastAsia="Arial" w:hAnsi="Arial"/>
+                <w:b/>
+                <w:bCs/>
+                <w:sz w:val="20"/>
+                <w:szCs w:val="20"/>
+              </w:rPr>
+              <w:t xml:space="preserve">recall</w:t>
+            </w:r>
+          </w:p>
+        </w:tc>
+        <w:tc>
+          <w:tcPr>
+            <w:tcW w:type="dxa" w:w="1285"/>
+            <w:shd w:fill="D9D9D9" w:val="clear"/>
+          </w:tcPr>
+          <w:p>
+            <w:pPr>
+              <w:spacing w:after="0"/>
+            </w:pPr>
+            <w:r>
+              <w:rPr>
+                <w:rFonts w:ascii="Arial" w:cs="Arial" w:eastAsia="Arial" w:hAnsi="Arial"/>
+                <w:b/>
+                <w:bCs/>
+                <w:sz w:val="20"/>
+                <w:szCs w:val="20"/>
+              </w:rPr>
+              <w:t xml:space="preserve">menciona el patrón</w:t>
+            </w:r>
+          </w:p>
+        </w:tc>
+        <w:tc>
+          <w:tcPr>
+            <w:tcW w:type="dxa" w:w="1285"/>
+            <w:shd w:fill="D9D9D9" w:val="clear"/>
+          </w:tcPr>
+          <w:p>
+            <w:pPr>
+              <w:spacing w:after="0"/>
+            </w:pPr>
+            <w:r>
+              <w:rPr>
+                <w:rFonts w:ascii="Arial" w:cs="Arial" w:eastAsia="Arial" w:hAnsi="Arial"/>
+                <w:b/>
+                <w:bCs/>
+                <w:sz w:val="20"/>
+                <w:szCs w:val="20"/>
+              </w:rPr>
+              <w:t xml:space="preserve">y descarta igual</w:t>
+            </w:r>
+          </w:p>
+        </w:tc>
+      </w:tr>
+      <w:tr>
+        <w:tc>
+          <w:tcPr>
+            <w:tcW w:type="dxa" w:w="1285"/>
+          </w:tcPr>
+          <w:p>
+            <w:pPr>
+              <w:spacing w:after="0"/>
+            </w:pPr>
+            <w:r>
+              <w:rPr>
+                <w:rFonts w:ascii="Arial" w:cs="Arial" w:eastAsia="Arial" w:hAnsi="Arial"/>
+                <w:b w:val="false"/>
+                <w:bCs w:val="false"/>
+                <w:sz w:val="20"/>
+                <w:szCs w:val="20"/>
+              </w:rPr>
+              <w:t xml:space="preserve">llama3.1 8B</w:t>
+            </w:r>
+          </w:p>
+        </w:tc>
+        <w:tc>
+          <w:tcPr>
+            <w:tcW w:type="dxa" w:w="1285"/>
+          </w:tcPr>
+          <w:p>
+            <w:pPr>
+              <w:spacing w:after="0"/>
+            </w:pPr>
+            <w:r>
+              <w:rPr>
+                <w:rFonts w:ascii="Arial" w:cs="Arial" w:eastAsia="Arial" w:hAnsi="Arial"/>
+                <w:b w:val="false"/>
+                <w:bCs w:val="false"/>
+                <w:sz w:val="20"/>
+                <w:szCs w:val="20"/>
+              </w:rPr>
+              <w:t xml:space="preserve">no</w:t>
+            </w:r>
+          </w:p>
+        </w:tc>
+        <w:tc>
+          <w:tcPr>
+            <w:tcW w:type="dxa" w:w="1285"/>
+          </w:tcPr>
+          <w:p>
+            <w:pPr>
+              <w:spacing w:after="0"/>
+            </w:pPr>
+            <w:r>
+              <w:rPr>
+                <w:rFonts w:ascii="Arial" w:cs="Arial" w:eastAsia="Arial" w:hAnsi="Arial"/>
+                <w:b w:val="false"/>
+                <w:bCs w:val="false"/>
+                <w:sz w:val="20"/>
+                <w:szCs w:val="20"/>
+              </w:rPr>
+              <w:t xml:space="preserve">13 de 48</w:t>
+            </w:r>
+          </w:p>
+        </w:tc>
+        <w:tc>
+          <w:tcPr>
+            <w:tcW w:type="dxa" w:w="1285"/>
+          </w:tcPr>
+          <w:p>
+            <w:pPr>
+              <w:spacing w:after="0"/>
+            </w:pPr>
+            <w:r>
+              <w:rPr>
+                <w:rFonts w:ascii="Arial" w:cs="Arial" w:eastAsia="Arial" w:hAnsi="Arial"/>
+                <w:b w:val="false"/>
+                <w:bCs w:val="false"/>
+                <w:sz w:val="20"/>
+                <w:szCs w:val="20"/>
+              </w:rPr>
+              <w:t xml:space="preserve">0,15</w:t>
+            </w:r>
+          </w:p>
+        </w:tc>
+        <w:tc>
+          <w:tcPr>
+            <w:tcW w:type="dxa" w:w="1285"/>
+          </w:tcPr>
+          <w:p>
+            <w:pPr>
+              <w:spacing w:after="0"/>
+            </w:pPr>
+            <w:r>
+              <w:rPr>
+                <w:rFonts w:ascii="Arial" w:cs="Arial" w:eastAsia="Arial" w:hAnsi="Arial"/>
+                <w:b w:val="false"/>
+                <w:bCs w:val="false"/>
+                <w:sz w:val="20"/>
+                <w:szCs w:val="20"/>
+              </w:rPr>
+              <w:t xml:space="preserve">0,40</w:t>
+            </w:r>
+          </w:p>
+        </w:tc>
+        <w:tc>
+          <w:tcPr>
+            <w:tcW w:type="dxa" w:w="1285"/>
+          </w:tcPr>
+          <w:p>
+            <w:pPr>
+              <w:spacing w:after="0"/>
+            </w:pPr>
+            <w:r>
+              <w:rPr>
+                <w:rFonts w:ascii="Arial" w:cs="Arial" w:eastAsia="Arial" w:hAnsi="Arial"/>
+                <w:b w:val="false"/>
+                <w:bCs w:val="false"/>
+                <w:sz w:val="20"/>
+                <w:szCs w:val="20"/>
+              </w:rPr>
+              <w:t xml:space="preserve">0</w:t>
+            </w:r>
+          </w:p>
+        </w:tc>
+        <w:tc>
+          <w:tcPr>
+            <w:tcW w:type="dxa" w:w="1285"/>
+          </w:tcPr>
+          <w:p>
+            <w:pPr>
+              <w:spacing w:after="0"/>
+            </w:pPr>
+            <w:r>
+              <w:rPr>
+                <w:rFonts w:ascii="Arial" w:cs="Arial" w:eastAsia="Arial" w:hAnsi="Arial"/>
+                <w:b w:val="false"/>
+                <w:bCs w:val="false"/>
+                <w:sz w:val="20"/>
+                <w:szCs w:val="20"/>
+              </w:rPr>
+              <w:t xml:space="preserve">—</w:t>
+            </w:r>
+          </w:p>
+        </w:tc>
+      </w:tr>
+      <w:tr>
+        <w:tc>
+          <w:tcPr>
+            <w:tcW w:type="dxa" w:w="1285"/>
+          </w:tcPr>
+          <w:p>
+            <w:pPr>
+              <w:spacing w:after="0"/>
+            </w:pPr>
+            <w:r>
+              <w:rPr>
+                <w:rFonts w:ascii="Arial" w:cs="Arial" w:eastAsia="Arial" w:hAnsi="Arial"/>
+                <w:b w:val="false"/>
+                <w:bCs w:val="false"/>
+                <w:sz w:val="20"/>
+                <w:szCs w:val="20"/>
+              </w:rPr>
+              <w:t xml:space="preserve">llama3.1 8B</w:t>
+            </w:r>
+          </w:p>
+        </w:tc>
+        <w:tc>
+          <w:tcPr>
+            <w:tcW w:type="dxa" w:w="1285"/>
+          </w:tcPr>
+          <w:p>
+            <w:pPr>
+              <w:spacing w:after="0"/>
+            </w:pPr>
+            <w:r>
+              <w:rPr>
+                <w:rFonts w:ascii="Arial" w:cs="Arial" w:eastAsia="Arial" w:hAnsi="Arial"/>
+                <w:b w:val="false"/>
+                <w:bCs w:val="false"/>
+                <w:sz w:val="20"/>
+                <w:szCs w:val="20"/>
+              </w:rPr>
+              <w:t xml:space="preserve">**sí**</w:t>
+            </w:r>
+          </w:p>
+        </w:tc>
+        <w:tc>
+          <w:tcPr>
+            <w:tcW w:type="dxa" w:w="1285"/>
+          </w:tcPr>
+          <w:p>
+            <w:pPr>
+              <w:spacing w:after="0"/>
+            </w:pPr>
+            <w:r>
+              <w:rPr>
+                <w:rFonts w:ascii="Arial" w:cs="Arial" w:eastAsia="Arial" w:hAnsi="Arial"/>
+                <w:b w:val="false"/>
+                <w:bCs w:val="false"/>
+                <w:sz w:val="20"/>
+                <w:szCs w:val="20"/>
+              </w:rPr>
+              <w:t xml:space="preserve">36 de 48</w:t>
+            </w:r>
+          </w:p>
+        </w:tc>
+        <w:tc>
+          <w:tcPr>
+            <w:tcW w:type="dxa" w:w="1285"/>
+          </w:tcPr>
+          <w:p>
+            <w:pPr>
+              <w:spacing w:after="0"/>
+            </w:pPr>
+            <w:r>
+              <w:rPr>
+                <w:rFonts w:ascii="Arial" w:cs="Arial" w:eastAsia="Arial" w:hAnsi="Arial"/>
+                <w:b w:val="false"/>
+                <w:bCs w:val="false"/>
+                <w:sz w:val="20"/>
+                <w:szCs w:val="20"/>
+              </w:rPr>
+              <w:t xml:space="preserve">0,08</w:t>
+            </w:r>
+          </w:p>
+        </w:tc>
+        <w:tc>
+          <w:tcPr>
+            <w:tcW w:type="dxa" w:w="1285"/>
+          </w:tcPr>
+          <w:p>
+            <w:pPr>
+              <w:spacing w:after="0"/>
+            </w:pPr>
+            <w:r>
+              <w:rPr>
+                <w:rFonts w:ascii="Arial" w:cs="Arial" w:eastAsia="Arial" w:hAnsi="Arial"/>
+                <w:b w:val="false"/>
+                <w:bCs w:val="false"/>
+                <w:sz w:val="20"/>
+                <w:szCs w:val="20"/>
+              </w:rPr>
+              <w:t xml:space="preserve">0,60</w:t>
+            </w:r>
+          </w:p>
+        </w:tc>
+        <w:tc>
+          <w:tcPr>
+            <w:tcW w:type="dxa" w:w="1285"/>
+          </w:tcPr>
+          <w:p>
+            <w:pPr>
+              <w:spacing w:after="0"/>
+            </w:pPr>
+            <w:r>
+              <w:rPr>
+                <w:rFonts w:ascii="Arial" w:cs="Arial" w:eastAsia="Arial" w:hAnsi="Arial"/>
+                <w:b w:val="false"/>
+                <w:bCs w:val="false"/>
+                <w:sz w:val="20"/>
+                <w:szCs w:val="20"/>
+              </w:rPr>
+              <w:t xml:space="preserve">20</w:t>
+            </w:r>
+          </w:p>
+        </w:tc>
+        <w:tc>
+          <w:tcPr>
+            <w:tcW w:type="dxa" w:w="1285"/>
+          </w:tcPr>
+          <w:p>
+            <w:pPr>
+              <w:spacing w:after="0"/>
+            </w:pPr>
+            <w:r>
+              <w:rPr>
+                <w:rFonts w:ascii="Arial" w:cs="Arial" w:eastAsia="Arial" w:hAnsi="Arial"/>
+                <w:b w:val="false"/>
+                <w:bCs w:val="false"/>
+                <w:sz w:val="20"/>
+                <w:szCs w:val="20"/>
+              </w:rPr>
+              <w:t xml:space="preserve">3 (15 %)</w:t>
+            </w:r>
+          </w:p>
+        </w:tc>
+      </w:tr>
+      <w:tr>
+        <w:tc>
+          <w:tcPr>
+            <w:tcW w:type="dxa" w:w="1285"/>
+          </w:tcPr>
+          <w:p>
+            <w:pPr>
+              <w:spacing w:after="0"/>
+            </w:pPr>
+            <w:r>
+              <w:rPr>
+                <w:rFonts w:ascii="Arial" w:cs="Arial" w:eastAsia="Arial" w:hAnsi="Arial"/>
+                <w:b w:val="false"/>
+                <w:bCs w:val="false"/>
+                <w:sz w:val="20"/>
+                <w:szCs w:val="20"/>
+              </w:rPr>
+              <w:t xml:space="preserve">qwen2.5 14B</w:t>
+            </w:r>
+          </w:p>
+        </w:tc>
+        <w:tc>
+          <w:tcPr>
+            <w:tcW w:type="dxa" w:w="1285"/>
+          </w:tcPr>
+          <w:p>
+            <w:pPr>
+              <w:spacing w:after="0"/>
+            </w:pPr>
+            <w:r>
+              <w:rPr>
+                <w:rFonts w:ascii="Arial" w:cs="Arial" w:eastAsia="Arial" w:hAnsi="Arial"/>
+                <w:b w:val="false"/>
+                <w:bCs w:val="false"/>
+                <w:sz w:val="20"/>
+                <w:szCs w:val="20"/>
+              </w:rPr>
+              <w:t xml:space="preserve">no</w:t>
+            </w:r>
+          </w:p>
+        </w:tc>
+        <w:tc>
+          <w:tcPr>
+            <w:tcW w:type="dxa" w:w="1285"/>
+          </w:tcPr>
+          <w:p>
+            <w:pPr>
+              <w:spacing w:after="0"/>
+            </w:pPr>
+            <w:r>
+              <w:rPr>
+                <w:rFonts w:ascii="Arial" w:cs="Arial" w:eastAsia="Arial" w:hAnsi="Arial"/>
+                <w:b w:val="false"/>
+                <w:bCs w:val="false"/>
+                <w:sz w:val="20"/>
+                <w:szCs w:val="20"/>
+              </w:rPr>
+              <w:t xml:space="preserve">6 de 48</w:t>
+            </w:r>
+          </w:p>
+        </w:tc>
+        <w:tc>
+          <w:tcPr>
+            <w:tcW w:type="dxa" w:w="1285"/>
+          </w:tcPr>
+          <w:p>
+            <w:pPr>
+              <w:spacing w:after="0"/>
+            </w:pPr>
+            <w:r>
+              <w:rPr>
+                <w:rFonts w:ascii="Arial" w:cs="Arial" w:eastAsia="Arial" w:hAnsi="Arial"/>
+                <w:b w:val="false"/>
+                <w:bCs w:val="false"/>
+                <w:sz w:val="20"/>
+                <w:szCs w:val="20"/>
+              </w:rPr>
+              <w:t xml:space="preserve">0,33</w:t>
+            </w:r>
+          </w:p>
+        </w:tc>
+        <w:tc>
+          <w:tcPr>
+            <w:tcW w:type="dxa" w:w="1285"/>
+          </w:tcPr>
+          <w:p>
+            <w:pPr>
+              <w:spacing w:after="0"/>
+            </w:pPr>
+            <w:r>
+              <w:rPr>
+                <w:rFonts w:ascii="Arial" w:cs="Arial" w:eastAsia="Arial" w:hAnsi="Arial"/>
+                <w:b w:val="false"/>
+                <w:bCs w:val="false"/>
+                <w:sz w:val="20"/>
+                <w:szCs w:val="20"/>
+              </w:rPr>
+              <w:t xml:space="preserve">0,40</w:t>
+            </w:r>
+          </w:p>
+        </w:tc>
+        <w:tc>
+          <w:tcPr>
+            <w:tcW w:type="dxa" w:w="1285"/>
+          </w:tcPr>
+          <w:p>
+            <w:pPr>
+              <w:spacing w:after="0"/>
+            </w:pPr>
+            <w:r>
+              <w:rPr>
+                <w:rFonts w:ascii="Arial" w:cs="Arial" w:eastAsia="Arial" w:hAnsi="Arial"/>
+                <w:b w:val="false"/>
+                <w:bCs w:val="false"/>
+                <w:sz w:val="20"/>
+                <w:szCs w:val="20"/>
+              </w:rPr>
+              <w:t xml:space="preserve">0</w:t>
+            </w:r>
+          </w:p>
+        </w:tc>
+        <w:tc>
+          <w:tcPr>
+            <w:tcW w:type="dxa" w:w="1285"/>
+          </w:tcPr>
+          <w:p>
+            <w:pPr>
+              <w:spacing w:after="0"/>
+            </w:pPr>
+            <w:r>
+              <w:rPr>
+                <w:rFonts w:ascii="Arial" w:cs="Arial" w:eastAsia="Arial" w:hAnsi="Arial"/>
+                <w:b w:val="false"/>
+                <w:bCs w:val="false"/>
+                <w:sz w:val="20"/>
+                <w:szCs w:val="20"/>
+              </w:rPr>
+              <w:t xml:space="preserve">—</w:t>
+            </w:r>
+          </w:p>
+        </w:tc>
+      </w:tr>
+      <w:tr>
+        <w:tc>
+          <w:tcPr>
+            <w:tcW w:type="dxa" w:w="1285"/>
+          </w:tcPr>
+          <w:p>
+            <w:pPr>
+              <w:spacing w:after="0"/>
+            </w:pPr>
+            <w:r>
+              <w:rPr>
+                <w:rFonts w:ascii="Arial" w:cs="Arial" w:eastAsia="Arial" w:hAnsi="Arial"/>
+                <w:b w:val="false"/>
+                <w:bCs w:val="false"/>
+                <w:sz w:val="20"/>
+                <w:szCs w:val="20"/>
+              </w:rPr>
+              <w:t xml:space="preserve">qwen2.5 14B</w:t>
+            </w:r>
+          </w:p>
+        </w:tc>
+        <w:tc>
+          <w:tcPr>
+            <w:tcW w:type="dxa" w:w="1285"/>
+          </w:tcPr>
+          <w:p>
+            <w:pPr>
+              <w:spacing w:after="0"/>
+            </w:pPr>
+            <w:r>
+              <w:rPr>
+                <w:rFonts w:ascii="Arial" w:cs="Arial" w:eastAsia="Arial" w:hAnsi="Arial"/>
+                <w:b w:val="false"/>
+                <w:bCs w:val="false"/>
+                <w:sz w:val="20"/>
+                <w:szCs w:val="20"/>
+              </w:rPr>
+              <w:t xml:space="preserve">**sí**</w:t>
+            </w:r>
+          </w:p>
+        </w:tc>
+        <w:tc>
+          <w:tcPr>
+            <w:tcW w:type="dxa" w:w="1285"/>
+          </w:tcPr>
+          <w:p>
+            <w:pPr>
+              <w:spacing w:after="0"/>
+            </w:pPr>
+            <w:r>
+              <w:rPr>
+                <w:rFonts w:ascii="Arial" w:cs="Arial" w:eastAsia="Arial" w:hAnsi="Arial"/>
+                <w:b w:val="false"/>
+                <w:bCs w:val="false"/>
+                <w:sz w:val="20"/>
+                <w:szCs w:val="20"/>
+              </w:rPr>
+              <w:t xml:space="preserve">12 de 48</w:t>
+            </w:r>
+          </w:p>
+        </w:tc>
+        <w:tc>
+          <w:tcPr>
+            <w:tcW w:type="dxa" w:w="1285"/>
+          </w:tcPr>
+          <w:p>
+            <w:pPr>
+              <w:spacing w:after="0"/>
+            </w:pPr>
+            <w:r>
+              <w:rPr>
+                <w:rFonts w:ascii="Arial" w:cs="Arial" w:eastAsia="Arial" w:hAnsi="Arial"/>
+                <w:b w:val="false"/>
+                <w:bCs w:val="false"/>
+                <w:sz w:val="20"/>
+                <w:szCs w:val="20"/>
+              </w:rPr>
+              <w:t xml:space="preserve">0,17</w:t>
+            </w:r>
+          </w:p>
+        </w:tc>
+        <w:tc>
+          <w:tcPr>
+            <w:tcW w:type="dxa" w:w="1285"/>
+          </w:tcPr>
+          <w:p>
+            <w:pPr>
+              <w:spacing w:after="0"/>
+            </w:pPr>
+            <w:r>
+              <w:rPr>
+                <w:rFonts w:ascii="Arial" w:cs="Arial" w:eastAsia="Arial" w:hAnsi="Arial"/>
+                <w:b w:val="false"/>
+                <w:bCs w:val="false"/>
+                <w:sz w:val="20"/>
+                <w:szCs w:val="20"/>
+              </w:rPr>
+              <w:t xml:space="preserve">0,40</w:t>
+            </w:r>
+          </w:p>
+        </w:tc>
+        <w:tc>
+          <w:tcPr>
+            <w:tcW w:type="dxa" w:w="1285"/>
+          </w:tcPr>
+          <w:p>
+            <w:pPr>
+              <w:spacing w:after="0"/>
+            </w:pPr>
+            <w:r>
+              <w:rPr>
+                <w:rFonts w:ascii="Arial" w:cs="Arial" w:eastAsia="Arial" w:hAnsi="Arial"/>
+                <w:b w:val="false"/>
+                <w:bCs w:val="false"/>
+                <w:sz w:val="20"/>
+                <w:szCs w:val="20"/>
+              </w:rPr>
+              <w:t xml:space="preserve">23</w:t>
+            </w:r>
+          </w:p>
+        </w:tc>
+        <w:tc>
+          <w:tcPr>
+            <w:tcW w:type="dxa" w:w="1285"/>
+          </w:tcPr>
+          <w:p>
+            <w:pPr>
+              <w:spacing w:after="0"/>
+            </w:pPr>
+            <w:r>
+              <w:rPr>
+                <w:rFonts w:ascii="Arial" w:cs="Arial" w:eastAsia="Arial" w:hAnsi="Arial"/>
+                <w:b w:val="false"/>
+                <w:bCs w:val="false"/>
+                <w:sz w:val="20"/>
+                <w:szCs w:val="20"/>
+              </w:rPr>
+              <w:t xml:space="preserve">14 (61 %)</w:t>
+            </w:r>
+          </w:p>
+        </w:tc>
+      </w:tr>
+    </w:tbl>
+    <w:p>
+      <w:pPr>
+        <w:spacing w:after="160"/>
+      </w:pPr>
+    </w:p>
+    <w:p>
+      <w:pPr>
+        <w:spacing w:after="160" w:line="360" w:lineRule="auto"/>
+        <w:ind w:firstLine="425"/>
+        <w:jc w:val="both"/>
+      </w:pPr>
+      <w:r>
+        <w:rPr>
+          <w:rFonts w:ascii="Arial" w:cs="Arial" w:eastAsia="Arial" w:hAnsi="Arial"/>
+          <w:sz w:val="22"/>
+          <w:szCs w:val="22"/>
+        </w:rPr>
+        <w:t xml:space="preserve">La corrección se incorpora al texto sin excepción: sin ella el patrón del cargo de prueba no aparece ni una sola vez en noventa y seis casos; con ella aparece en cuarenta y tres. Lo que no mejora en ningún modelo es la decisión. </w:t>
+      </w:r>
+      <w:r>
+        <w:rPr>
+          <w:rFonts w:ascii="Arial" w:cs="Arial" w:eastAsia="Arial" w:hAnsi="Arial"/>
+          <w:b/>
+          <w:bCs/>
+          <w:sz w:val="22"/>
+          <w:szCs w:val="22"/>
+        </w:rPr>
+        <w:t xml:space="preserve">La precisión cae a la mitad en ambos</w:t>
+      </w:r>
+      <w:r>
+        <w:rPr>
+          <w:rFonts w:ascii="Arial" w:cs="Arial" w:eastAsia="Arial" w:hAnsi="Arial"/>
+          <w:sz w:val="22"/>
+          <w:szCs w:val="22"/>
+        </w:rPr>
+        <w:t xml:space="preserve"> y el fraude recuperado en total pasa de seis casos a cinco.</w:t>
+      </w:r>
+    </w:p>
+    <w:p>
+      <w:pPr>
+        <w:spacing w:after="160" w:line="360" w:lineRule="auto"/>
+        <w:ind w:firstLine="425"/>
+        <w:jc w:val="both"/>
+      </w:pPr>
+      <w:r>
+        <w:rPr>
+          <w:rFonts w:ascii="Arial" w:cs="Arial" w:eastAsia="Arial" w:hAnsi="Arial"/>
+          <w:sz w:val="22"/>
+          <w:szCs w:val="22"/>
+        </w:rPr>
+        <w:t xml:space="preserve">El modo de fallo, sin embargo, difiere según el modelo, y esa diferencia es informativa.</w:t>
+      </w:r>
+    </w:p>
+    <w:p>
+      <w:pPr>
+        <w:spacing w:after="160" w:line="360" w:lineRule="auto"/>
+        <w:ind w:firstLine="425"/>
+        <w:jc w:val="both"/>
+      </w:pPr>
+      <w:r>
+        <w:rPr>
+          <w:rFonts w:ascii="Arial" w:cs="Arial" w:eastAsia="Arial" w:hAnsi="Arial"/>
+          <w:sz w:val="22"/>
+          <w:szCs w:val="22"/>
+        </w:rPr>
+        <w:t xml:space="preserve">En </w:t>
+      </w:r>
+      <w:r>
+        <w:rPr>
+          <w:rFonts w:ascii="Arial" w:cs="Arial" w:eastAsia="Arial" w:hAnsi="Arial"/>
+          <w:b/>
+          <w:bCs/>
+          <w:sz w:val="22"/>
+          <w:szCs w:val="22"/>
+        </w:rPr>
+        <w:t xml:space="preserve">qwen2.5 14B</w:t>
+      </w:r>
+      <w:r>
+        <w:rPr>
+          <w:rFonts w:ascii="Arial" w:cs="Arial" w:eastAsia="Arial" w:hAnsi="Arial"/>
+          <w:sz w:val="22"/>
+          <w:szCs w:val="22"/>
+        </w:rPr>
+        <w:t xml:space="preserve"> la prosa y el veredicto se separan: el modelo nombra el patrón, lo reconoce en el caso concreto y a continuación lo descarta en el 61 % de las ocasiones. Escribe que un caso podría ser un intento inicial de verificación previo a una transacción mayor, y lo descarta. El recall no se mueve en absoluto.</w:t>
+      </w:r>
+    </w:p>
+    <w:p>
+      <w:pPr>
+        <w:spacing w:after="160" w:line="360" w:lineRule="auto"/>
+        <w:ind w:firstLine="425"/>
+        <w:jc w:val="both"/>
+      </w:pPr>
+      <w:r>
+        <w:rPr>
+          <w:rFonts w:ascii="Arial" w:cs="Arial" w:eastAsia="Arial" w:hAnsi="Arial"/>
+          <w:sz w:val="22"/>
+          <w:szCs w:val="22"/>
+        </w:rPr>
+        <w:t xml:space="preserve">En </w:t>
+      </w:r>
+      <w:r>
+        <w:rPr>
+          <w:rFonts w:ascii="Arial" w:cs="Arial" w:eastAsia="Arial" w:hAnsi="Arial"/>
+          <w:b/>
+          <w:bCs/>
+          <w:sz w:val="22"/>
+          <w:szCs w:val="22"/>
+        </w:rPr>
+        <w:t xml:space="preserve">llama3.1 8B</w:t>
+      </w:r>
+      <w:r>
+        <w:rPr>
+          <w:rFonts w:ascii="Arial" w:cs="Arial" w:eastAsia="Arial" w:hAnsi="Arial"/>
+          <w:sz w:val="22"/>
+          <w:szCs w:val="22"/>
+        </w:rPr>
+        <w:t xml:space="preserve"> ocurre lo contrario: la prosa y el veredicto van juntos, con sólo un 15 % de contradicción, pero el modelo pasa a confirmar treinta y seis de cuarenta y ocho casos. Recupera un fraude más, y a cambio deja de filtrar: confirmar tres de cada cuatro casos elevados equivale a no aportar nada sobre la salida del detector.</w:t>
+      </w:r>
+    </w:p>
+    <w:p>
+      <w:pPr>
+        <w:spacing w:after="160" w:line="360" w:lineRule="auto"/>
+        <w:ind w:firstLine="425"/>
+        <w:jc w:val="both"/>
+      </w:pPr>
+      <w:r>
+        <w:rPr>
+          <w:rFonts w:ascii="Arial" w:cs="Arial" w:eastAsia="Arial" w:hAnsi="Arial"/>
+          <w:sz w:val="22"/>
+          <w:szCs w:val="22"/>
+        </w:rPr>
+        <w:t xml:space="preserve">De ello se siguen dos conclusiones distintas y ambas incómodas. La primera es que </w:t>
+      </w:r>
+      <w:r>
+        <w:rPr>
+          <w:rFonts w:ascii="Arial" w:cs="Arial" w:eastAsia="Arial" w:hAnsi="Arial"/>
+          <w:b/>
+          <w:bCs/>
+          <w:sz w:val="22"/>
+          <w:szCs w:val="22"/>
+        </w:rPr>
+        <w:t xml:space="preserve">la explicación redactada no es un indicador fiable de lo que el modelo va a decidir</w:t>
+      </w:r>
+      <w:r>
+        <w:rPr>
+          <w:rFonts w:ascii="Arial" w:cs="Arial" w:eastAsia="Arial" w:hAnsi="Arial"/>
+          <w:sz w:val="22"/>
+          <w:szCs w:val="22"/>
+        </w:rPr>
+        <w:t xml:space="preserve">: en el modelo de 14.000 millones de parámetros la contradice de forma directa en la mayoría de los casos en que la menciona. La segunda es que </w:t>
+      </w:r>
+      <w:r>
+        <w:rPr>
+          <w:rFonts w:ascii="Arial" w:cs="Arial" w:eastAsia="Arial" w:hAnsi="Arial"/>
+          <w:b/>
+          <w:bCs/>
+          <w:sz w:val="22"/>
+          <w:szCs w:val="22"/>
+        </w:rPr>
+        <w:t xml:space="preserve">cuando el veredicto sí sigue al texto, lo hace desplazando el criterio en bloque en lugar de discriminando mejor</w:t>
+      </w:r>
+      <w:r>
+        <w:rPr>
+          <w:rFonts w:ascii="Arial" w:cs="Arial" w:eastAsia="Arial" w:hAnsi="Arial"/>
+          <w:sz w:val="22"/>
+          <w:szCs w:val="22"/>
+        </w:rPr>
+        <w:t xml:space="preserve">.</w:t>
+      </w:r>
+    </w:p>
+    <w:p>
+      <w:pPr>
+        <w:spacing w:after="160" w:line="360" w:lineRule="auto"/>
+        <w:ind w:firstLine="425"/>
+        <w:jc w:val="both"/>
+      </w:pPr>
+      <w:r>
+        <w:rPr>
+          <w:rFonts w:ascii="Arial" w:cs="Arial" w:eastAsia="Arial" w:hAnsi="Arial"/>
+          <w:sz w:val="22"/>
+          <w:szCs w:val="22"/>
+        </w:rPr>
+        <w:t xml:space="preserve">Este trabajo no afirma nada sobre el mecanismo interno que produce ese comportamiento. Sí constata que corregir la premisa declarada altera de forma sistemática lo que el modelo escribe y no mejora lo que el modelo decide.</w:t>
+      </w:r>
+    </w:p>
+    <w:p>
+      <w:pPr>
+        <w:spacing w:after="160" w:line="360" w:lineRule="auto"/>
+        <w:ind w:firstLine="425"/>
+        <w:jc w:val="both"/>
+      </w:pPr>
+      <w:r>
+        <w:rPr>
+          <w:rFonts w:ascii="Arial" w:cs="Arial" w:eastAsia="Arial" w:hAnsi="Arial"/>
+          <w:sz w:val="22"/>
+          <w:szCs w:val="22"/>
+        </w:rPr>
+        <w:t xml:space="preserve">La consecuencia práctica para el diseño de sistemas como este es que </w:t>
+      </w:r>
+      <w:r>
+        <w:rPr>
+          <w:rFonts w:ascii="Arial" w:cs="Arial" w:eastAsia="Arial" w:hAnsi="Arial"/>
+          <w:b/>
+          <w:bCs/>
+          <w:sz w:val="22"/>
+          <w:szCs w:val="22"/>
+        </w:rPr>
+        <w:t xml:space="preserve">una explicación bien redactada y coherente con el dominio no constituye evidencia de que la decisión se haya tomado por esas razones</w:t>
+      </w:r>
+      <w:r>
+        <w:rPr>
+          <w:rFonts w:ascii="Arial" w:cs="Arial" w:eastAsia="Arial" w:hAnsi="Arial"/>
+          <w:sz w:val="22"/>
+          <w:szCs w:val="22"/>
+        </w:rPr>
+        <w:t xml:space="preserve">, y por tanto no debe emplearse para auditar al sistema que la produce.</w:t>
+      </w:r>
+    </w:p>
+    <w:p>
+      <w:pPr>
+        <w:pStyle w:val="Heading3"/>
+        <w:spacing w:after="200" w:before="360"/>
+      </w:pPr>
+      <w:r>
+        <w:rPr>
+          <w:rFonts w:ascii="Arial" w:cs="Arial" w:eastAsia="Arial" w:hAnsi="Arial"/>
+          <w:b/>
+          <w:bCs/>
+          <w:color w:val="000000"/>
+          <w:sz w:val="24"/>
+          <w:szCs w:val="24"/>
+        </w:rPr>
+        <w:t xml:space="preserve">6.2.3 La puntuación del detector aporta confianza, no criterio</w:t>
+      </w:r>
+    </w:p>
+    <w:p>
+      <w:pPr>
+        <w:spacing w:after="160" w:line="360" w:lineRule="auto"/>
+        <w:ind w:firstLine="425"/>
+        <w:jc w:val="both"/>
+      </w:pPr>
+      <w:r>
+        <w:rPr>
+          <w:rFonts w:ascii="Arial" w:cs="Arial" w:eastAsia="Arial" w:hAnsi="Arial"/>
+          <w:sz w:val="22"/>
+          <w:szCs w:val="22"/>
+        </w:rPr>
+        <w:t xml:space="preserve">La ablación del expediente, con cuarenta y ocho ejecuciones sobre tres niveles de información, muestra que al retirar la puntuación del detector el volumen de descartes se desploma un 65 % mientras la calidad apenas cae, del 92 % al 82 % de aciertos. El determinismo entre ejecuciones pasa de cuatro de cuatro a una de cuatro.</w:t>
+      </w:r>
+    </w:p>
+    <w:p>
+      <w:pPr>
+        <w:spacing w:after="160" w:line="360" w:lineRule="auto"/>
+        <w:ind w:firstLine="425"/>
+        <w:jc w:val="both"/>
+      </w:pPr>
+      <w:r>
+        <w:rPr>
+          <w:rFonts w:ascii="Arial" w:cs="Arial" w:eastAsia="Arial" w:hAnsi="Arial"/>
+          <w:sz w:val="22"/>
+          <w:szCs w:val="22"/>
+        </w:rPr>
+        <w:t xml:space="preserve">Es decir: la puntuación no le da al agente capacidad de distinguir un fraude de un falso positivo, le da seguridad para pronunciarse y estabilidad para repetirse. Es el mismo fenómeno que 6.2.2 describe desde el otro lado.</w:t>
+      </w:r>
+    </w:p>
+    <w:p>
+      <w:pPr>
+        <w:pStyle w:val="Heading3"/>
+        <w:spacing w:after="200" w:before="360"/>
+      </w:pPr>
+      <w:r>
+        <w:rPr>
+          <w:rFonts w:ascii="Arial" w:cs="Arial" w:eastAsia="Arial" w:hAnsi="Arial"/>
+          <w:b/>
+          <w:bCs/>
+          <w:color w:val="000000"/>
+          <w:sz w:val="24"/>
+          <w:szCs w:val="24"/>
+        </w:rPr>
+        <w:t xml:space="preserve">6.2.4 El cuello de botella operativo es la capacidad de revisión</w:t>
+      </w:r>
+    </w:p>
+    <w:p>
+      <w:pPr>
+        <w:spacing w:after="160" w:line="360" w:lineRule="auto"/>
+        <w:ind w:firstLine="425"/>
+        <w:jc w:val="both"/>
+      </w:pPr>
+      <w:r>
+        <w:rPr>
+          <w:rFonts w:ascii="Arial" w:cs="Arial" w:eastAsia="Arial" w:hAnsi="Arial"/>
+          <w:sz w:val="22"/>
+          <w:szCs w:val="22"/>
+        </w:rPr>
+        <w:t xml:space="preserve">El detector eleva más casos de los que un equipo puede revisar, y esa restricción, no la calidad del modelo de lenguaje, es la que determina cuánto fraude se atrapa. El análisis de operación en continuo lo confirma desde otro ángulo: con ventanas de cinco minutos la ocupación de cómputo es del 3,9 %, de modo que sobra máquina y falta gente. La latencia media entre que ocurre una transacción fraudulenta y aparece en un informe cae de 120 minutos con lotes de cuatro horas a unos 6 minutos con ventanas de diez, sin coste apreciable.</w:t>
+      </w:r>
+    </w:p>
+    <w:p>
+      <w:pPr>
+        <w:pStyle w:val="Heading3"/>
+        <w:spacing w:after="200" w:before="360"/>
+      </w:pPr>
+      <w:r>
+        <w:rPr>
+          <w:rFonts w:ascii="Arial" w:cs="Arial" w:eastAsia="Arial" w:hAnsi="Arial"/>
+          <w:b/>
+          <w:bCs/>
+          <w:color w:val="000000"/>
+          <w:sz w:val="24"/>
+          <w:szCs w:val="24"/>
+        </w:rPr>
+        <w:t xml:space="preserve">6.2.5 Los modos de fallo son silenciosos</w:t>
+      </w:r>
+    </w:p>
+    <w:p>
+      <w:pPr>
+        <w:spacing w:after="160" w:line="360" w:lineRule="auto"/>
+        <w:ind w:firstLine="425"/>
+        <w:jc w:val="both"/>
+      </w:pPr>
+      <w:r>
+        <w:rPr>
+          <w:rFonts w:ascii="Arial" w:cs="Arial" w:eastAsia="Arial" w:hAnsi="Arial"/>
+          <w:sz w:val="22"/>
+          <w:szCs w:val="22"/>
+        </w:rPr>
+        <w:t xml:space="preserve">Ninguno de los fallos encontrados durante el desarrollo lanzó una excepción. Todos produjeron resultados que parecían correctos:</w:t>
       </w:r>
     </w:p>
     <w:p>
@@ -18009,15 +19513,15 @@
           <w:sz w:val="22"/>
           <w:szCs w:val="22"/>
         </w:rPr>
-        <w:t xml:space="preserve">1. </w:t>
-      </w:r>
-      <w:r>
-        <w:rPr>
-          <w:rFonts w:ascii="Arial" w:cs="Arial" w:eastAsia="Arial" w:hAnsi="Arial"/>
-          <w:sz w:val="22"/>
-          <w:szCs w:val="22"/>
-        </w:rPr>
-        <w:t xml:space="preserve">Existe un umbral de capacidad del modelo por debajo del cual delegarle autoridad de decisión degrada la detección, y es abrupto.</w:t>
+        <w:t xml:space="preserve">• </w:t>
+      </w:r>
+      <w:r>
+        <w:rPr>
+          <w:rFonts w:ascii="Arial" w:cs="Arial" w:eastAsia="Arial" w:hAnsi="Arial"/>
+          <w:sz w:val="22"/>
+          <w:szCs w:val="22"/>
+        </w:rPr>
+        <w:t xml:space="preserve">Aplicar SMOTE antes de dividir el conjunto produce un AUC-PR de 1,0000, cifra que sólo una revisión metodológica delata como imposible.</w:t>
       </w:r>
     </w:p>
     <w:p>
@@ -18031,15 +19535,15 @@
           <w:sz w:val="22"/>
           <w:szCs w:val="22"/>
         </w:rPr>
-        <w:t xml:space="preserve">2. </w:t>
-      </w:r>
-      <w:r>
-        <w:rPr>
-          <w:rFonts w:ascii="Arial" w:cs="Arial" w:eastAsia="Arial" w:hAnsi="Arial"/>
-          <w:sz w:val="22"/>
-          <w:szCs w:val="22"/>
-        </w:rPr>
-        <w:t xml:space="preserve">La capa de agentes no mejora la capacidad de detección. La ablación del expediente muestra además que la puntuación del detector no le aporta capacidad de discriminar sino confianza para decidir, y que su reproducibilidad depende de recibir esa puntuación.</w:t>
+        <w:t xml:space="preserve">• </w:t>
+      </w:r>
+      <w:r>
+        <w:rPr>
+          <w:rFonts w:ascii="Arial" w:cs="Arial" w:eastAsia="Arial" w:hAnsi="Arial"/>
+          <w:sz w:val="22"/>
+          <w:szCs w:val="22"/>
+        </w:rPr>
+        <w:t xml:space="preserve">Un parámetro que no se propagaba al contexto hizo que el sistema elevara sesenta casos donde debía elevar uno, con un coste doce veces mayor y sin ningún aviso.</w:t>
       </w:r>
     </w:p>
     <w:p>
@@ -18053,15 +19557,15 @@
           <w:sz w:val="22"/>
           <w:szCs w:val="22"/>
         </w:rPr>
-        <w:t xml:space="preserve">3. </w:t>
-      </w:r>
-      <w:r>
-        <w:rPr>
-          <w:rFonts w:ascii="Arial" w:cs="Arial" w:eastAsia="Arial" w:hAnsi="Arial"/>
-          <w:sz w:val="22"/>
-          <w:szCs w:val="22"/>
-        </w:rPr>
-        <w:t xml:space="preserve">El cuello de botella del sistema es la capacidad de revisión del equipo, no el modelo de lenguaje.</w:t>
+        <w:t xml:space="preserve">• </w:t>
+      </w:r>
+      <w:r>
+        <w:rPr>
+          <w:rFonts w:ascii="Arial" w:cs="Arial" w:eastAsia="Arial" w:hAnsi="Arial"/>
+          <w:sz w:val="22"/>
+          <w:szCs w:val="22"/>
+        </w:rPr>
+        <w:t xml:space="preserve">Omitir en el enunciado la descripción de la salida esperada hizo que el modelo escribiera el veredicto en un formato ligeramente distinto, y la extracción devolviera cero veredictos de diez con todas las métricas a cero.</w:t>
       </w:r>
     </w:p>
     <w:p>
@@ -18075,15 +19579,74 @@
           <w:sz w:val="22"/>
           <w:szCs w:val="22"/>
         </w:rPr>
-        <w:t xml:space="preserve">4. </w:t>
-      </w:r>
-      <w:r>
-        <w:rPr>
-          <w:rFonts w:ascii="Arial" w:cs="Arial" w:eastAsia="Arial" w:hAnsi="Arial"/>
-          <w:sz w:val="22"/>
-          <w:szCs w:val="22"/>
-        </w:rPr>
-        <w:t xml:space="preserve">Los modos de fallo de un sistema de este tipo son silenciosos, lo que obliga a validar las salidas de forma programática.</w:t>
+        <w:t xml:space="preserve">• </w:t>
+      </w:r>
+      <w:r>
+        <w:rPr>
+          <w:rFonts w:ascii="Arial" w:cs="Arial" w:eastAsia="Arial" w:hAnsi="Arial"/>
+          <w:sz w:val="22"/>
+          <w:szCs w:val="22"/>
+        </w:rPr>
+        <w:t xml:space="preserve">Al agregar veredictos concatenando salidas, una cabecera huérfana se emparejaba con el veredicto de la siguiente, perdiendo el último caso. En la ejecución afectada el caso perdido resultó ser el único que era fraude, y la cifra publicada de fraude destruido fue cero cuando el valor real era uno: el error apuntaba en la dirección favorable.</w:t>
+      </w:r>
+    </w:p>
+    <w:p>
+      <w:pPr>
+        <w:spacing w:after="100" w:line="360" w:lineRule="auto"/>
+        <w:ind w:left="425"/>
+      </w:pPr>
+      <w:r>
+        <w:rPr>
+          <w:rFonts w:ascii="Arial" w:cs="Arial" w:eastAsia="Arial" w:hAnsi="Arial"/>
+          <w:sz w:val="22"/>
+          <w:szCs w:val="22"/>
+        </w:rPr>
+        <w:t xml:space="preserve">• </w:t>
+      </w:r>
+      <w:r>
+        <w:rPr>
+          <w:rFonts w:ascii="Arial" w:cs="Arial" w:eastAsia="Arial" w:hAnsi="Arial"/>
+          <w:sz w:val="22"/>
+          <w:szCs w:val="22"/>
+        </w:rPr>
+        <w:t xml:space="preserve">Un modelo de razonamiento agotaba su presupuesto de generación pensando antes de responder, de modo que la respuesta llegaba vacía o cortada a mitad de frase, sin el veredicto final. El sistema de medida registraba entonces doce casos sin veredicto y todas las métricas a cero, y más adelante, al ampliar el presupuesto, siete de doce, que se agregaron en silencio junto a ejecuciones completas y aparecieron en una tabla comparativa indistinguibles de ellas. El guion de ablación sólo descartaba una ejecución cuando no lograba extraer ningún veredicto, no cuando le faltaban algunos.</w:t>
+      </w:r>
+    </w:p>
+    <w:p>
+      <w:pPr>
+        <w:spacing w:after="100" w:line="360" w:lineRule="auto"/>
+        <w:ind w:left="425"/>
+      </w:pPr>
+      <w:r>
+        <w:rPr>
+          <w:rFonts w:ascii="Arial" w:cs="Arial" w:eastAsia="Arial" w:hAnsi="Arial"/>
+          <w:sz w:val="22"/>
+          <w:szCs w:val="22"/>
+        </w:rPr>
+        <w:t xml:space="preserve">• </w:t>
+      </w:r>
+      <w:r>
+        <w:rPr>
+          <w:rFonts w:ascii="Arial" w:cs="Arial" w:eastAsia="Arial" w:hAnsi="Arial"/>
+          <w:sz w:val="22"/>
+          <w:szCs w:val="22"/>
+        </w:rPr>
+        <w:t xml:space="preserve">Apilar ficheros de experimento con combinaciones de turno y repetición duplicadas elevó el tamaño muestral de dieciséis a treinta y dos ejecuciones por modelo y convirtió en significativos dos contrastes que no lo son.</w:t>
+      </w:r>
+    </w:p>
+    <w:p>
+      <w:pPr>
+        <w:spacing w:after="160" w:line="360" w:lineRule="auto"/>
+        <w:ind w:firstLine="425"/>
+        <w:jc w:val="both"/>
+      </w:pPr>
+      <w:r>
+        <w:rPr>
+          <w:rFonts w:ascii="Arial" w:cs="Arial" w:eastAsia="Arial" w:hAnsi="Arial"/>
+          <w:sz w:val="22"/>
+          <w:szCs w:val="22"/>
+        </w:rPr>
+        <w:t xml:space="preserve">Un sistema de este tipo exige, por tanto, validación programática de las salidas y desconfianza sistemática ante los resultados que confirman lo que se esperaba.</w:t>
       </w:r>
     </w:p>
     <w:p>
@@ -18122,7 +19685,7 @@
           <w:sz w:val="22"/>
           <w:szCs w:val="22"/>
         </w:rPr>
-        <w:t xml:space="preserve">El sistema no puede recuperar los falsos negativos del detector: el techo de recall medido es 0,833.</w:t>
+        <w:t xml:space="preserve">El sistema no puede recuperar los falsos negativos del detector. El techo de recall medido es de 0,837 en partición aleatoria y 0,760 en temporal.</w:t>
       </w:r>
     </w:p>
     <w:p>
@@ -18144,7 +19707,7 @@
           <w:sz w:val="22"/>
           <w:szCs w:val="22"/>
         </w:rPr>
-        <w:t xml:space="preserve">La ablación del expediente se ha realizado con un solo modelo, de modo que no puede afirmarse que la dependencia de la puntuación sea general a todos los modelos locales.</w:t>
+        <w:t xml:space="preserve">La comparación entre modelos que caben en memoria no alcanza significación estadística.</w:t>
       </w:r>
     </w:p>
     <w:p>
@@ -18166,7 +19729,7 @@
           <w:sz w:val="22"/>
           <w:szCs w:val="22"/>
         </w:rPr>
-        <w:t xml:space="preserve">Los turnos empleados en la evaluación se solapan y no constituyen muestras independientes.</w:t>
+        <w:t xml:space="preserve">Las repeticiones dentro de un mismo turno, con temperatura 0,1, son casi idénticas entre sí. El número de observaciones verdaderamente independientes es el de turnos, cuatro, y no el de ejecuciones.</w:t>
       </w:r>
     </w:p>
     <w:p>
@@ -18188,7 +19751,7 @@
           <w:sz w:val="22"/>
           <w:szCs w:val="22"/>
         </w:rPr>
-        <w:t xml:space="preserve">La comparativa de arquitecturas de investigación no alcanza significación estadística.</w:t>
+        <w:t xml:space="preserve">Los turnos empleados se solapan parcialmente y no constituyen muestras independientes entre sí.</w:t>
       </w:r>
     </w:p>
     <w:p>
@@ -18210,7 +19773,7 @@
           <w:sz w:val="22"/>
           <w:szCs w:val="22"/>
         </w:rPr>
-        <w:t xml:space="preserve">El valor explicativo de la capa de agentes no está cuantificado.</w:t>
+        <w:t xml:space="preserve">La comparación con el modelo de mayor capacidad se realizó sobre cuatro casos elegidos de forma deliberada. Es una demostración, no una serie estadística.</w:t>
       </w:r>
     </w:p>
     <w:p>
@@ -18232,7 +19795,95 @@
           <w:sz w:val="22"/>
           <w:szCs w:val="22"/>
         </w:rPr>
-        <w:t xml:space="preserve">Un único conjunto de datos, anonimizado, de un solo periodo y una sola región.</w:t>
+        <w:t xml:space="preserve">La ablación del expediente se realizó con un solo modelo, de modo que no puede afirmarse que la dependencia de la puntuación sea general.</w:t>
+      </w:r>
+    </w:p>
+    <w:p>
+      <w:pPr>
+        <w:spacing w:after="100" w:line="360" w:lineRule="auto"/>
+        <w:ind w:left="425"/>
+      </w:pPr>
+      <w:r>
+        <w:rPr>
+          <w:rFonts w:ascii="Arial" w:cs="Arial" w:eastAsia="Arial" w:hAnsi="Arial"/>
+          <w:sz w:val="22"/>
+          <w:szCs w:val="22"/>
+        </w:rPr>
+        <w:t xml:space="preserve">• </w:t>
+      </w:r>
+      <w:r>
+        <w:rPr>
+          <w:rFonts w:ascii="Arial" w:cs="Arial" w:eastAsia="Arial" w:hAnsi="Arial"/>
+          <w:sz w:val="22"/>
+          <w:szCs w:val="22"/>
+        </w:rPr>
+        <w:t xml:space="preserve">Las dos únicas variables interpretables del conjunto apenas contribuyen: retirar la hora mejora el AUC-PR en 0,004 y emplear sólo las componentes principales lo empeora en 0,006. Las explicaciones de la capa de agentes se apoyan precisamente en esas dos variables.</w:t>
+      </w:r>
+    </w:p>
+    <w:p>
+      <w:pPr>
+        <w:spacing w:after="100" w:line="360" w:lineRule="auto"/>
+        <w:ind w:left="425"/>
+      </w:pPr>
+      <w:r>
+        <w:rPr>
+          <w:rFonts w:ascii="Arial" w:cs="Arial" w:eastAsia="Arial" w:hAnsi="Arial"/>
+          <w:sz w:val="22"/>
+          <w:szCs w:val="22"/>
+        </w:rPr>
+        <w:t xml:space="preserve">• </w:t>
+      </w:r>
+      <w:r>
+        <w:rPr>
+          <w:rFonts w:ascii="Arial" w:cs="Arial" w:eastAsia="Arial" w:hAnsi="Arial"/>
+          <w:sz w:val="22"/>
+          <w:szCs w:val="22"/>
+        </w:rPr>
+        <w:t xml:space="preserve">Los modelos de razonamiento quedan fuera de la comparación. Consumen su presupuesto de generación antes de emitir la respuesta, de modo que a coste fijo devuelven salidas truncadas: con el presupuesto común a los demás modelos no responden en absoluto, y al cuadruplicarlo sólo una de ocho ejecuciones completó los doce veredictos. No son comparables bajo el diseño experimental empleado, que fija el coste por caso.</w:t>
+      </w:r>
+    </w:p>
+    <w:p>
+      <w:pPr>
+        <w:spacing w:after="100" w:line="360" w:lineRule="auto"/>
+        <w:ind w:left="425"/>
+      </w:pPr>
+      <w:r>
+        <w:rPr>
+          <w:rFonts w:ascii="Arial" w:cs="Arial" w:eastAsia="Arial" w:hAnsi="Arial"/>
+          <w:sz w:val="22"/>
+          <w:szCs w:val="22"/>
+        </w:rPr>
+        <w:t xml:space="preserve">• </w:t>
+      </w:r>
+      <w:r>
+        <w:rPr>
+          <w:rFonts w:ascii="Arial" w:cs="Arial" w:eastAsia="Arial" w:hAnsi="Arial"/>
+          <w:sz w:val="22"/>
+          <w:szCs w:val="22"/>
+        </w:rPr>
+        <w:t xml:space="preserve">Un único conjunto de datos, anonimizado, de un solo periodo y una sola región geográfica.</w:t>
+      </w:r>
+    </w:p>
+    <w:p>
+      <w:pPr>
+        <w:spacing w:after="100" w:line="360" w:lineRule="auto"/>
+        <w:ind w:left="425"/>
+      </w:pPr>
+      <w:r>
+        <w:rPr>
+          <w:rFonts w:ascii="Arial" w:cs="Arial" w:eastAsia="Arial" w:hAnsi="Arial"/>
+          <w:sz w:val="22"/>
+          <w:szCs w:val="22"/>
+        </w:rPr>
+        <w:t xml:space="preserve">• </w:t>
+      </w:r>
+      <w:r>
+        <w:rPr>
+          <w:rFonts w:ascii="Arial" w:cs="Arial" w:eastAsia="Arial" w:hAnsi="Arial"/>
+          <w:sz w:val="22"/>
+          <w:szCs w:val="22"/>
+        </w:rPr>
+        <w:t xml:space="preserve">El valor explicativo de la capa de agentes para un analista humano no se ha medido: haría falta un estudio con usuarios.</w:t>
       </w:r>
     </w:p>
     <w:p>
@@ -18255,17 +19906,101 @@
     <w:p>
       <w:pPr>
         <w:spacing w:after="160" w:line="360" w:lineRule="auto"/>
-      </w:pPr>
-      <w:r>
-        <w:rPr>
-          <w:rFonts w:ascii="Arial" w:cs="Arial" w:eastAsia="Arial" w:hAnsi="Arial"/>
-          <w:i/>
-          <w:iCs/>
-          <w:color w:val="808080"/>
-          <w:sz w:val="22"/>
-          <w:szCs w:val="22"/>
-        </w:rPr>
-        <w:t xml:space="preserve">[PENDIENTE] Desarrollar. La línea principal es la extensión a un dominio con contenido semántico, como transferencias o prevención de blanqueo de capitales, donde la capa de agentes dispondría de información que el detector no captura. La literatura respalda que los modelos de lenguaje rinden mejor cuando existe contexto semántico, de modo que la limitación observada aquí podría ser del dominio y no del enfoque.</w:t>
+        <w:ind w:firstLine="425"/>
+        <w:jc w:val="both"/>
+      </w:pPr>
+      <w:r>
+        <w:rPr>
+          <w:rFonts w:ascii="Arial" w:cs="Arial" w:eastAsia="Arial" w:hAnsi="Arial"/>
+          <w:b/>
+          <w:bCs/>
+          <w:sz w:val="22"/>
+          <w:szCs w:val="22"/>
+        </w:rPr>
+        <w:t xml:space="preserve">Extensión a un dominio con contenido semántico.</w:t>
+      </w:r>
+      <w:r>
+        <w:rPr>
+          <w:rFonts w:ascii="Arial" w:cs="Arial" w:eastAsia="Arial" w:hAnsi="Arial"/>
+          <w:sz w:val="22"/>
+          <w:szCs w:val="22"/>
+        </w:rPr>
+        <w:t xml:space="preserve"> Es la línea principal. En transferencias o en prevención de blanqueo de capitales existen conceptos, ordenantes, países y relaciones entre operaciones sobre los que un modelo de lenguaje puede razonar de verdad. En el conjunto empleado aquí, veintiocho componentes anonimizadas, un importe y una hora, no hay nada que interpretar más allá de lo que el detector ya ha calculado, de modo que la limitación observada podría ser del dominio y no del enfoque. Comprobarlo requeriría un conjunto de datos con esas características.</w:t>
+      </w:r>
+    </w:p>
+    <w:p>
+      <w:pPr>
+        <w:spacing w:after="160" w:line="360" w:lineRule="auto"/>
+        <w:ind w:firstLine="425"/>
+        <w:jc w:val="both"/>
+      </w:pPr>
+      <w:r>
+        <w:rPr>
+          <w:rFonts w:ascii="Arial" w:cs="Arial" w:eastAsia="Arial" w:hAnsi="Arial"/>
+          <w:b/>
+          <w:bCs/>
+          <w:sz w:val="22"/>
+          <w:szCs w:val="22"/>
+        </w:rPr>
+        <w:t xml:space="preserve">Ajuste fino sobre casos etiquetados.</w:t>
+      </w:r>
+      <w:r>
+        <w:rPr>
+          <w:rFonts w:ascii="Arial" w:cs="Arial" w:eastAsia="Arial" w:hAnsi="Arial"/>
+          <w:sz w:val="22"/>
+          <w:szCs w:val="22"/>
+        </w:rPr>
+        <w:t xml:space="preserve"> Dado que corregir la premisa en el enunciado no altera la decisión, la vía razonable para modificarla sería un ajuste de bajo rango sobre ejemplos del propio dominio, que sustituiría la creencia general del modelo por la distribución real de estos datos. Es también la forma de comprobar si la disociación descrita en 6.2.2 persiste cuando la información llega por los pesos y no por el enunciado.</w:t>
+      </w:r>
+    </w:p>
+    <w:p>
+      <w:pPr>
+        <w:spacing w:after="160" w:line="360" w:lineRule="auto"/>
+        <w:ind w:firstLine="425"/>
+        <w:jc w:val="both"/>
+      </w:pPr>
+      <w:r>
+        <w:rPr>
+          <w:rFonts w:ascii="Arial" w:cs="Arial" w:eastAsia="Arial" w:hAnsi="Arial"/>
+          <w:b/>
+          <w:bCs/>
+          <w:sz w:val="22"/>
+          <w:szCs w:val="22"/>
+        </w:rPr>
+        <w:t xml:space="preserve">Suprimir el veredicto de la capa de agentes en la cola del expediente.</w:t>
+      </w:r>
+      <w:r>
+        <w:rPr>
+          <w:rFonts w:ascii="Arial" w:cs="Arial" w:eastAsia="Arial" w:hAnsi="Arial"/>
+          <w:sz w:val="22"/>
+          <w:szCs w:val="22"/>
+        </w:rPr>
+        <w:t xml:space="preserve"> Se ha comprobado que en la zona de menor probabilidad ningún modelo discrimina. Reservar la intervención del modelo a la explicación de los casos de cabeza, y no al filtrado, conservaría el beneficio sin el coste en recall.</w:t>
+      </w:r>
+    </w:p>
+    <w:p>
+      <w:pPr>
+        <w:spacing w:after="160" w:line="360" w:lineRule="auto"/>
+        <w:ind w:firstLine="425"/>
+        <w:jc w:val="both"/>
+      </w:pPr>
+      <w:r>
+        <w:rPr>
+          <w:rFonts w:ascii="Arial" w:cs="Arial" w:eastAsia="Arial" w:hAnsi="Arial"/>
+          <w:b/>
+          <w:bCs/>
+          <w:sz w:val="22"/>
+          <w:szCs w:val="22"/>
+        </w:rPr>
+        <w:t xml:space="preserve">Medir el valor explicativo con analistas reales.</w:t>
+      </w:r>
+      <w:r>
+        <w:rPr>
+          <w:rFonts w:ascii="Arial" w:cs="Arial" w:eastAsia="Arial" w:hAnsi="Arial"/>
+          <w:sz w:val="22"/>
+          <w:szCs w:val="22"/>
+        </w:rPr>
+        <w:t xml:space="preserve"> El trabajo mide si la capa de agentes filtra bien, que resulta que no. No mide si sus explicaciones ayudan a un humano a decidir más rápido o mejor, que es la razón por la que se incorporó. A la vista de 6.2.2, esa medición debería diseñarse teniendo en cuenta que una explicación convincente puede no corresponderse con el motivo real de la decisión.</w:t>
       </w:r>
     </w:p>
     <w:p>

</xml_diff>

<commit_message>
Cap. 4 mas claro y extension exploratoria sobre dataset Sparkov (5.13)
</commit_message>
<xml_diff>
--- a/memoria/memoria_TFG.docx
+++ b/memoria/memoria_TFG.docx
@@ -7863,7 +7863,7 @@
                 <w:sz w:val="20"/>
                 <w:szCs w:val="20"/>
               </w:rPr>
-              <w:t xml:space="preserve">XGBoost e Isolation Forest</w:t>
+              <w:t xml:space="preserve">XGBoost</w:t>
             </w:r>
           </w:p>
         </w:tc>
@@ -8070,6 +8070,68 @@
                 <w:szCs w:val="20"/>
               </w:rPr>
               <w:t xml:space="preserve">Estocástico</w:t>
+            </w:r>
+          </w:p>
+        </w:tc>
+      </w:tr>
+      <w:tr>
+        <w:tc>
+          <w:tcPr>
+            <w:tcW w:type="dxa" w:w="3000"/>
+          </w:tcPr>
+          <w:p>
+            <w:pPr>
+              <w:spacing w:after="0"/>
+            </w:pPr>
+            <w:r>
+              <w:rPr>
+                <w:rFonts w:ascii="Arial" w:cs="Arial" w:eastAsia="Arial" w:hAnsi="Arial"/>
+                <w:b w:val="false"/>
+                <w:bCs w:val="false"/>
+                <w:sz w:val="20"/>
+                <w:szCs w:val="20"/>
+              </w:rPr>
+              <w:t xml:space="preserve">Coste por turno</w:t>
+            </w:r>
+          </w:p>
+        </w:tc>
+        <w:tc>
+          <w:tcPr>
+            <w:tcW w:type="dxa" w:w="3000"/>
+          </w:tcPr>
+          <w:p>
+            <w:pPr>
+              <w:spacing w:after="0"/>
+            </w:pPr>
+            <w:r>
+              <w:rPr>
+                <w:rFonts w:ascii="Arial" w:cs="Arial" w:eastAsia="Arial" w:hAnsi="Arial"/>
+                <w:b w:val="false"/>
+                <w:bCs w:val="false"/>
+                <w:sz w:val="20"/>
+                <w:szCs w:val="20"/>
+              </w:rPr>
+              <w:t xml:space="preserve">Instantáneo</w:t>
+            </w:r>
+          </w:p>
+        </w:tc>
+        <w:tc>
+          <w:tcPr>
+            <w:tcW w:type="dxa" w:w="3000"/>
+          </w:tcPr>
+          <w:p>
+            <w:pPr>
+              <w:spacing w:after="0"/>
+            </w:pPr>
+            <w:r>
+              <w:rPr>
+                <w:rFonts w:ascii="Arial" w:cs="Arial" w:eastAsia="Arial" w:hAnsi="Arial"/>
+                <w:b w:val="false"/>
+                <w:bCs w:val="false"/>
+                <w:sz w:val="20"/>
+                <w:szCs w:val="20"/>
+              </w:rPr>
+              <w:t xml:space="preserve">Cuatro a cinco minutos</w:t>
             </w:r>
           </w:p>
         </w:tc>
@@ -8202,94 +8264,6 @@
         <w:t xml:space="preserve">Figura 6. El caso 55 en el demostrador: a la izquierda, lo que calcula el detector; a la derecha, el dossier literal que recibe el modelo. Probabilidad 0,067, importe 2,22 EUR, y es fraude real.</w:t>
       </w:r>
     </w:p>
-    <w:tbl>
-      <w:tblPr>
-        <w:tblW w:type="dxa" w:w="9000"/>
-        <w:tblBorders>
-          <w:top w:val="single" w:color="auto" w:sz="4"/>
-          <w:left w:val="single" w:color="auto" w:sz="4"/>
-          <w:bottom w:val="single" w:color="auto" w:sz="4"/>
-          <w:right w:val="single" w:color="auto" w:sz="4"/>
-          <w:insideH w:val="single" w:color="auto" w:sz="4"/>
-          <w:insideV w:val="single" w:color="auto" w:sz="4"/>
-        </w:tblBorders>
-      </w:tblPr>
-      <w:tblGrid>
-        <w:gridCol w:w="3000"/>
-        <w:gridCol w:w="3000"/>
-        <w:gridCol w:w="3000"/>
-      </w:tblGrid>
-      <w:tr>
-        <w:tc>
-          <w:tcPr>
-            <w:tcW w:type="dxa" w:w="3000"/>
-            <w:shd w:fill="D9D9D9" w:val="clear"/>
-          </w:tcPr>
-          <w:p>
-            <w:pPr>
-              <w:spacing w:after="0"/>
-            </w:pPr>
-            <w:r>
-              <w:rPr>
-                <w:rFonts w:ascii="Arial" w:cs="Arial" w:eastAsia="Arial" w:hAnsi="Arial"/>
-                <w:b/>
-                <w:bCs/>
-                <w:sz w:val="20"/>
-                <w:szCs w:val="20"/>
-              </w:rPr>
-              <w:t xml:space="preserve">Coste por turno</w:t>
-            </w:r>
-          </w:p>
-        </w:tc>
-        <w:tc>
-          <w:tcPr>
-            <w:tcW w:type="dxa" w:w="3000"/>
-            <w:shd w:fill="D9D9D9" w:val="clear"/>
-          </w:tcPr>
-          <w:p>
-            <w:pPr>
-              <w:spacing w:after="0"/>
-            </w:pPr>
-            <w:r>
-              <w:rPr>
-                <w:rFonts w:ascii="Arial" w:cs="Arial" w:eastAsia="Arial" w:hAnsi="Arial"/>
-                <w:b/>
-                <w:bCs/>
-                <w:sz w:val="20"/>
-                <w:szCs w:val="20"/>
-              </w:rPr>
-              <w:t xml:space="preserve">Instantáneo</w:t>
-            </w:r>
-          </w:p>
-        </w:tc>
-        <w:tc>
-          <w:tcPr>
-            <w:tcW w:type="dxa" w:w="3000"/>
-            <w:shd w:fill="D9D9D9" w:val="clear"/>
-          </w:tcPr>
-          <w:p>
-            <w:pPr>
-              <w:spacing w:after="0"/>
-            </w:pPr>
-            <w:r>
-              <w:rPr>
-                <w:rFonts w:ascii="Arial" w:cs="Arial" w:eastAsia="Arial" w:hAnsi="Arial"/>
-                <w:b/>
-                <w:bCs/>
-                <w:sz w:val="20"/>
-                <w:szCs w:val="20"/>
-              </w:rPr>
-              <w:t xml:space="preserve">Cuatro a cinco minutos</w:t>
-            </w:r>
-          </w:p>
-        </w:tc>
-      </w:tr>
-    </w:tbl>
-    <w:p>
-      <w:pPr>
-        <w:spacing w:after="160"/>
-      </w:pPr>
-    </w:p>
     <w:p>
       <w:pPr>
         <w:spacing w:after="160" w:line="360" w:lineRule="auto"/>
@@ -9070,6 +9044,31 @@
     </w:p>
     <w:p>
       <w:pPr>
+        <w:spacing w:after="160" w:line="360" w:lineRule="auto"/>
+        <w:ind w:firstLine="425"/>
+        <w:jc w:val="both"/>
+      </w:pPr>
+      <w:r>
+        <w:rPr>
+          <w:rFonts w:ascii="Arial" w:cs="Arial" w:eastAsia="Arial" w:hAnsi="Arial"/>
+          <w:b/>
+          <w:bCs/>
+          <w:sz w:val="22"/>
+          <w:szCs w:val="22"/>
+        </w:rPr>
+        <w:t xml:space="preserve">Conviene precisar qué modelo opera realmente el sistema, porque los tres se entrenan y ninguna sección lo dice de forma explícita hasta ahora: XGBoost, y solo XGBoost.</w:t>
+      </w:r>
+      <w:r>
+        <w:rPr>
+          <w:rFonts w:ascii="Arial" w:cs="Arial" w:eastAsia="Arial" w:hAnsi="Arial"/>
+          <w:sz w:val="22"/>
+          <w:szCs w:val="22"/>
+        </w:rPr>
+        <w:t xml:space="preserve"> Es el que puntúa cada transacción y el que calcula, mediante Shapley, las contribuciones por variable que se inyectan en el expediente de los agentes. El Isolation Forest se calcula en cada puntuación pero su resultado no llega a la capa 2. Random Forest no se carga en ningún momento del flujo operativo: existe únicamente como término de comparación, aquí y en 5.1, para justificar o matizar con datos la elección de XGBoost, no como una alternativa desplegada.</w:t>
+      </w:r>
+    </w:p>
+    <w:p>
+      <w:pPr>
         <w:pStyle w:val="Heading3"/>
         <w:spacing w:after="200" w:before="360"/>
       </w:pPr>
@@ -10313,6 +10312,39 @@
         <w:t xml:space="preserve">El escenario definitivo extrae ventanas temporales contiguas del periodo de prueba: todas las transacciones de un intervalo, con la proporción de fraude que tenga la realidad. Un turno de cuatro horas comprende unas treinta mil transacciones y en torno a medio centenar de fraudes.</w:t>
       </w:r>
     </w:p>
+    <w:p>
+      <w:pPr>
+        <w:spacing w:after="160" w:line="360" w:lineRule="auto"/>
+        <w:ind w:firstLine="425"/>
+        <w:jc w:val="both"/>
+      </w:pPr>
+      <w:r>
+        <w:rPr>
+          <w:rFonts w:ascii="Arial" w:cs="Arial" w:eastAsia="Arial" w:hAnsi="Arial"/>
+          <w:sz w:val="22"/>
+          <w:szCs w:val="22"/>
+        </w:rPr>
+        <w:t xml:space="preserve">Cada turno se identifica por su </w:t>
+      </w:r>
+      <w:r>
+        <w:rPr>
+          <w:rFonts w:ascii="Arial" w:cs="Arial" w:eastAsia="Arial" w:hAnsi="Arial"/>
+          <w:b/>
+          <w:bCs/>
+          <w:sz w:val="22"/>
+          <w:szCs w:val="22"/>
+        </w:rPr>
+        <w:t xml:space="preserve">desplazamiento</w:t>
+      </w:r>
+      <w:r>
+        <w:rPr>
+          <w:rFonts w:ascii="Arial" w:cs="Arial" w:eastAsia="Arial" w:hAnsi="Arial"/>
+          <w:sz w:val="22"/>
+          <w:szCs w:val="22"/>
+        </w:rPr>
+        <w:t xml:space="preserve"> respecto al inicio del periodo de prueba, no por una hora del día: el turno de 0 h cubre las cuatro primeras horas del periodo, el de 1 h va de la hora 1 a la 5, el de 2 h de la 2 a la 6, y así sucesivamente. Como el periodo de prueba dura menos de ocho horas en total, turnos consecutivos comparten aproximadamente la mitad de sus transacciones.</w:t>
+      </w:r>
+    </w:p>
     <w:tbl>
       <w:tblPr>
         <w:tblW w:type="dxa" w:w="9000"/>
@@ -10350,7 +10382,7 @@
                 <w:sz w:val="20"/>
                 <w:szCs w:val="20"/>
               </w:rPr>
-              <w:t xml:space="preserve">Turno</w:t>
+              <w:t xml:space="preserve">Desplazamiento</w:t>
             </w:r>
           </w:p>
         </w:tc>
@@ -10865,7 +10897,7 @@
           <w:sz w:val="22"/>
           <w:szCs w:val="22"/>
         </w:rPr>
-        <w:t xml:space="preserve">Debe declararse que el periodo de prueba dura menos de ocho horas, de modo que turnos de cuatro horas con desplazamientos distintos se solapan parcialmente y no constituyen muestras independientes.</w:t>
+        <w:t xml:space="preserve">Al solaparse, los cuatro turnos no constituyen muestras independientes entre sí. Es una limitación declarada en el capítulo 6, junto a la relacionada con las repeticiones dentro de cada turno: con temperatura 0,1 son casi idénticas entre sí, de modo que el número de observaciones verdaderamente independientes en las comparativas del capítulo 5 es más cercano a cuatro que al total de ejecuciones.</w:t>
       </w:r>
     </w:p>
     <w:p>
@@ -25202,6 +25234,1125 @@
     </w:p>
     <w:p>
       <w:pPr>
+        <w:pStyle w:val="Heading2"/>
+        <w:spacing w:after="200" w:before="360"/>
+      </w:pPr>
+      <w:r>
+        <w:rPr>
+          <w:rFonts w:ascii="Arial" w:cs="Arial" w:eastAsia="Arial" w:hAnsi="Arial"/>
+          <w:b/>
+          <w:bCs/>
+          <w:color w:val="000000"/>
+          <w:sz w:val="26"/>
+          <w:szCs w:val="26"/>
+        </w:rPr>
+        <w:t xml:space="preserve">5.13 Extensión exploratoria: un dataset con variables de negocio</w:t>
+      </w:r>
+    </w:p>
+    <w:p>
+      <w:pPr>
+        <w:spacing w:after="160" w:line="360" w:lineRule="auto"/>
+        <w:ind w:firstLine="425"/>
+        <w:jc w:val="both"/>
+      </w:pPr>
+      <w:r>
+        <w:rPr>
+          <w:rFonts w:ascii="Arial" w:cs="Arial" w:eastAsia="Arial" w:hAnsi="Arial"/>
+          <w:sz w:val="22"/>
+          <w:szCs w:val="22"/>
+        </w:rPr>
+        <w:t xml:space="preserve">La sección 5.1 midió el coste de la anonimización del conjunto ULB: retirar las dos únicas variables interpretables, importe y hora, apenas cambia el AUC-PR, de modo que lo único que la capa 2 puede explicar en términos que un humano reconozca es casi irrelevante para la decisión. Esta sección comprueba qué ocurre con un dataset donde eso no es cierto. No sustituye a los experimentos anteriores ni sigue su misma exigencia metodológica: es una exploración con un único modelo, sin búsqueda de hiperparámetros y sin réplicas, pensada para responder una pregunta concreta y no para sustituir las conclusiones del capítulo.</w:t>
+      </w:r>
+    </w:p>
+    <w:p>
+      <w:pPr>
+        <w:pStyle w:val="Heading3"/>
+        <w:spacing w:after="200" w:before="360"/>
+      </w:pPr>
+      <w:r>
+        <w:rPr>
+          <w:rFonts w:ascii="Arial" w:cs="Arial" w:eastAsia="Arial" w:hAnsi="Arial"/>
+          <w:b/>
+          <w:bCs/>
+          <w:color w:val="000000"/>
+          <w:sz w:val="24"/>
+          <w:szCs w:val="24"/>
+        </w:rPr>
+        <w:t xml:space="preserve">El dataset</w:t>
+      </w:r>
+    </w:p>
+    <w:p>
+      <w:pPr>
+        <w:spacing w:after="160" w:line="360" w:lineRule="auto"/>
+        <w:ind w:firstLine="425"/>
+        <w:jc w:val="both"/>
+      </w:pPr>
+      <w:r>
+        <w:rPr>
+          <w:rFonts w:ascii="Arial" w:cs="Arial" w:eastAsia="Arial" w:hAnsi="Arial"/>
+          <w:sz w:val="22"/>
+          <w:szCs w:val="22"/>
+        </w:rPr>
+        <w:t xml:space="preserve">Se generó con Sparkov, el mismo generador que produjo el conjunto "Credit Card Transactions Fraud Detection Dataset" de Kaggle. Se generó en lugar de descargarlo porque el generador no exige credenciales y permite fijar exactamente el periodo y el número de clientes, cosa que la versión de Kaggle no permite: 1.000 clientes simulados, un año completo (2024), semilla fija para que sea reproducible.</w:t>
+      </w:r>
+    </w:p>
+    <w:p>
+      <w:pPr>
+        <w:spacing w:after="160" w:line="360" w:lineRule="auto"/>
+        <w:ind w:firstLine="425"/>
+        <w:jc w:val="both"/>
+      </w:pPr>
+      <w:r>
+        <w:rPr>
+          <w:rFonts w:ascii="Arial" w:cs="Arial" w:eastAsia="Arial" w:hAnsi="Arial"/>
+          <w:b/>
+          <w:bCs/>
+          <w:sz w:val="22"/>
+          <w:szCs w:val="22"/>
+        </w:rPr>
+        <w:t xml:space="preserve">Es un dataset simulado, no transacciones reales.</w:t>
+      </w:r>
+      <w:r>
+        <w:rPr>
+          <w:rFonts w:ascii="Arial" w:cs="Arial" w:eastAsia="Arial" w:hAnsi="Arial"/>
+          <w:sz w:val="22"/>
+          <w:szCs w:val="22"/>
+        </w:rPr>
+        <w:t xml:space="preserve"> Es la limitación que hay que declarar frente al conjunto principal del trabajo, que sí lo es, y el motivo por el que esta sección se trata como exploratoria y no como una réplica del experimento principal sobre otro dominio.</w:t>
+      </w:r>
+    </w:p>
+    <w:p>
+      <w:pPr>
+        <w:spacing w:after="160" w:line="360" w:lineRule="auto"/>
+        <w:ind w:firstLine="425"/>
+        <w:jc w:val="both"/>
+      </w:pPr>
+      <w:r>
+        <w:rPr>
+          <w:rFonts w:ascii="Arial" w:cs="Arial" w:eastAsia="Arial" w:hAnsi="Arial"/>
+          <w:sz w:val="22"/>
+          <w:szCs w:val="22"/>
+        </w:rPr>
+        <w:t xml:space="preserve">A cambio, cada transacción trae comercio, categoría de comercio, coordenadas del domicilio y del comercio, población de la ciudad, profesión y fecha de nacimiento del titular. Se derivaron seis variables de negocio a partir de esos campos: importe, hora del día, día de la semana, edad del titular, distancia en kilómetros entre domicilio y comercio, y población de la ciudad, más la categoría de comercio codificada en catorce indicadores binarios.</w:t>
+      </w:r>
+    </w:p>
+    <w:p>
+      <w:pPr>
+        <w:spacing w:after="160" w:line="360" w:lineRule="auto"/>
+        <w:ind w:firstLine="425"/>
+        <w:jc w:val="both"/>
+      </w:pPr>
+      <w:r>
+        <w:rPr>
+          <w:rFonts w:ascii="Arial" w:cs="Arial" w:eastAsia="Arial" w:hAnsi="Arial"/>
+          <w:sz w:val="22"/>
+          <w:szCs w:val="22"/>
+        </w:rPr>
+        <w:t xml:space="preserve">El periodo de un año, frente a las cuarenta y ocho horas del conjunto ULB, permite además una partición temporal con volumen real: entrenamiento con los primeros diez meses y prueba con los últimos dos, en lugar de las últimas horas de un periodo de dos días.</w:t>
+      </w:r>
+    </w:p>
+    <w:tbl>
+      <w:tblPr>
+        <w:tblW w:type="dxa" w:w="9000"/>
+        <w:tblBorders>
+          <w:top w:val="single" w:color="auto" w:sz="4"/>
+          <w:left w:val="single" w:color="auto" w:sz="4"/>
+          <w:bottom w:val="single" w:color="auto" w:sz="4"/>
+          <w:right w:val="single" w:color="auto" w:sz="4"/>
+          <w:insideH w:val="single" w:color="auto" w:sz="4"/>
+          <w:insideV w:val="single" w:color="auto" w:sz="4"/>
+        </w:tblBorders>
+      </w:tblPr>
+      <w:tblGrid>
+        <w:gridCol w:w="2250"/>
+        <w:gridCol w:w="2250"/>
+        <w:gridCol w:w="2250"/>
+        <w:gridCol w:w="2250"/>
+      </w:tblGrid>
+      <w:tr>
+        <w:tc>
+          <w:tcPr>
+            <w:tcW w:type="dxa" w:w="2250"/>
+            <w:shd w:fill="D9D9D9" w:val="clear"/>
+          </w:tcPr>
+          <w:p>
+            <w:pPr>
+              <w:spacing w:after="0"/>
+            </w:pPr>
+            <w:r>
+              <w:rPr>
+                <w:rFonts w:ascii="Arial" w:cs="Arial" w:eastAsia="Arial" w:hAnsi="Arial"/>
+                <w:b/>
+                <w:bCs/>
+                <w:sz w:val="20"/>
+                <w:szCs w:val="20"/>
+              </w:rPr>
+              <w:t xml:space="preserve"/>
+            </w:r>
+          </w:p>
+        </w:tc>
+        <w:tc>
+          <w:tcPr>
+            <w:tcW w:type="dxa" w:w="2250"/>
+            <w:shd w:fill="D9D9D9" w:val="clear"/>
+          </w:tcPr>
+          <w:p>
+            <w:pPr>
+              <w:spacing w:after="0"/>
+            </w:pPr>
+            <w:r>
+              <w:rPr>
+                <w:rFonts w:ascii="Arial" w:cs="Arial" w:eastAsia="Arial" w:hAnsi="Arial"/>
+                <w:b/>
+                <w:bCs/>
+                <w:sz w:val="20"/>
+                <w:szCs w:val="20"/>
+              </w:rPr>
+              <w:t xml:space="preserve">Filas</w:t>
+            </w:r>
+          </w:p>
+        </w:tc>
+        <w:tc>
+          <w:tcPr>
+            <w:tcW w:type="dxa" w:w="2250"/>
+            <w:shd w:fill="D9D9D9" w:val="clear"/>
+          </w:tcPr>
+          <w:p>
+            <w:pPr>
+              <w:spacing w:after="0"/>
+            </w:pPr>
+            <w:r>
+              <w:rPr>
+                <w:rFonts w:ascii="Arial" w:cs="Arial" w:eastAsia="Arial" w:hAnsi="Arial"/>
+                <w:b/>
+                <w:bCs/>
+                <w:sz w:val="20"/>
+                <w:szCs w:val="20"/>
+              </w:rPr>
+              <w:t xml:space="preserve">Fraude</w:t>
+            </w:r>
+          </w:p>
+        </w:tc>
+        <w:tc>
+          <w:tcPr>
+            <w:tcW w:type="dxa" w:w="2250"/>
+            <w:shd w:fill="D9D9D9" w:val="clear"/>
+          </w:tcPr>
+          <w:p>
+            <w:pPr>
+              <w:spacing w:after="0"/>
+            </w:pPr>
+            <w:r>
+              <w:rPr>
+                <w:rFonts w:ascii="Arial" w:cs="Arial" w:eastAsia="Arial" w:hAnsi="Arial"/>
+                <w:b/>
+                <w:bCs/>
+                <w:sz w:val="20"/>
+                <w:szCs w:val="20"/>
+              </w:rPr>
+              <w:t xml:space="preserve">Prevalencia</w:t>
+            </w:r>
+          </w:p>
+        </w:tc>
+      </w:tr>
+      <w:tr>
+        <w:tc>
+          <w:tcPr>
+            <w:tcW w:type="dxa" w:w="2250"/>
+          </w:tcPr>
+          <w:p>
+            <w:pPr>
+              <w:spacing w:after="0"/>
+            </w:pPr>
+            <w:r>
+              <w:rPr>
+                <w:rFonts w:ascii="Arial" w:cs="Arial" w:eastAsia="Arial" w:hAnsi="Arial"/>
+                <w:b w:val="false"/>
+                <w:bCs w:val="false"/>
+                <w:sz w:val="20"/>
+                <w:szCs w:val="20"/>
+              </w:rPr>
+              <w:t xml:space="preserve">Entrenamiento</w:t>
+            </w:r>
+          </w:p>
+        </w:tc>
+        <w:tc>
+          <w:tcPr>
+            <w:tcW w:type="dxa" w:w="2250"/>
+          </w:tcPr>
+          <w:p>
+            <w:pPr>
+              <w:spacing w:after="0"/>
+            </w:pPr>
+            <w:r>
+              <w:rPr>
+                <w:rFonts w:ascii="Arial" w:cs="Arial" w:eastAsia="Arial" w:hAnsi="Arial"/>
+                <w:b w:val="false"/>
+                <w:bCs w:val="false"/>
+                <w:sz w:val="20"/>
+                <w:szCs w:val="20"/>
+              </w:rPr>
+              <w:t xml:space="preserve">653.869</w:t>
+            </w:r>
+          </w:p>
+        </w:tc>
+        <w:tc>
+          <w:tcPr>
+            <w:tcW w:type="dxa" w:w="2250"/>
+          </w:tcPr>
+          <w:p>
+            <w:pPr>
+              <w:spacing w:after="0"/>
+            </w:pPr>
+            <w:r>
+              <w:rPr>
+                <w:rFonts w:ascii="Arial" w:cs="Arial" w:eastAsia="Arial" w:hAnsi="Arial"/>
+                <w:b w:val="false"/>
+                <w:bCs w:val="false"/>
+                <w:sz w:val="20"/>
+                <w:szCs w:val="20"/>
+              </w:rPr>
+              <w:t xml:space="preserve">8.161</w:t>
+            </w:r>
+          </w:p>
+        </w:tc>
+        <w:tc>
+          <w:tcPr>
+            <w:tcW w:type="dxa" w:w="2250"/>
+          </w:tcPr>
+          <w:p>
+            <w:pPr>
+              <w:spacing w:after="0"/>
+            </w:pPr>
+            <w:r>
+              <w:rPr>
+                <w:rFonts w:ascii="Arial" w:cs="Arial" w:eastAsia="Arial" w:hAnsi="Arial"/>
+                <w:b w:val="false"/>
+                <w:bCs w:val="false"/>
+                <w:sz w:val="20"/>
+                <w:szCs w:val="20"/>
+              </w:rPr>
+              <w:t xml:space="preserve">1,248 %</w:t>
+            </w:r>
+          </w:p>
+        </w:tc>
+      </w:tr>
+      <w:tr>
+        <w:tc>
+          <w:tcPr>
+            <w:tcW w:type="dxa" w:w="2250"/>
+          </w:tcPr>
+          <w:p>
+            <w:pPr>
+              <w:spacing w:after="0"/>
+            </w:pPr>
+            <w:r>
+              <w:rPr>
+                <w:rFonts w:ascii="Arial" w:cs="Arial" w:eastAsia="Arial" w:hAnsi="Arial"/>
+                <w:b w:val="false"/>
+                <w:bCs w:val="false"/>
+                <w:sz w:val="20"/>
+                <w:szCs w:val="20"/>
+              </w:rPr>
+              <w:t xml:space="preserve">Prueba</w:t>
+            </w:r>
+          </w:p>
+        </w:tc>
+        <w:tc>
+          <w:tcPr>
+            <w:tcW w:type="dxa" w:w="2250"/>
+          </w:tcPr>
+          <w:p>
+            <w:pPr>
+              <w:spacing w:after="0"/>
+            </w:pPr>
+            <w:r>
+              <w:rPr>
+                <w:rFonts w:ascii="Arial" w:cs="Arial" w:eastAsia="Arial" w:hAnsi="Arial"/>
+                <w:b w:val="false"/>
+                <w:bCs w:val="false"/>
+                <w:sz w:val="20"/>
+                <w:szCs w:val="20"/>
+              </w:rPr>
+              <w:t xml:space="preserve">192.881</w:t>
+            </w:r>
+          </w:p>
+        </w:tc>
+        <w:tc>
+          <w:tcPr>
+            <w:tcW w:type="dxa" w:w="2250"/>
+          </w:tcPr>
+          <w:p>
+            <w:pPr>
+              <w:spacing w:after="0"/>
+            </w:pPr>
+            <w:r>
+              <w:rPr>
+                <w:rFonts w:ascii="Arial" w:cs="Arial" w:eastAsia="Arial" w:hAnsi="Arial"/>
+                <w:b w:val="false"/>
+                <w:bCs w:val="false"/>
+                <w:sz w:val="20"/>
+                <w:szCs w:val="20"/>
+              </w:rPr>
+              <w:t xml:space="preserve">1.321</w:t>
+            </w:r>
+          </w:p>
+        </w:tc>
+        <w:tc>
+          <w:tcPr>
+            <w:tcW w:type="dxa" w:w="2250"/>
+          </w:tcPr>
+          <w:p>
+            <w:pPr>
+              <w:spacing w:after="0"/>
+            </w:pPr>
+            <w:r>
+              <w:rPr>
+                <w:rFonts w:ascii="Arial" w:cs="Arial" w:eastAsia="Arial" w:hAnsi="Arial"/>
+                <w:b w:val="false"/>
+                <w:bCs w:val="false"/>
+                <w:sz w:val="20"/>
+                <w:szCs w:val="20"/>
+              </w:rPr>
+              <w:t xml:space="preserve">0,685 %</w:t>
+            </w:r>
+          </w:p>
+        </w:tc>
+      </w:tr>
+    </w:tbl>
+    <w:p>
+      <w:pPr>
+        <w:spacing w:after="160"/>
+      </w:pPr>
+    </w:p>
+    <w:p>
+      <w:pPr>
+        <w:pStyle w:val="Heading3"/>
+        <w:spacing w:after="200" w:before="360"/>
+      </w:pPr>
+      <w:r>
+        <w:rPr>
+          <w:rFonts w:ascii="Arial" w:cs="Arial" w:eastAsia="Arial" w:hAnsi="Arial"/>
+          <w:b/>
+          <w:bCs/>
+          <w:color w:val="000000"/>
+          <w:sz w:val="24"/>
+          <w:szCs w:val="24"/>
+        </w:rPr>
+        <w:t xml:space="preserve">El detector</w:t>
+      </w:r>
+    </w:p>
+    <w:p>
+      <w:pPr>
+        <w:spacing w:after="160" w:line="360" w:lineRule="auto"/>
+        <w:ind w:firstLine="425"/>
+        <w:jc w:val="both"/>
+      </w:pPr>
+      <w:r>
+        <w:rPr>
+          <w:rFonts w:ascii="Arial" w:cs="Arial" w:eastAsia="Arial" w:hAnsi="Arial"/>
+          <w:sz w:val="22"/>
+          <w:szCs w:val="22"/>
+        </w:rPr>
+        <w:t xml:space="preserve">Se entrenó únicamente XGBoost, con la misma ponderación por gradiente que el sistema principal, sin ninguna búsqueda de hiperparámetros.</w:t>
+      </w:r>
+    </w:p>
+    <w:tbl>
+      <w:tblPr>
+        <w:tblW w:type="dxa" w:w="9000"/>
+        <w:tblBorders>
+          <w:top w:val="single" w:color="auto" w:sz="4"/>
+          <w:left w:val="single" w:color="auto" w:sz="4"/>
+          <w:bottom w:val="single" w:color="auto" w:sz="4"/>
+          <w:right w:val="single" w:color="auto" w:sz="4"/>
+          <w:insideH w:val="single" w:color="auto" w:sz="4"/>
+          <w:insideV w:val="single" w:color="auto" w:sz="4"/>
+        </w:tblBorders>
+      </w:tblPr>
+      <w:tblGrid>
+        <w:gridCol w:w="1800"/>
+        <w:gridCol w:w="1800"/>
+        <w:gridCol w:w="1800"/>
+        <w:gridCol w:w="1800"/>
+        <w:gridCol w:w="1800"/>
+      </w:tblGrid>
+      <w:tr>
+        <w:tc>
+          <w:tcPr>
+            <w:tcW w:type="dxa" w:w="1800"/>
+            <w:shd w:fill="D9D9D9" w:val="clear"/>
+          </w:tcPr>
+          <w:p>
+            <w:pPr>
+              <w:spacing w:after="0"/>
+            </w:pPr>
+            <w:r>
+              <w:rPr>
+                <w:rFonts w:ascii="Arial" w:cs="Arial" w:eastAsia="Arial" w:hAnsi="Arial"/>
+                <w:b/>
+                <w:bCs/>
+                <w:sz w:val="20"/>
+                <w:szCs w:val="20"/>
+              </w:rPr>
+              <w:t xml:space="preserve">AUC-PR</w:t>
+            </w:r>
+          </w:p>
+        </w:tc>
+        <w:tc>
+          <w:tcPr>
+            <w:tcW w:type="dxa" w:w="1800"/>
+            <w:shd w:fill="D9D9D9" w:val="clear"/>
+          </w:tcPr>
+          <w:p>
+            <w:pPr>
+              <w:spacing w:after="0"/>
+            </w:pPr>
+            <w:r>
+              <w:rPr>
+                <w:rFonts w:ascii="Arial" w:cs="Arial" w:eastAsia="Arial" w:hAnsi="Arial"/>
+                <w:b/>
+                <w:bCs/>
+                <w:sz w:val="20"/>
+                <w:szCs w:val="20"/>
+              </w:rPr>
+              <w:t xml:space="preserve">ROC-AUC</w:t>
+            </w:r>
+          </w:p>
+        </w:tc>
+        <w:tc>
+          <w:tcPr>
+            <w:tcW w:type="dxa" w:w="1800"/>
+            <w:shd w:fill="D9D9D9" w:val="clear"/>
+          </w:tcPr>
+          <w:p>
+            <w:pPr>
+              <w:spacing w:after="0"/>
+            </w:pPr>
+            <w:r>
+              <w:rPr>
+                <w:rFonts w:ascii="Arial" w:cs="Arial" w:eastAsia="Arial" w:hAnsi="Arial"/>
+                <w:b/>
+                <w:bCs/>
+                <w:sz w:val="20"/>
+                <w:szCs w:val="20"/>
+              </w:rPr>
+              <w:t xml:space="preserve">P@50</w:t>
+            </w:r>
+          </w:p>
+        </w:tc>
+        <w:tc>
+          <w:tcPr>
+            <w:tcW w:type="dxa" w:w="1800"/>
+            <w:shd w:fill="D9D9D9" w:val="clear"/>
+          </w:tcPr>
+          <w:p>
+            <w:pPr>
+              <w:spacing w:after="0"/>
+            </w:pPr>
+            <w:r>
+              <w:rPr>
+                <w:rFonts w:ascii="Arial" w:cs="Arial" w:eastAsia="Arial" w:hAnsi="Arial"/>
+                <w:b/>
+                <w:bCs/>
+                <w:sz w:val="20"/>
+                <w:szCs w:val="20"/>
+              </w:rPr>
+              <w:t xml:space="preserve">P@100</w:t>
+            </w:r>
+          </w:p>
+        </w:tc>
+        <w:tc>
+          <w:tcPr>
+            <w:tcW w:type="dxa" w:w="1800"/>
+            <w:shd w:fill="D9D9D9" w:val="clear"/>
+          </w:tcPr>
+          <w:p>
+            <w:pPr>
+              <w:spacing w:after="0"/>
+            </w:pPr>
+            <w:r>
+              <w:rPr>
+                <w:rFonts w:ascii="Arial" w:cs="Arial" w:eastAsia="Arial" w:hAnsi="Arial"/>
+                <w:b/>
+                <w:bCs/>
+                <w:sz w:val="20"/>
+                <w:szCs w:val="20"/>
+              </w:rPr>
+              <w:t xml:space="preserve">P@200</w:t>
+            </w:r>
+          </w:p>
+        </w:tc>
+      </w:tr>
+      <w:tr>
+        <w:tc>
+          <w:tcPr>
+            <w:tcW w:type="dxa" w:w="1800"/>
+          </w:tcPr>
+          <w:p>
+            <w:pPr>
+              <w:spacing w:after="0"/>
+            </w:pPr>
+            <w:r>
+              <w:rPr>
+                <w:rFonts w:ascii="Arial" w:cs="Arial" w:eastAsia="Arial" w:hAnsi="Arial"/>
+                <w:b w:val="false"/>
+                <w:bCs w:val="false"/>
+                <w:sz w:val="20"/>
+                <w:szCs w:val="20"/>
+              </w:rPr>
+              <w:t xml:space="preserve">0,078</w:t>
+            </w:r>
+          </w:p>
+        </w:tc>
+        <w:tc>
+          <w:tcPr>
+            <w:tcW w:type="dxa" w:w="1800"/>
+          </w:tcPr>
+          <w:p>
+            <w:pPr>
+              <w:spacing w:after="0"/>
+            </w:pPr>
+            <w:r>
+              <w:rPr>
+                <w:rFonts w:ascii="Arial" w:cs="Arial" w:eastAsia="Arial" w:hAnsi="Arial"/>
+                <w:b w:val="false"/>
+                <w:bCs w:val="false"/>
+                <w:sz w:val="20"/>
+                <w:szCs w:val="20"/>
+              </w:rPr>
+              <w:t xml:space="preserve">0,723</w:t>
+            </w:r>
+          </w:p>
+        </w:tc>
+        <w:tc>
+          <w:tcPr>
+            <w:tcW w:type="dxa" w:w="1800"/>
+          </w:tcPr>
+          <w:p>
+            <w:pPr>
+              <w:spacing w:after="0"/>
+            </w:pPr>
+            <w:r>
+              <w:rPr>
+                <w:rFonts w:ascii="Arial" w:cs="Arial" w:eastAsia="Arial" w:hAnsi="Arial"/>
+                <w:b w:val="false"/>
+                <w:bCs w:val="false"/>
+                <w:sz w:val="20"/>
+                <w:szCs w:val="20"/>
+              </w:rPr>
+              <w:t xml:space="preserve">0,420</w:t>
+            </w:r>
+          </w:p>
+        </w:tc>
+        <w:tc>
+          <w:tcPr>
+            <w:tcW w:type="dxa" w:w="1800"/>
+          </w:tcPr>
+          <w:p>
+            <w:pPr>
+              <w:spacing w:after="0"/>
+            </w:pPr>
+            <w:r>
+              <w:rPr>
+                <w:rFonts w:ascii="Arial" w:cs="Arial" w:eastAsia="Arial" w:hAnsi="Arial"/>
+                <w:b w:val="false"/>
+                <w:bCs w:val="false"/>
+                <w:sz w:val="20"/>
+                <w:szCs w:val="20"/>
+              </w:rPr>
+              <w:t xml:space="preserve">0,400</w:t>
+            </w:r>
+          </w:p>
+        </w:tc>
+        <w:tc>
+          <w:tcPr>
+            <w:tcW w:type="dxa" w:w="1800"/>
+          </w:tcPr>
+          <w:p>
+            <w:pPr>
+              <w:spacing w:after="0"/>
+            </w:pPr>
+            <w:r>
+              <w:rPr>
+                <w:rFonts w:ascii="Arial" w:cs="Arial" w:eastAsia="Arial" w:hAnsi="Arial"/>
+                <w:b w:val="false"/>
+                <w:bCs w:val="false"/>
+                <w:sz w:val="20"/>
+                <w:szCs w:val="20"/>
+              </w:rPr>
+              <w:t xml:space="preserve">0,345</w:t>
+            </w:r>
+          </w:p>
+        </w:tc>
+      </w:tr>
+    </w:tbl>
+    <w:p>
+      <w:pPr>
+        <w:spacing w:after="160"/>
+      </w:pPr>
+    </w:p>
+    <w:p>
+      <w:pPr>
+        <w:spacing w:after="160" w:line="360" w:lineRule="auto"/>
+        <w:ind w:firstLine="425"/>
+        <w:jc w:val="both"/>
+      </w:pPr>
+      <w:r>
+        <w:rPr>
+          <w:rFonts w:ascii="Arial" w:cs="Arial" w:eastAsia="Arial" w:hAnsi="Arial"/>
+          <w:sz w:val="22"/>
+          <w:szCs w:val="22"/>
+        </w:rPr>
+        <w:t xml:space="preserve">Las cifras no son comparables en crudo con las del conjunto ULB, y no deben leerse como que este problema sea inherentemente más difícil: el detector ULB pasó por una búsqueda de hiperparámetros completa (fase 7) y este no ha pasado por ninguna. Lo que sí es legítimo leer es la parte alta del ranking, que es la que opera un equipo real: entre los cincuenta casos de mayor puntuación, un 42 % son fraude auténtico, frente a una prevalencia del 0,685 % en la prueba. Es una señal real, sesenta y una veces por encima del azar, aunque muy por debajo del 0,98 del sistema principal en el mismo punto de operación.</w:t>
+      </w:r>
+    </w:p>
+    <w:p>
+      <w:pPr>
+        <w:spacing w:after="160" w:line="360" w:lineRule="auto"/>
+        <w:ind w:firstLine="425"/>
+        <w:jc w:val="both"/>
+      </w:pPr>
+      <w:r>
+        <w:rPr>
+          <w:rFonts w:ascii="Arial" w:cs="Arial" w:eastAsia="Arial" w:hAnsi="Arial"/>
+          <w:sz w:val="22"/>
+          <w:szCs w:val="22"/>
+        </w:rPr>
+        <w:t xml:space="preserve">Conviene precisar que las métricas con umbral fijo en 0,5 —una precisión de 0,009 pese a un recall de 0,948— no son informativas aquí: la ponderación de la clase minoritaria empuja la mayoría de las probabilidades hacia arriba, igual que ocurre en el sistema principal, donde por eso el punto de operación se fija por P@N y no por un umbral de probabilidad fijo (4.5 y 5.2).</w:t>
+      </w:r>
+    </w:p>
+    <w:p>
+      <w:pPr>
+        <w:pStyle w:val="Heading3"/>
+        <w:spacing w:after="200" w:before="360"/>
+      </w:pPr>
+      <w:r>
+        <w:rPr>
+          <w:rFonts w:ascii="Arial" w:cs="Arial" w:eastAsia="Arial" w:hAnsi="Arial"/>
+          <w:b/>
+          <w:bCs/>
+          <w:color w:val="000000"/>
+          <w:sz w:val="24"/>
+          <w:szCs w:val="24"/>
+        </w:rPr>
+        <w:t xml:space="preserve">Lo que cambia: las contribuciones son de negocio</w:t>
+      </w:r>
+    </w:p>
+    <w:p>
+      <w:pPr>
+        <w:spacing w:after="160" w:line="360" w:lineRule="auto"/>
+        <w:ind w:firstLine="425"/>
+        <w:jc w:val="both"/>
+      </w:pPr>
+      <w:r>
+        <w:rPr>
+          <w:rFonts w:ascii="Arial" w:cs="Arial" w:eastAsia="Arial" w:hAnsi="Arial"/>
+          <w:sz w:val="22"/>
+          <w:szCs w:val="22"/>
+        </w:rPr>
+        <w:t xml:space="preserve">Es el resultado que motiva la sección. Las contribuciones de Shapley sobre los casos de fraude mejor puntuados citan variables que un analista reconoce sin traducción. Un ejemplo, el comercio "Kozey-Kuhlman", categoría cuidado personal, 744,54 USD, a 109,7 km del domicilio del titular, probabilidad 1,0000:</w:t>
+      </w:r>
+    </w:p>
+    <w:tbl>
+      <w:tblPr>
+        <w:tblW w:type="dxa" w:w="9000"/>
+        <w:tblBorders>
+          <w:top w:val="single" w:color="auto" w:sz="4"/>
+          <w:left w:val="single" w:color="auto" w:sz="4"/>
+          <w:bottom w:val="single" w:color="auto" w:sz="4"/>
+          <w:right w:val="single" w:color="auto" w:sz="4"/>
+          <w:insideH w:val="single" w:color="auto" w:sz="4"/>
+          <w:insideV w:val="single" w:color="auto" w:sz="4"/>
+        </w:tblBorders>
+      </w:tblPr>
+      <w:tblGrid>
+        <w:gridCol w:w="4500"/>
+        <w:gridCol w:w="4500"/>
+      </w:tblGrid>
+      <w:tr>
+        <w:tc>
+          <w:tcPr>
+            <w:tcW w:type="dxa" w:w="4500"/>
+            <w:shd w:fill="D9D9D9" w:val="clear"/>
+          </w:tcPr>
+          <w:p>
+            <w:pPr>
+              <w:spacing w:after="0"/>
+            </w:pPr>
+            <w:r>
+              <w:rPr>
+                <w:rFonts w:ascii="Arial" w:cs="Arial" w:eastAsia="Arial" w:hAnsi="Arial"/>
+                <w:b/>
+                <w:bCs/>
+                <w:sz w:val="20"/>
+                <w:szCs w:val="20"/>
+              </w:rPr>
+              <w:t xml:space="preserve">Variable</w:t>
+            </w:r>
+          </w:p>
+        </w:tc>
+        <w:tc>
+          <w:tcPr>
+            <w:tcW w:type="dxa" w:w="4500"/>
+            <w:shd w:fill="D9D9D9" w:val="clear"/>
+          </w:tcPr>
+          <w:p>
+            <w:pPr>
+              <w:spacing w:after="0"/>
+            </w:pPr>
+            <w:r>
+              <w:rPr>
+                <w:rFonts w:ascii="Arial" w:cs="Arial" w:eastAsia="Arial" w:hAnsi="Arial"/>
+                <w:b/>
+                <w:bCs/>
+                <w:sz w:val="20"/>
+                <w:szCs w:val="20"/>
+              </w:rPr>
+              <w:t xml:space="preserve">Aporte</w:t>
+            </w:r>
+          </w:p>
+        </w:tc>
+      </w:tr>
+      <w:tr>
+        <w:tc>
+          <w:tcPr>
+            <w:tcW w:type="dxa" w:w="4500"/>
+          </w:tcPr>
+          <w:p>
+            <w:pPr>
+              <w:spacing w:after="0"/>
+            </w:pPr>
+            <w:r>
+              <w:rPr>
+                <w:rFonts w:ascii="Arial" w:cs="Arial" w:eastAsia="Arial" w:hAnsi="Arial"/>
+                <w:b w:val="false"/>
+                <w:bCs w:val="false"/>
+                <w:sz w:val="20"/>
+                <w:szCs w:val="20"/>
+              </w:rPr>
+              <w:t xml:space="preserve">categoria_personal_care</w:t>
+            </w:r>
+          </w:p>
+        </w:tc>
+        <w:tc>
+          <w:tcPr>
+            <w:tcW w:type="dxa" w:w="4500"/>
+          </w:tcPr>
+          <w:p>
+            <w:pPr>
+              <w:spacing w:after="0"/>
+            </w:pPr>
+            <w:r>
+              <w:rPr>
+                <w:rFonts w:ascii="Arial" w:cs="Arial" w:eastAsia="Arial" w:hAnsi="Arial"/>
+                <w:b w:val="false"/>
+                <w:bCs w:val="false"/>
+                <w:sz w:val="20"/>
+                <w:szCs w:val="20"/>
+              </w:rPr>
+              <w:t xml:space="preserve">+5,109</w:t>
+            </w:r>
+          </w:p>
+        </w:tc>
+      </w:tr>
+      <w:tr>
+        <w:tc>
+          <w:tcPr>
+            <w:tcW w:type="dxa" w:w="4500"/>
+          </w:tcPr>
+          <w:p>
+            <w:pPr>
+              <w:spacing w:after="0"/>
+            </w:pPr>
+            <w:r>
+              <w:rPr>
+                <w:rFonts w:ascii="Arial" w:cs="Arial" w:eastAsia="Arial" w:hAnsi="Arial"/>
+                <w:b w:val="false"/>
+                <w:bCs w:val="false"/>
+                <w:sz w:val="20"/>
+                <w:szCs w:val="20"/>
+              </w:rPr>
+              <w:t xml:space="preserve">hora</w:t>
+            </w:r>
+          </w:p>
+        </w:tc>
+        <w:tc>
+          <w:tcPr>
+            <w:tcW w:type="dxa" w:w="4500"/>
+          </w:tcPr>
+          <w:p>
+            <w:pPr>
+              <w:spacing w:after="0"/>
+            </w:pPr>
+            <w:r>
+              <w:rPr>
+                <w:rFonts w:ascii="Arial" w:cs="Arial" w:eastAsia="Arial" w:hAnsi="Arial"/>
+                <w:b w:val="false"/>
+                <w:bCs w:val="false"/>
+                <w:sz w:val="20"/>
+                <w:szCs w:val="20"/>
+              </w:rPr>
+              <w:t xml:space="preserve">+3,606</w:t>
+            </w:r>
+          </w:p>
+        </w:tc>
+      </w:tr>
+      <w:tr>
+        <w:tc>
+          <w:tcPr>
+            <w:tcW w:type="dxa" w:w="4500"/>
+          </w:tcPr>
+          <w:p>
+            <w:pPr>
+              <w:spacing w:after="0"/>
+            </w:pPr>
+            <w:r>
+              <w:rPr>
+                <w:rFonts w:ascii="Arial" w:cs="Arial" w:eastAsia="Arial" w:hAnsi="Arial"/>
+                <w:b w:val="false"/>
+                <w:bCs w:val="false"/>
+                <w:sz w:val="20"/>
+                <w:szCs w:val="20"/>
+              </w:rPr>
+              <w:t xml:space="preserve">importe</w:t>
+            </w:r>
+          </w:p>
+        </w:tc>
+        <w:tc>
+          <w:tcPr>
+            <w:tcW w:type="dxa" w:w="4500"/>
+          </w:tcPr>
+          <w:p>
+            <w:pPr>
+              <w:spacing w:after="0"/>
+            </w:pPr>
+            <w:r>
+              <w:rPr>
+                <w:rFonts w:ascii="Arial" w:cs="Arial" w:eastAsia="Arial" w:hAnsi="Arial"/>
+                <w:b w:val="false"/>
+                <w:bCs w:val="false"/>
+                <w:sz w:val="20"/>
+                <w:szCs w:val="20"/>
+              </w:rPr>
+              <w:t xml:space="preserve">+3,285</w:t>
+            </w:r>
+          </w:p>
+        </w:tc>
+      </w:tr>
+      <w:tr>
+        <w:tc>
+          <w:tcPr>
+            <w:tcW w:type="dxa" w:w="4500"/>
+          </w:tcPr>
+          <w:p>
+            <w:pPr>
+              <w:spacing w:after="0"/>
+            </w:pPr>
+            <w:r>
+              <w:rPr>
+                <w:rFonts w:ascii="Arial" w:cs="Arial" w:eastAsia="Arial" w:hAnsi="Arial"/>
+                <w:b w:val="false"/>
+                <w:bCs w:val="false"/>
+                <w:sz w:val="20"/>
+                <w:szCs w:val="20"/>
+              </w:rPr>
+              <w:t xml:space="preserve">edad</w:t>
+            </w:r>
+          </w:p>
+        </w:tc>
+        <w:tc>
+          <w:tcPr>
+            <w:tcW w:type="dxa" w:w="4500"/>
+          </w:tcPr>
+          <w:p>
+            <w:pPr>
+              <w:spacing w:after="0"/>
+            </w:pPr>
+            <w:r>
+              <w:rPr>
+                <w:rFonts w:ascii="Arial" w:cs="Arial" w:eastAsia="Arial" w:hAnsi="Arial"/>
+                <w:b w:val="false"/>
+                <w:bCs w:val="false"/>
+                <w:sz w:val="20"/>
+                <w:szCs w:val="20"/>
+              </w:rPr>
+              <w:t xml:space="preserve">+1,247</w:t>
+            </w:r>
+          </w:p>
+        </w:tc>
+      </w:tr>
+      <w:tr>
+        <w:tc>
+          <w:tcPr>
+            <w:tcW w:type="dxa" w:w="4500"/>
+          </w:tcPr>
+          <w:p>
+            <w:pPr>
+              <w:spacing w:after="0"/>
+            </w:pPr>
+            <w:r>
+              <w:rPr>
+                <w:rFonts w:ascii="Arial" w:cs="Arial" w:eastAsia="Arial" w:hAnsi="Arial"/>
+                <w:b w:val="false"/>
+                <w:bCs w:val="false"/>
+                <w:sz w:val="20"/>
+                <w:szCs w:val="20"/>
+              </w:rPr>
+              <w:t xml:space="preserve">categoria_home</w:t>
+            </w:r>
+          </w:p>
+        </w:tc>
+        <w:tc>
+          <w:tcPr>
+            <w:tcW w:type="dxa" w:w="4500"/>
+          </w:tcPr>
+          <w:p>
+            <w:pPr>
+              <w:spacing w:after="0"/>
+            </w:pPr>
+            <w:r>
+              <w:rPr>
+                <w:rFonts w:ascii="Arial" w:cs="Arial" w:eastAsia="Arial" w:hAnsi="Arial"/>
+                <w:b w:val="false"/>
+                <w:bCs w:val="false"/>
+                <w:sz w:val="20"/>
+                <w:szCs w:val="20"/>
+              </w:rPr>
+              <w:t xml:space="preserve">+0,365</w:t>
+            </w:r>
+          </w:p>
+        </w:tc>
+      </w:tr>
+      <w:tr>
+        <w:tc>
+          <w:tcPr>
+            <w:tcW w:type="dxa" w:w="4500"/>
+          </w:tcPr>
+          <w:p>
+            <w:pPr>
+              <w:spacing w:after="0"/>
+            </w:pPr>
+            <w:r>
+              <w:rPr>
+                <w:rFonts w:ascii="Arial" w:cs="Arial" w:eastAsia="Arial" w:hAnsi="Arial"/>
+                <w:b w:val="false"/>
+                <w:bCs w:val="false"/>
+                <w:sz w:val="20"/>
+                <w:szCs w:val="20"/>
+              </w:rPr>
+              <w:t xml:space="preserve">dia_semana</w:t>
+            </w:r>
+          </w:p>
+        </w:tc>
+        <w:tc>
+          <w:tcPr>
+            <w:tcW w:type="dxa" w:w="4500"/>
+          </w:tcPr>
+          <w:p>
+            <w:pPr>
+              <w:spacing w:after="0"/>
+            </w:pPr>
+            <w:r>
+              <w:rPr>
+                <w:rFonts w:ascii="Arial" w:cs="Arial" w:eastAsia="Arial" w:hAnsi="Arial"/>
+                <w:b w:val="false"/>
+                <w:bCs w:val="false"/>
+                <w:sz w:val="20"/>
+                <w:szCs w:val="20"/>
+              </w:rPr>
+              <w:t xml:space="preserve">+0,282</w:t>
+            </w:r>
+          </w:p>
+        </w:tc>
+      </w:tr>
+    </w:tbl>
+    <w:p>
+      <w:pPr>
+        <w:spacing w:after="160"/>
+      </w:pPr>
+    </w:p>
+    <w:p>
+      <w:pPr>
+        <w:spacing w:after="160" w:line="360" w:lineRule="auto"/>
+        <w:ind w:firstLine="425"/>
+        <w:jc w:val="both"/>
+      </w:pPr>
+      <w:r>
+        <w:rPr>
+          <w:rFonts w:ascii="Arial" w:cs="Arial" w:eastAsia="Arial" w:hAnsi="Arial"/>
+          <w:sz w:val="22"/>
+          <w:szCs w:val="22"/>
+        </w:rPr>
+        <w:t xml:space="preserve">Frente al expediente del sistema principal, donde la variable de mayor aporte es una componente anonimizada como V14, aquí la explicación es directamente "la categoría de comercio, la hora del día y el importe son atípicos para este titular". Es exactamente la explicación que 4.2.1 declaraba imposible sobre el conjunto ULB.</w:t>
+      </w:r>
+    </w:p>
+    <w:p>
+      <w:pPr>
+        <w:pStyle w:val="Heading3"/>
+        <w:spacing w:after="200" w:before="360"/>
+      </w:pPr>
+      <w:r>
+        <w:rPr>
+          <w:rFonts w:ascii="Arial" w:cs="Arial" w:eastAsia="Arial" w:hAnsi="Arial"/>
+          <w:b/>
+          <w:bCs/>
+          <w:color w:val="000000"/>
+          <w:sz w:val="24"/>
+          <w:szCs w:val="24"/>
+        </w:rPr>
+        <w:t xml:space="preserve">Prueba con el Investigador</w:t>
+      </w:r>
+    </w:p>
+    <w:p>
+      <w:pPr>
+        <w:spacing w:after="160" w:line="360" w:lineRule="auto"/>
+      </w:pPr>
+      <w:r>
+        <w:rPr>
+          <w:rFonts w:ascii="Arial" w:cs="Arial" w:eastAsia="Arial" w:hAnsi="Arial"/>
+          <w:i/>
+          <w:iCs/>
+          <w:color w:val="808080"/>
+          <w:sz w:val="22"/>
+          <w:szCs w:val="22"/>
+        </w:rPr>
+        <w:t xml:space="preserve">[PENDIENTE] Ejecución de scripts/sparkov/investigar_caso.py sobre los cinco casos de fraude de mayor puntuación, con el mismo backend Ollama que el resto del trabajo. Pendiente de lanzarse porque requiere la GPU local, ocupada en el momento de escribir esto con el ajuste QLoRA del capítulo 6.4. La pregunta que responde: con variables de negocio disponibles, ¿el párrafo del Investigador las usa de verdad, o sigue limitándose al importe como en el caso 55 de 5.11? Al completarse, esta sección debe sustituirse por los veredictos obtenidos y los fragmentos de prosa más informativos.</w:t>
+      </w:r>
+    </w:p>
+    <w:p>
+      <w:pPr>
+        <w:pStyle w:val="Heading3"/>
+        <w:spacing w:after="200" w:before="360"/>
+      </w:pPr>
+      <w:r>
+        <w:rPr>
+          <w:rFonts w:ascii="Arial" w:cs="Arial" w:eastAsia="Arial" w:hAnsi="Arial"/>
+          <w:b/>
+          <w:bCs/>
+          <w:color w:val="000000"/>
+          <w:sz w:val="24"/>
+          <w:szCs w:val="24"/>
+        </w:rPr>
+        <w:t xml:space="preserve">Alcance</w:t>
+      </w:r>
+    </w:p>
+    <w:p>
+      <w:pPr>
+        <w:spacing w:after="160" w:line="360" w:lineRule="auto"/>
+        <w:ind w:firstLine="425"/>
+        <w:jc w:val="both"/>
+      </w:pPr>
+      <w:r>
+        <w:rPr>
+          <w:rFonts w:ascii="Arial" w:cs="Arial" w:eastAsia="Arial" w:hAnsi="Arial"/>
+          <w:sz w:val="22"/>
+          <w:szCs w:val="22"/>
+        </w:rPr>
+        <w:t xml:space="preserve">Un solo modelo, sin hiperparámetros ajustados, sobre datos simulados y con una sola semilla de generación. No permite ninguna de las afirmaciones de significación estadística del resto del capítulo. Lo que sí permite, y es lo que se buscaba, es comprobar que la limitación de 4.2.1 —las explicaciones no pueden ser de negocio porque el dato no lo es— es del dataset y no del sistema: con otro dataset, las mismas herramientas producen expedientes legibles por un humano sin cambiar una sola línea de la capa 2.</w:t>
+      </w:r>
+    </w:p>
+    <w:p>
+      <w:pPr>
         <w:pStyle w:val="Heading1"/>
         <w:pageBreakBefore/>
         <w:spacing w:after="200" w:before="360"/>
@@ -27020,7 +28171,29 @@
           <w:sz w:val="22"/>
           <w:szCs w:val="22"/>
         </w:rPr>
-        <w:t xml:space="preserve">Un único conjunto de datos, anonimizado, de un solo periodo y una sola región geográfica.</w:t>
+        <w:t xml:space="preserve">El conjunto principal está anonimizado, cubre un solo periodo de 48 horas y una sola región geográfica.</w:t>
+      </w:r>
+    </w:p>
+    <w:p>
+      <w:pPr>
+        <w:spacing w:after="100" w:line="360" w:lineRule="auto"/>
+        <w:ind w:left="425"/>
+      </w:pPr>
+      <w:r>
+        <w:rPr>
+          <w:rFonts w:ascii="Arial" w:cs="Arial" w:eastAsia="Arial" w:hAnsi="Arial"/>
+          <w:sz w:val="22"/>
+          <w:szCs w:val="22"/>
+        </w:rPr>
+        <w:t xml:space="preserve">• </w:t>
+      </w:r>
+      <w:r>
+        <w:rPr>
+          <w:rFonts w:ascii="Arial" w:cs="Arial" w:eastAsia="Arial" w:hAnsi="Arial"/>
+          <w:sz w:val="22"/>
+          <w:szCs w:val="22"/>
+        </w:rPr>
+        <w:t xml:space="preserve">La extensión de 5.13 sobre variables de negocio usa un dataset simulado, no transacciones reales, con un único modelo sin ajuste de hiperparámetros y sin la prueba con agentes completada. Demuestra que las contribuciones pueden ser legibles por negocio; no repite sobre ellas ninguna de las validaciones estadísticas del resto del capítulo.</w:t>
       </w:r>
     </w:p>
     <w:p>
@@ -27085,6 +28258,31 @@
           <w:szCs w:val="22"/>
         </w:rPr>
         <w:t xml:space="preserve"> Es la línea principal. En transferencias o en prevención de blanqueo de capitales existen conceptos, ordenantes, países y relaciones entre operaciones sobre los que un modelo de lenguaje puede razonar de verdad. En el conjunto empleado aquí, veintiocho componentes anonimizadas, un importe y una hora, no hay nada que interpretar más allá de lo que el detector ya ha calculado, de modo que la limitación observada podría ser del dominio y no del enfoque. Comprobarlo requeriría un conjunto de datos con esas características.</w:t>
+      </w:r>
+    </w:p>
+    <w:p>
+      <w:pPr>
+        <w:spacing w:after="160" w:line="360" w:lineRule="auto"/>
+        <w:ind w:firstLine="425"/>
+        <w:jc w:val="both"/>
+      </w:pPr>
+      <w:r>
+        <w:rPr>
+          <w:rFonts w:ascii="Arial" w:cs="Arial" w:eastAsia="Arial" w:hAnsi="Arial"/>
+          <w:b/>
+          <w:bCs/>
+          <w:sz w:val="22"/>
+          <w:szCs w:val="22"/>
+        </w:rPr>
+        <w:t xml:space="preserve">Completar la extensión a un dataset de negocio con la prueba de agentes.</w:t>
+      </w:r>
+      <w:r>
+        <w:rPr>
+          <w:rFonts w:ascii="Arial" w:cs="Arial" w:eastAsia="Arial" w:hAnsi="Arial"/>
+          <w:sz w:val="22"/>
+          <w:szCs w:val="22"/>
+        </w:rPr>
+        <w:t xml:space="preserve"> La sección 5.13 comprobó la primera mitad de esta idea sobre un dataset simulado (Sparkov) con un año de periodo: las contribuciones del detector, que en el conjunto ULB citan componentes anónimas, aquí citan comercio, categoría, distancia y edad, exactamente las variables que 4.2.1 declaraba fuera de alcance. Queda pendiente la segunda mitad, ya con el guion preparado (scripts/sparkov/investigar_caso.py): comprobar si el párrafo del Investigador aprovecha esas variables de verdad o sigue apoyándose en el importe como hace sobre el conjunto ULB (5.11), y si, con ese contexto semántico disponible, un modelo de razonamiento podría llegar a ejercer de detector y no solo de explicador de una puntuación ajena. Y, más allá de lo ya explorado, repetir el ejercicio con transacciones reales y no simuladas.</w:t>
       </w:r>
     </w:p>
     <w:p>

</xml_diff>

<commit_message>
5.14: el ajuste QLoRA reproduce identicamente los veredictos del enunciado
</commit_message>
<xml_diff>
--- a/memoria/memoria_TFG.docx
+++ b/memoria/memoria_TFG.docx
@@ -26353,6 +26353,592 @@
     </w:p>
     <w:p>
       <w:pPr>
+        <w:pStyle w:val="Heading2"/>
+        <w:spacing w:after="200" w:before="360"/>
+      </w:pPr>
+      <w:r>
+        <w:rPr>
+          <w:rFonts w:ascii="Arial" w:cs="Arial" w:eastAsia="Arial" w:hAnsi="Arial"/>
+          <w:b/>
+          <w:bCs/>
+          <w:color w:val="000000"/>
+          <w:sz w:val="26"/>
+          <w:szCs w:val="26"/>
+        </w:rPr>
+        <w:t xml:space="preserve">5.14 Ajuste fino QLoRA: ¿cambia por los pesos lo que no cambió por el enunciado?</w:t>
+      </w:r>
+    </w:p>
+    <w:p>
+      <w:pPr>
+        <w:spacing w:after="160" w:line="360" w:lineRule="auto"/>
+        <w:ind w:firstLine="425"/>
+        <w:jc w:val="both"/>
+      </w:pPr>
+      <w:r>
+        <w:rPr>
+          <w:rFonts w:ascii="Arial" w:cs="Arial" w:eastAsia="Arial" w:hAnsi="Arial"/>
+          <w:sz w:val="22"/>
+          <w:szCs w:val="22"/>
+        </w:rPr>
+        <w:t xml:space="preserve">La sección 5.12 mostró que corregir en el enunciado la premisa sobre el importe bajo no cambia la decisión, solo la prosa. Queda una vía que 5.12 no podía probar: si esa misma corrección, en lugar de pedirse en el enunciado en cada llamada, se instala en los pesos del modelo mediante un ajuste fino, ¿deja de ser un consejo que el modelo puede ignorar y pasa a ser una disposición que aplica?</w:t>
+      </w:r>
+    </w:p>
+    <w:p>
+      <w:pPr>
+        <w:pStyle w:val="Heading3"/>
+        <w:spacing w:after="200" w:before="360"/>
+      </w:pPr>
+      <w:r>
+        <w:rPr>
+          <w:rFonts w:ascii="Arial" w:cs="Arial" w:eastAsia="Arial" w:hAnsi="Arial"/>
+          <w:b/>
+          <w:bCs/>
+          <w:color w:val="000000"/>
+          <w:sz w:val="24"/>
+          <w:szCs w:val="24"/>
+        </w:rPr>
+        <w:t xml:space="preserve">Diseño</w:t>
+      </w:r>
+    </w:p>
+    <w:p>
+      <w:pPr>
+        <w:spacing w:after="160" w:line="360" w:lineRule="auto"/>
+        <w:ind w:firstLine="425"/>
+        <w:jc w:val="both"/>
+      </w:pPr>
+      <w:r>
+        <w:rPr>
+          <w:rFonts w:ascii="Arial" w:cs="Arial" w:eastAsia="Arial" w:hAnsi="Arial"/>
+          <w:sz w:val="22"/>
+          <w:szCs w:val="22"/>
+        </w:rPr>
+        <w:t xml:space="preserve">Se entrenó un adaptador LoRA de rango 16 sobre Qwen2.5-14B-Instruct en 4 bits, con 540 ejemplos construidos exclusivamente con transacciones anteriores al corte de la partición temporal —una aserción explícita comprueba en cada ejemplo que su instante es anterior al límite de entrenamiento, para que ningún caso de la evaluación pueda haberse visto durante el ajuste—. El conjunto equilibra fraude y falso positivo y sobremuestrea el fraude de importe bajo dentro de su propia clase, precisamente el patrón que el modelo no reconocía. Las respuestas objetivo se generaron por plantilla a partir de las contribuciones reales del detector, no se redactaron a mano.</w:t>
+      </w:r>
+    </w:p>
+    <w:p>
+      <w:pPr>
+        <w:spacing w:after="160" w:line="360" w:lineRule="auto"/>
+        <w:ind w:firstLine="425"/>
+        <w:jc w:val="both"/>
+      </w:pPr>
+      <w:r>
+        <w:rPr>
+          <w:rFonts w:ascii="Arial" w:cs="Arial" w:eastAsia="Arial" w:hAnsi="Arial"/>
+          <w:sz w:val="22"/>
+          <w:szCs w:val="22"/>
+        </w:rPr>
+        <w:t xml:space="preserve">Se comparan tres condiciones sobre los mismos doce casos de cola de 5.11 y 5.12, con el enunciado exacto del arnés: el modelo base, el modelo base con la corrección en el enunciado, y el modelo con el adaptador y sin corrección en el enunciado. El entrenamiento tardó 29,6 horas —muy por encima de lo esperado, por un cuello de botella de memoria compartida en una GPU de 16 GB compartida con el resto del sistema operativo— con una pérdida final de 0,086.</w:t>
+      </w:r>
+    </w:p>
+    <w:p>
+      <w:pPr>
+        <w:pStyle w:val="Heading3"/>
+        <w:spacing w:after="200" w:before="360"/>
+      </w:pPr>
+      <w:r>
+        <w:rPr>
+          <w:rFonts w:ascii="Arial" w:cs="Arial" w:eastAsia="Arial" w:hAnsi="Arial"/>
+          <w:b/>
+          <w:bCs/>
+          <w:color w:val="000000"/>
+          <w:sz w:val="24"/>
+          <w:szCs w:val="24"/>
+        </w:rPr>
+        <w:t xml:space="preserve">Resultado</w:t>
+      </w:r>
+    </w:p>
+    <w:tbl>
+      <w:tblPr>
+        <w:tblW w:type="dxa" w:w="9000"/>
+        <w:tblBorders>
+          <w:top w:val="single" w:color="auto" w:sz="4"/>
+          <w:left w:val="single" w:color="auto" w:sz="4"/>
+          <w:bottom w:val="single" w:color="auto" w:sz="4"/>
+          <w:right w:val="single" w:color="auto" w:sz="4"/>
+          <w:insideH w:val="single" w:color="auto" w:sz="4"/>
+          <w:insideV w:val="single" w:color="auto" w:sz="4"/>
+        </w:tblBorders>
+      </w:tblPr>
+      <w:tblGrid>
+        <w:gridCol w:w="2250"/>
+        <w:gridCol w:w="2250"/>
+        <w:gridCol w:w="2250"/>
+        <w:gridCol w:w="2250"/>
+      </w:tblGrid>
+      <w:tr>
+        <w:tc>
+          <w:tcPr>
+            <w:tcW w:type="dxa" w:w="2250"/>
+            <w:shd w:fill="D9D9D9" w:val="clear"/>
+          </w:tcPr>
+          <w:p>
+            <w:pPr>
+              <w:spacing w:after="0"/>
+            </w:pPr>
+            <w:r>
+              <w:rPr>
+                <w:rFonts w:ascii="Arial" w:cs="Arial" w:eastAsia="Arial" w:hAnsi="Arial"/>
+                <w:b/>
+                <w:bCs/>
+                <w:sz w:val="20"/>
+                <w:szCs w:val="20"/>
+              </w:rPr>
+              <w:t xml:space="preserve">Condición</w:t>
+            </w:r>
+          </w:p>
+        </w:tc>
+        <w:tc>
+          <w:tcPr>
+            <w:tcW w:type="dxa" w:w="2250"/>
+            <w:shd w:fill="D9D9D9" w:val="clear"/>
+          </w:tcPr>
+          <w:p>
+            <w:pPr>
+              <w:spacing w:after="0"/>
+            </w:pPr>
+            <w:r>
+              <w:rPr>
+                <w:rFonts w:ascii="Arial" w:cs="Arial" w:eastAsia="Arial" w:hAnsi="Arial"/>
+                <w:b/>
+                <w:bCs/>
+                <w:sz w:val="20"/>
+                <w:szCs w:val="20"/>
+              </w:rPr>
+              <w:t xml:space="preserve">Confirma</w:t>
+            </w:r>
+          </w:p>
+        </w:tc>
+        <w:tc>
+          <w:tcPr>
+            <w:tcW w:type="dxa" w:w="2250"/>
+            <w:shd w:fill="D9D9D9" w:val="clear"/>
+          </w:tcPr>
+          <w:p>
+            <w:pPr>
+              <w:spacing w:after="0"/>
+            </w:pPr>
+            <w:r>
+              <w:rPr>
+                <w:rFonts w:ascii="Arial" w:cs="Arial" w:eastAsia="Arial" w:hAnsi="Arial"/>
+                <w:b/>
+                <w:bCs/>
+                <w:sz w:val="20"/>
+                <w:szCs w:val="20"/>
+              </w:rPr>
+              <w:t xml:space="preserve">Fraude destruido</w:t>
+            </w:r>
+          </w:p>
+        </w:tc>
+        <w:tc>
+          <w:tcPr>
+            <w:tcW w:type="dxa" w:w="2250"/>
+            <w:shd w:fill="D9D9D9" w:val="clear"/>
+          </w:tcPr>
+          <w:p>
+            <w:pPr>
+              <w:spacing w:after="0"/>
+            </w:pPr>
+            <w:r>
+              <w:rPr>
+                <w:rFonts w:ascii="Arial" w:cs="Arial" w:eastAsia="Arial" w:hAnsi="Arial"/>
+                <w:b/>
+                <w:bCs/>
+                <w:sz w:val="20"/>
+                <w:szCs w:val="20"/>
+              </w:rPr>
+              <w:t xml:space="preserve">Casos confirmados</w:t>
+            </w:r>
+          </w:p>
+        </w:tc>
+      </w:tr>
+      <w:tr>
+        <w:tc>
+          <w:tcPr>
+            <w:tcW w:type="dxa" w:w="2250"/>
+          </w:tcPr>
+          <w:p>
+            <w:pPr>
+              <w:spacing w:after="0"/>
+            </w:pPr>
+            <w:r>
+              <w:rPr>
+                <w:rFonts w:ascii="Arial" w:cs="Arial" w:eastAsia="Arial" w:hAnsi="Arial"/>
+                <w:b w:val="false"/>
+                <w:bCs w:val="false"/>
+                <w:sz w:val="20"/>
+                <w:szCs w:val="20"/>
+              </w:rPr>
+              <w:t xml:space="preserve">base</w:t>
+            </w:r>
+          </w:p>
+        </w:tc>
+        <w:tc>
+          <w:tcPr>
+            <w:tcW w:type="dxa" w:w="2250"/>
+          </w:tcPr>
+          <w:p>
+            <w:pPr>
+              <w:spacing w:after="0"/>
+            </w:pPr>
+            <w:r>
+              <w:rPr>
+                <w:rFonts w:ascii="Arial" w:cs="Arial" w:eastAsia="Arial" w:hAnsi="Arial"/>
+                <w:b w:val="false"/>
+                <w:bCs w:val="false"/>
+                <w:sz w:val="20"/>
+                <w:szCs w:val="20"/>
+              </w:rPr>
+              <w:t xml:space="preserve">0 de 12</w:t>
+            </w:r>
+          </w:p>
+        </w:tc>
+        <w:tc>
+          <w:tcPr>
+            <w:tcW w:type="dxa" w:w="2250"/>
+          </w:tcPr>
+          <w:p>
+            <w:pPr>
+              <w:spacing w:after="0"/>
+            </w:pPr>
+            <w:r>
+              <w:rPr>
+                <w:rFonts w:ascii="Arial" w:cs="Arial" w:eastAsia="Arial" w:hAnsi="Arial"/>
+                <w:b w:val="false"/>
+                <w:bCs w:val="false"/>
+                <w:sz w:val="20"/>
+                <w:szCs w:val="20"/>
+              </w:rPr>
+              <w:t xml:space="preserve">2 (50 y 55)</w:t>
+            </w:r>
+          </w:p>
+        </w:tc>
+        <w:tc>
+          <w:tcPr>
+            <w:tcW w:type="dxa" w:w="2250"/>
+          </w:tcPr>
+          <w:p>
+            <w:pPr>
+              <w:spacing w:after="0"/>
+            </w:pPr>
+            <w:r>
+              <w:rPr>
+                <w:rFonts w:ascii="Arial" w:cs="Arial" w:eastAsia="Arial" w:hAnsi="Arial"/>
+                <w:b w:val="false"/>
+                <w:bCs w:val="false"/>
+                <w:sz w:val="20"/>
+                <w:szCs w:val="20"/>
+              </w:rPr>
+              <w:t xml:space="preserve">ninguno</w:t>
+            </w:r>
+          </w:p>
+        </w:tc>
+      </w:tr>
+      <w:tr>
+        <w:tc>
+          <w:tcPr>
+            <w:tcW w:type="dxa" w:w="2250"/>
+          </w:tcPr>
+          <w:p>
+            <w:pPr>
+              <w:spacing w:after="0"/>
+            </w:pPr>
+            <w:r>
+              <w:rPr>
+                <w:rFonts w:ascii="Arial" w:cs="Arial" w:eastAsia="Arial" w:hAnsi="Arial"/>
+                <w:b w:val="false"/>
+                <w:bCs w:val="false"/>
+                <w:sz w:val="20"/>
+                <w:szCs w:val="20"/>
+              </w:rPr>
+              <w:t xml:space="preserve">base + dominio</w:t>
+            </w:r>
+          </w:p>
+        </w:tc>
+        <w:tc>
+          <w:tcPr>
+            <w:tcW w:type="dxa" w:w="2250"/>
+          </w:tcPr>
+          <w:p>
+            <w:pPr>
+              <w:spacing w:after="0"/>
+            </w:pPr>
+            <w:r>
+              <w:rPr>
+                <w:rFonts w:ascii="Arial" w:cs="Arial" w:eastAsia="Arial" w:hAnsi="Arial"/>
+                <w:b w:val="false"/>
+                <w:bCs w:val="false"/>
+                <w:sz w:val="20"/>
+                <w:szCs w:val="20"/>
+              </w:rPr>
+              <w:t xml:space="preserve">1 de 12</w:t>
+            </w:r>
+          </w:p>
+        </w:tc>
+        <w:tc>
+          <w:tcPr>
+            <w:tcW w:type="dxa" w:w="2250"/>
+          </w:tcPr>
+          <w:p>
+            <w:pPr>
+              <w:spacing w:after="0"/>
+            </w:pPr>
+            <w:r>
+              <w:rPr>
+                <w:rFonts w:ascii="Arial" w:cs="Arial" w:eastAsia="Arial" w:hAnsi="Arial"/>
+                <w:b w:val="false"/>
+                <w:bCs w:val="false"/>
+                <w:sz w:val="20"/>
+                <w:szCs w:val="20"/>
+              </w:rPr>
+              <w:t xml:space="preserve">2 (50 y 55)</w:t>
+            </w:r>
+          </w:p>
+        </w:tc>
+        <w:tc>
+          <w:tcPr>
+            <w:tcW w:type="dxa" w:w="2250"/>
+          </w:tcPr>
+          <w:p>
+            <w:pPr>
+              <w:spacing w:after="0"/>
+            </w:pPr>
+            <w:r>
+              <w:rPr>
+                <w:rFonts w:ascii="Arial" w:cs="Arial" w:eastAsia="Arial" w:hAnsi="Arial"/>
+                <w:b w:val="false"/>
+                <w:bCs w:val="false"/>
+                <w:sz w:val="20"/>
+                <w:szCs w:val="20"/>
+              </w:rPr>
+              <w:t xml:space="preserve">44</w:t>
+            </w:r>
+          </w:p>
+        </w:tc>
+      </w:tr>
+      <w:tr>
+        <w:tc>
+          <w:tcPr>
+            <w:tcW w:type="dxa" w:w="2250"/>
+          </w:tcPr>
+          <w:p>
+            <w:pPr>
+              <w:spacing w:after="0"/>
+            </w:pPr>
+            <w:r>
+              <w:rPr>
+                <w:rFonts w:ascii="Arial" w:cs="Arial" w:eastAsia="Arial" w:hAnsi="Arial"/>
+                <w:b w:val="false"/>
+                <w:bCs w:val="false"/>
+                <w:sz w:val="20"/>
+                <w:szCs w:val="20"/>
+              </w:rPr>
+              <w:t xml:space="preserve">adaptado</w:t>
+            </w:r>
+          </w:p>
+        </w:tc>
+        <w:tc>
+          <w:tcPr>
+            <w:tcW w:type="dxa" w:w="2250"/>
+          </w:tcPr>
+          <w:p>
+            <w:pPr>
+              <w:spacing w:after="0"/>
+            </w:pPr>
+            <w:r>
+              <w:rPr>
+                <w:rFonts w:ascii="Arial" w:cs="Arial" w:eastAsia="Arial" w:hAnsi="Arial"/>
+                <w:b w:val="false"/>
+                <w:bCs w:val="false"/>
+                <w:sz w:val="20"/>
+                <w:szCs w:val="20"/>
+              </w:rPr>
+              <w:t xml:space="preserve">1 de 12</w:t>
+            </w:r>
+          </w:p>
+        </w:tc>
+        <w:tc>
+          <w:tcPr>
+            <w:tcW w:type="dxa" w:w="2250"/>
+          </w:tcPr>
+          <w:p>
+            <w:pPr>
+              <w:spacing w:after="0"/>
+            </w:pPr>
+            <w:r>
+              <w:rPr>
+                <w:rFonts w:ascii="Arial" w:cs="Arial" w:eastAsia="Arial" w:hAnsi="Arial"/>
+                <w:b w:val="false"/>
+                <w:bCs w:val="false"/>
+                <w:sz w:val="20"/>
+                <w:szCs w:val="20"/>
+              </w:rPr>
+              <w:t xml:space="preserve">2 (50 y 55)</w:t>
+            </w:r>
+          </w:p>
+        </w:tc>
+        <w:tc>
+          <w:tcPr>
+            <w:tcW w:type="dxa" w:w="2250"/>
+          </w:tcPr>
+          <w:p>
+            <w:pPr>
+              <w:spacing w:after="0"/>
+            </w:pPr>
+            <w:r>
+              <w:rPr>
+                <w:rFonts w:ascii="Arial" w:cs="Arial" w:eastAsia="Arial" w:hAnsi="Arial"/>
+                <w:b w:val="false"/>
+                <w:bCs w:val="false"/>
+                <w:sz w:val="20"/>
+                <w:szCs w:val="20"/>
+              </w:rPr>
+              <w:t xml:space="preserve">44</w:t>
+            </w:r>
+          </w:p>
+        </w:tc>
+      </w:tr>
+    </w:tbl>
+    <w:p>
+      <w:pPr>
+        <w:spacing w:after="160"/>
+      </w:pPr>
+    </w:p>
+    <w:p>
+      <w:pPr>
+        <w:spacing w:after="160" w:line="360" w:lineRule="auto"/>
+        <w:ind w:firstLine="425"/>
+        <w:jc w:val="both"/>
+      </w:pPr>
+      <w:r>
+        <w:rPr>
+          <w:rFonts w:ascii="Arial" w:cs="Arial" w:eastAsia="Arial" w:hAnsi="Arial"/>
+          <w:b/>
+          <w:bCs/>
+          <w:sz w:val="22"/>
+          <w:szCs w:val="22"/>
+        </w:rPr>
+        <w:t xml:space="preserve">Los veredictos de "adaptado" son idénticos a los de "base + dominio", caso por caso, en los doce.</w:t>
+      </w:r>
+      <w:r>
+        <w:rPr>
+          <w:rFonts w:ascii="Arial" w:cs="Arial" w:eastAsia="Arial" w:hAnsi="Arial"/>
+          <w:sz w:val="22"/>
+          <w:szCs w:val="22"/>
+        </w:rPr>
+        <w:t xml:space="preserve"> El adaptador no salva los fraudes 50 y 55, que siguen descartados, y confirma el mismo caso de control, el 44, que no es fraude. Instalar la corrección en los pesos no logró lo que instalarla en el enunciado tampoco logró.</w:t>
+      </w:r>
+    </w:p>
+    <w:p>
+      <w:pPr>
+        <w:spacing w:after="160" w:line="360" w:lineRule="auto"/>
+        <w:ind w:firstLine="425"/>
+        <w:jc w:val="both"/>
+      </w:pPr>
+      <w:r>
+        <w:rPr>
+          <w:rFonts w:ascii="Arial" w:cs="Arial" w:eastAsia="Arial" w:hAnsi="Arial"/>
+          <w:sz w:val="22"/>
+          <w:szCs w:val="22"/>
+        </w:rPr>
+        <w:t xml:space="preserve">Lo que sí cambia por completo es la prosa. Frente al párrafo largo y con matices de las otras dos condiciones, el modelo adaptado responde con una estructura fija y telegráfica: cita la probabilidad exacta del expediente, dos variables a favor de la sospecha y dos en contra con sus valores, y cierra con una frase de conclusión. Sobre el caso 55 escribe: "el detector eleva el CASO 55 con probabilidad 0,0673 y un importe de 2,22 EUR. Empujan hacia fraude V14 (+3,004) y V4 (+2,180). En sentido contrario, V1 (-2,603) y V7 (-1,660). El conjunto de aportes no sostiene la sospecha: el patrón es compatible con una operación legítima."</w:t>
+      </w:r>
+    </w:p>
+    <w:p>
+      <w:pPr>
+        <w:spacing w:after="160" w:line="360" w:lineRule="auto"/>
+        <w:ind w:firstLine="425"/>
+        <w:jc w:val="both"/>
+      </w:pPr>
+      <w:r>
+        <w:rPr>
+          <w:rFonts w:ascii="Arial" w:cs="Arial" w:eastAsia="Arial" w:hAnsi="Arial"/>
+          <w:sz w:val="22"/>
+          <w:szCs w:val="22"/>
+        </w:rPr>
+        <w:t xml:space="preserve">Y sobre el caso 44, el único que confirma, escribe: "el importe reducido no es un atenuante: el cargo mínimo de prueba es un patrón habitual de fraude, y las contribuciones dominantes lo respaldan."</w:t>
+      </w:r>
+    </w:p>
+    <w:p>
+      <w:pPr>
+        <w:spacing w:after="160" w:line="360" w:lineRule="auto"/>
+        <w:ind w:firstLine="425"/>
+        <w:jc w:val="both"/>
+      </w:pPr>
+      <w:r>
+        <w:rPr>
+          <w:rFonts w:ascii="Arial" w:cs="Arial" w:eastAsia="Arial" w:hAnsi="Arial"/>
+          <w:sz w:val="22"/>
+          <w:szCs w:val="22"/>
+        </w:rPr>
+        <w:t xml:space="preserve">La cifra que cita —0,0673 en el caso 55, 0,1286 en el 50, 0,6081 en el 44— es la probabilidad que el propio expediente le entrega, y coincide en todos los casos con el sentido del veredicto: probabilidad baja, descarta; probabilidad más alta, confirma. Es la misma dependencia de la puntuación del detector que 5.7 y 5.8 documentaron sin ajuste fino de por medio: el modelo no aprendió a razonar distinto sobre el importe, aprendió una plantilla que resume fielmente las contribuciones y decide según la puntuación que ya traía el expediente. El entrenamiento con respuestas objetivo generadas por plantilla es la explicación más probable de por qué el estilo se volvió tan uniforme.</w:t>
+      </w:r>
+    </w:p>
+    <w:p>
+      <w:pPr>
+        <w:pStyle w:val="Heading3"/>
+        <w:spacing w:after="200" w:before="360"/>
+      </w:pPr>
+      <w:r>
+        <w:rPr>
+          <w:rFonts w:ascii="Arial" w:cs="Arial" w:eastAsia="Arial" w:hAnsi="Arial"/>
+          <w:b/>
+          <w:bCs/>
+          <w:color w:val="000000"/>
+          <w:sz w:val="24"/>
+          <w:szCs w:val="24"/>
+        </w:rPr>
+        <w:t xml:space="preserve">Lectura</w:t>
+      </w:r>
+    </w:p>
+    <w:p>
+      <w:pPr>
+        <w:spacing w:after="160" w:line="360" w:lineRule="auto"/>
+        <w:ind w:firstLine="425"/>
+        <w:jc w:val="both"/>
+      </w:pPr>
+      <w:r>
+        <w:rPr>
+          <w:rFonts w:ascii="Arial" w:cs="Arial" w:eastAsia="Arial" w:hAnsi="Arial"/>
+          <w:sz w:val="22"/>
+          <w:szCs w:val="22"/>
+        </w:rPr>
+        <w:t xml:space="preserve">Se comprobó lo que 6.4 dejaba como pregunta abierta: la disociación entre explicación y decisión no depende de que la corrección llegue por el enunciado o por los pesos. En ambos casos el modelo dispone de la misma evidencia —las contribuciones por variable— y en ambos casos decide con el mismo criterio, que no es el importe sino la puntuación previa del detector. Cambiar el canal de la corrección cambió el estilo de la respuesta y no cambió ni un solo veredicto.</w:t>
+      </w:r>
+    </w:p>
+    <w:p>
+      <w:pPr>
+        <w:pStyle w:val="Heading3"/>
+        <w:spacing w:after="200" w:before="360"/>
+      </w:pPr>
+      <w:r>
+        <w:rPr>
+          <w:rFonts w:ascii="Arial" w:cs="Arial" w:eastAsia="Arial" w:hAnsi="Arial"/>
+          <w:b/>
+          <w:bCs/>
+          <w:color w:val="000000"/>
+          <w:sz w:val="24"/>
+          <w:szCs w:val="24"/>
+        </w:rPr>
+        <w:t xml:space="preserve">Alcance</w:t>
+      </w:r>
+    </w:p>
+    <w:p>
+      <w:pPr>
+        <w:spacing w:after="160" w:line="360" w:lineRule="auto"/>
+        <w:ind w:firstLine="425"/>
+        <w:jc w:val="both"/>
+      </w:pPr>
+      <w:r>
+        <w:rPr>
+          <w:rFonts w:ascii="Arial" w:cs="Arial" w:eastAsia="Arial" w:hAnsi="Arial"/>
+          <w:sz w:val="22"/>
+          <w:szCs w:val="22"/>
+        </w:rPr>
+        <w:t xml:space="preserve">Doce casos y un adaptador entrenado una vez: no hay contraste estadístico posible, igual que en 5.11. El conjunto de ajuste usa respuestas objetivo plantilladas, lo que probablemente explica la uniformidad de la prosa resultante más que cualquier propiedad del ajuste fino en sí; un conjunto con respuestas más variadas podría comportarse distinto y queda como trabajo futuro. No se ha medido si el adaptador generaliza a casos de fraude de importe bajo fuera de los que motivaron su diseño.</w:t>
+      </w:r>
+    </w:p>
+    <w:p>
+      <w:pPr>
         <w:pStyle w:val="Heading1"/>
         <w:pageBreakBefore/>
         <w:spacing w:after="200" w:before="360"/>
@@ -27703,6 +28289,39 @@
     </w:p>
     <w:p>
       <w:pPr>
+        <w:spacing w:after="160" w:line="360" w:lineRule="auto"/>
+        <w:ind w:firstLine="425"/>
+        <w:jc w:val="both"/>
+      </w:pPr>
+      <w:r>
+        <w:rPr>
+          <w:rFonts w:ascii="Arial" w:cs="Arial" w:eastAsia="Arial" w:hAnsi="Arial"/>
+          <w:sz w:val="22"/>
+          <w:szCs w:val="22"/>
+        </w:rPr>
+        <w:t xml:space="preserve">Cabía preguntarse si el problema era el canal: quizá una corrección repetida en cada llamada, que el modelo puede en principio ignorar, se comporta distinto de una corrección instalada de forma permanente en los pesos. La sección 5.14 responde que no. Un adaptador LoRA entrenado sobre el propio dominio, con ejemplos que sí distinguen fraude de importe bajo de falso positivo de importe bajo, produce sobre los mismos doce casos de cola </w:t>
+      </w:r>
+      <w:r>
+        <w:rPr>
+          <w:rFonts w:ascii="Arial" w:cs="Arial" w:eastAsia="Arial" w:hAnsi="Arial"/>
+          <w:b/>
+          <w:bCs/>
+          <w:sz w:val="22"/>
+          <w:szCs w:val="22"/>
+        </w:rPr>
+        <w:t xml:space="preserve">veredictos idénticos, uno por uno, a los de la corrección en el enunciado</w:t>
+      </w:r>
+      <w:r>
+        <w:rPr>
+          <w:rFonts w:ascii="Arial" w:cs="Arial" w:eastAsia="Arial" w:hAnsi="Arial"/>
+          <w:sz w:val="22"/>
+          <w:szCs w:val="22"/>
+        </w:rPr>
+        <w:t xml:space="preserve">. Cambia la forma —una prosa telegráfica que cita las contribuciones con sus valores exactos— y no cambia la decisión. La causa más probable, discutida en 5.14, es que el modelo aprendió a resumir fielmente el expediente y a decidir según la puntuación que este ya traía, no a ponderar el importe de otra manera: el mismo mecanismo que describe 6.2.3, ahora instalado en los pesos en vez de sugerido en el prompt.</w:t>
+      </w:r>
+    </w:p>
+    <w:p>
+      <w:pPr>
         <w:pStyle w:val="Heading3"/>
         <w:spacing w:after="200" w:before="360"/>
       </w:pPr>
@@ -28215,6 +28834,28 @@
           <w:sz w:val="22"/>
           <w:szCs w:val="22"/>
         </w:rPr>
+        <w:t xml:space="preserve">El ajuste QLoRA de 5.14 se evaluó sobre los mismos doce casos de cola que 5.11 y 5.12, con un solo adaptador entrenado una vez. Las respuestas objetivo del entrenamiento se generaron por plantilla, lo que probablemente influye en la uniformidad de la prosa resultante; no se ha probado un conjunto de entrenamiento con respuestas más variadas.</w:t>
+      </w:r>
+    </w:p>
+    <w:p>
+      <w:pPr>
+        <w:spacing w:after="100" w:line="360" w:lineRule="auto"/>
+        <w:ind w:left="425"/>
+      </w:pPr>
+      <w:r>
+        <w:rPr>
+          <w:rFonts w:ascii="Arial" w:cs="Arial" w:eastAsia="Arial" w:hAnsi="Arial"/>
+          <w:sz w:val="22"/>
+          <w:szCs w:val="22"/>
+        </w:rPr>
+        <w:t xml:space="preserve">• </w:t>
+      </w:r>
+      <w:r>
+        <w:rPr>
+          <w:rFonts w:ascii="Arial" w:cs="Arial" w:eastAsia="Arial" w:hAnsi="Arial"/>
+          <w:sz w:val="22"/>
+          <w:szCs w:val="22"/>
+        </w:rPr>
         <w:t xml:space="preserve">El valor explicativo de la capa de agentes para un analista humano no se ha medido: haría falta un estudio con usuarios.</w:t>
       </w:r>
     </w:p>
@@ -28299,15 +28940,15 @@
           <w:sz w:val="22"/>
           <w:szCs w:val="22"/>
         </w:rPr>
-        <w:t xml:space="preserve">Ajuste fino sobre casos etiquetados.</w:t>
-      </w:r>
-      <w:r>
-        <w:rPr>
-          <w:rFonts w:ascii="Arial" w:cs="Arial" w:eastAsia="Arial" w:hAnsi="Arial"/>
-          <w:sz w:val="22"/>
-          <w:szCs w:val="22"/>
-        </w:rPr>
-        <w:t xml:space="preserve"> Dado que corregir la premisa en el enunciado no altera la decisión, la vía razonable para modificarla sería un ajuste de bajo rango sobre ejemplos del propio dominio, que sustituiría la creencia general del modelo por la distribución real de estos datos. Es también la forma de comprobar si la disociación descrita en 6.2.2 persiste cuando la información llega por los pesos y no por el enunciado.</w:t>
+        <w:t xml:space="preserve">Ajuste fino sobre casos etiquetados, con un conjunto de entrenamiento más variado.</w:t>
+      </w:r>
+      <w:r>
+        <w:rPr>
+          <w:rFonts w:ascii="Arial" w:cs="Arial" w:eastAsia="Arial" w:hAnsi="Arial"/>
+          <w:sz w:val="22"/>
+          <w:szCs w:val="22"/>
+        </w:rPr>
+        <w:t xml:space="preserve"> Se realizó (5.14): un adaptador LoRA sobre el propio dominio, entrenado solo con casos anteriores al corte de prueba. El resultado fue negativo en el sentido relevante y positivo en el metodológico. Los veredictos sobre los doce casos de cola son idénticos a los de corregir la premisa en el enunciado, caso por caso: la disociación entre explicación y decisión persiste cuando la información llega por los pesos, no solo por el enunciado. Lo que queda abierto es si ese resultado depende de que las respuestas objetivo del entrenamiento se generaran por plantilla, lo que pudo enseñar al modelo a resumir el expediente en vez de a decidir distinto sobre él. Repetirlo con un conjunto de respuestas más variadas, redactadas o revisadas por un humano, separaría esas dos explicaciones.</w:t>
       </w:r>
     </w:p>
     <w:p>

</xml_diff>

<commit_message>
5.13: cierra la prueba con el Investigador sobre el dataset Sparkov
</commit_message>
<xml_diff>
--- a/memoria/memoria_TFG.docx
+++ b/memoria/memoria_TFG.docx
@@ -26306,17 +26306,46 @@
     <w:p>
       <w:pPr>
         <w:spacing w:after="160" w:line="360" w:lineRule="auto"/>
-      </w:pPr>
-      <w:r>
-        <w:rPr>
-          <w:rFonts w:ascii="Arial" w:cs="Arial" w:eastAsia="Arial" w:hAnsi="Arial"/>
-          <w:i/>
-          <w:iCs/>
-          <w:color w:val="808080"/>
-          <w:sz w:val="22"/>
-          <w:szCs w:val="22"/>
-        </w:rPr>
-        <w:t xml:space="preserve">[PENDIENTE] Ejecución de scripts/sparkov/investigar_caso.py sobre los cinco casos de fraude de mayor puntuación, con el mismo backend Ollama que el resto del trabajo. Pendiente de lanzarse porque requiere la GPU local, ocupada en el momento de escribir esto con el ajuste QLoRA del capítulo 6.4. La pregunta que responde: con variables de negocio disponibles, ¿el párrafo del Investigador las usa de verdad, o sigue limitándose al importe como en el caso 55 de 5.11? Al completarse, esta sección debe sustituirse por los veredictos obtenidos y los fragmentos de prosa más informativos.</w:t>
+        <w:ind w:firstLine="425"/>
+        <w:jc w:val="both"/>
+      </w:pPr>
+      <w:r>
+        <w:rPr>
+          <w:rFonts w:ascii="Arial" w:cs="Arial" w:eastAsia="Arial" w:hAnsi="Arial"/>
+          <w:sz w:val="22"/>
+          <w:szCs w:val="22"/>
+        </w:rPr>
+        <w:t xml:space="preserve">Se ejecutó qwen2.5-14b, el mismo modelo de 5.11 y 5.12, sobre los cinco casos de fraude de mayor puntuación, con el prompt exacto del arnés adaptado al expediente de negocio. Los cinco se confirman correctamente.</w:t>
+      </w:r>
+    </w:p>
+    <w:p>
+      <w:pPr>
+        <w:spacing w:after="160" w:line="360" w:lineRule="auto"/>
+        <w:ind w:firstLine="425"/>
+        <w:jc w:val="both"/>
+      </w:pPr>
+      <w:r>
+        <w:rPr>
+          <w:rFonts w:ascii="Arial" w:cs="Arial" w:eastAsia="Arial" w:hAnsi="Arial"/>
+          <w:sz w:val="22"/>
+          <w:szCs w:val="22"/>
+        </w:rPr>
+        <w:t xml:space="preserve">Lo relevante no es el veredicto —con probabilidad 1,0000 en los cinco, confirmarlos no exige discriminar nada difícil— sino la prosa. Sobre el caso de Medhurst, Cartwright and Ebert, un cargo de 902,19 USD en la categoría de cuidado personal, el modelo escribe que el importe es alto para ese tipo de establecimiento, que la operación ocurre a las 22:00 h, y que el titular, de 85 años, vive a 120,7 km del comercio, lo que "dificulta la verosimilitud de la transacción". Sobre el caso de Mosciski Group, un cargo de viaje de 866,48 USD, sopesa explícitamente la distancia y la baja población de la ciudad del titular como atenuantes frente al importe y la categoría, y concluye que estos últimos "superan estas posibles anomalías geográficas".</w:t>
+      </w:r>
+    </w:p>
+    <w:p>
+      <w:pPr>
+        <w:spacing w:after="160" w:line="360" w:lineRule="auto"/>
+        <w:ind w:firstLine="425"/>
+        <w:jc w:val="both"/>
+      </w:pPr>
+      <w:r>
+        <w:rPr>
+          <w:rFonts w:ascii="Arial" w:cs="Arial" w:eastAsia="Arial" w:hAnsi="Arial"/>
+          <w:sz w:val="22"/>
+          <w:szCs w:val="22"/>
+        </w:rPr>
+        <w:t xml:space="preserve">Es exactamente el tipo de razonamiento que 4.2.1 declaraba imposible sobre el conjunto ULB: aquí el modelo no se limita a citar una componente anónima como atípica, sino que combina categoría de comercio, edad del titular, distancia y hora en una explicación que un analista podría aceptar o rebatir con su propio criterio.</w:t>
       </w:r>
     </w:p>
     <w:p>
@@ -26348,7 +26377,22 @@
           <w:sz w:val="22"/>
           <w:szCs w:val="22"/>
         </w:rPr>
-        <w:t xml:space="preserve">Un solo modelo, sin hiperparámetros ajustados, sobre datos simulados y con una sola semilla de generación. No permite ninguna de las afirmaciones de significación estadística del resto del capítulo. Lo que sí permite, y es lo que se buscaba, es comprobar que la limitación de 4.2.1 —las explicaciones no pueden ser de negocio porque el dato no lo es— es del dataset y no del sistema: con otro dataset, las mismas herramientas producen expedientes legibles por un humano sin cambiar una sola línea de la capa 2.</w:t>
+        <w:t xml:space="preserve">Un solo modelo, sin hiperparámetros ajustados, sobre datos simulados y con una sola semilla de generación. No permite ninguna de las afirmaciones de significación estadística del resto del capítulo. Los cinco casos probados con el Investigador son además los de mayor probabilidad, no los de cola: comprueban que la prosa usa variables de negocio cuando la evidencia es clara, no si eso corrige el sesgo del importe bajo sobre casos ambiguos, que es la pregunta que 5.12 y 5.14 responden sobre el conjunto ULB. Repetir esa prueba concreta sobre la cola de este dataset queda como trabajo futuro.</w:t>
+      </w:r>
+    </w:p>
+    <w:p>
+      <w:pPr>
+        <w:spacing w:after="160" w:line="360" w:lineRule="auto"/>
+        <w:ind w:firstLine="425"/>
+        <w:jc w:val="both"/>
+      </w:pPr>
+      <w:r>
+        <w:rPr>
+          <w:rFonts w:ascii="Arial" w:cs="Arial" w:eastAsia="Arial" w:hAnsi="Arial"/>
+          <w:sz w:val="22"/>
+          <w:szCs w:val="22"/>
+        </w:rPr>
+        <w:t xml:space="preserve">Lo que sí permite, y es lo que se buscaba, es comprobar que la limitación de 4.2.1 —las explicaciones no pueden ser de negocio porque el dato no lo es— es del dataset y no del sistema: con otro dataset, las mismas herramientas producen expedientes legibles por un humano y explicaciones que los aprovechan, sin cambiar una sola línea de la capa 2.</w:t>
       </w:r>
     </w:p>
     <w:p>
@@ -28812,7 +28856,7 @@
           <w:sz w:val="22"/>
           <w:szCs w:val="22"/>
         </w:rPr>
-        <w:t xml:space="preserve">La extensión de 5.13 sobre variables de negocio usa un dataset simulado, no transacciones reales, con un único modelo sin ajuste de hiperparámetros y sin la prueba con agentes completada. Demuestra que las contribuciones pueden ser legibles por negocio; no repite sobre ellas ninguna de las validaciones estadísticas del resto del capítulo.</w:t>
+        <w:t xml:space="preserve">La extensión de 5.13 sobre variables de negocio usa un dataset simulado, no transacciones reales, con un único modelo sin ajuste de hiperparámetros. La prueba con el Investigador se hizo sobre los cinco casos de mayor probabilidad, no sobre casos de cola ambiguos como los de 5.12 y 5.14. Demuestra que las contribuciones y la prosa pueden ser legibles por negocio; no repite sobre ellas ninguna de las validaciones estadísticas del resto del capítulo, ni comprueba si eso corrige el sesgo del importe bajo en casos difíciles.</w:t>
       </w:r>
     </w:p>
     <w:p>
@@ -28915,15 +28959,15 @@
           <w:sz w:val="22"/>
           <w:szCs w:val="22"/>
         </w:rPr>
-        <w:t xml:space="preserve">Completar la extensión a un dataset de negocio con la prueba de agentes.</w:t>
-      </w:r>
-      <w:r>
-        <w:rPr>
-          <w:rFonts w:ascii="Arial" w:cs="Arial" w:eastAsia="Arial" w:hAnsi="Arial"/>
-          <w:sz w:val="22"/>
-          <w:szCs w:val="22"/>
-        </w:rPr>
-        <w:t xml:space="preserve"> La sección 5.13 comprobó la primera mitad de esta idea sobre un dataset simulado (Sparkov) con un año de periodo: las contribuciones del detector, que en el conjunto ULB citan componentes anónimas, aquí citan comercio, categoría, distancia y edad, exactamente las variables que 4.2.1 declaraba fuera de alcance. Queda pendiente la segunda mitad, ya con el guion preparado (scripts/sparkov/investigar_caso.py): comprobar si el párrafo del Investigador aprovecha esas variables de verdad o sigue apoyándose en el importe como hace sobre el conjunto ULB (5.11), y si, con ese contexto semántico disponible, un modelo de razonamiento podría llegar a ejercer de detector y no solo de explicador de una puntuación ajena. Y, más allá de lo ya explorado, repetir el ejercicio con transacciones reales y no simuladas.</w:t>
+        <w:t xml:space="preserve">Repetir la prueba de agentes de la extensión de negocio sobre casos de cola, y con datos reales.</w:t>
+      </w:r>
+      <w:r>
+        <w:rPr>
+          <w:rFonts w:ascii="Arial" w:cs="Arial" w:eastAsia="Arial" w:hAnsi="Arial"/>
+          <w:sz w:val="22"/>
+          <w:szCs w:val="22"/>
+        </w:rPr>
+        <w:t xml:space="preserve"> La sección 5.13 comprobó, sobre un dataset simulado (Sparkov) con un año de periodo, que tanto las contribuciones del detector como la prosa del Investigador pasan a citar comercio, categoría, distancia y edad en vez de componentes anónimas, exactamente las variables que 4.2.1 declaraba fuera de alcance sobre el conjunto ULB. La prueba se hizo sobre los cinco casos de mayor probabilidad, no sobre la cola: queda por comprobar si esas mismas variables de negocio bastan para corregir el sesgo del importe bajo en los casos ambiguos, que es donde 5.12 y 5.14 documentan que el enunciado y el ajuste fino fallan por igual sobre el conjunto ULB, y si un modelo de razonamiento con ese contexto semántico podría llegar a ejercer de detector y no solo de explicador. Y, más allá de lo ya explorado, repetir el ejercicio con transacciones reales y no simuladas.</w:t>
       </w:r>
     </w:p>
     <w:p>

</xml_diff>

<commit_message>
5.13: la legibilidad de negocio no cambia el veredicto, ablacion completo/reducido
</commit_message>
<xml_diff>
--- a/memoria/memoria_TFG.docx
+++ b/memoria/memoria_TFG.docx
@@ -26362,6 +26362,483 @@
           <w:sz w:val="24"/>
           <w:szCs w:val="24"/>
         </w:rPr>
+        <w:t xml:space="preserve">Ablación: dossier completo frente a dossier reducido, mismo caso</w:t>
+      </w:r>
+    </w:p>
+    <w:p>
+      <w:pPr>
+        <w:spacing w:after="160" w:line="360" w:lineRule="auto"/>
+        <w:ind w:firstLine="425"/>
+        <w:jc w:val="both"/>
+      </w:pPr>
+      <w:r>
+        <w:rPr>
+          <w:rFonts w:ascii="Arial" w:cs="Arial" w:eastAsia="Arial" w:hAnsi="Arial"/>
+          <w:sz w:val="22"/>
+          <w:szCs w:val="22"/>
+        </w:rPr>
+        <w:t xml:space="preserve">Comparar dos datasets distintos confunde el efecto del dominio con el de la legibilidad: cualquier diferencia de comportamiento podría deberse a que Sparkov es otro dominio, a que su detector es otro, o a que las variables tienen nombre. Para aislar esta última, únicamente esta, se repitió el experimento sobre los </w:t>
+      </w:r>
+      <w:r>
+        <w:rPr>
+          <w:rFonts w:ascii="Arial" w:cs="Arial" w:eastAsia="Arial" w:hAnsi="Arial"/>
+          <w:b/>
+          <w:bCs/>
+          <w:sz w:val="22"/>
+          <w:szCs w:val="22"/>
+        </w:rPr>
+        <w:t xml:space="preserve">mismos</w:t>
+      </w:r>
+      <w:r>
+        <w:rPr>
+          <w:rFonts w:ascii="Arial" w:cs="Arial" w:eastAsia="Arial" w:hAnsi="Arial"/>
+          <w:sz w:val="22"/>
+          <w:szCs w:val="22"/>
+        </w:rPr>
+        <w:t xml:space="preserve"> nueve casos con dos versiones del mismo dossier: </w:t>
+      </w:r>
+      <w:r>
+        <w:rPr>
+          <w:rFonts w:ascii="Arial" w:cs="Arial" w:eastAsia="Arial" w:hAnsi="Arial"/>
+          <w:b/>
+          <w:bCs/>
+          <w:sz w:val="22"/>
+          <w:szCs w:val="22"/>
+        </w:rPr>
+        <w:t xml:space="preserve">completo</w:t>
+      </w:r>
+      <w:r>
+        <w:rPr>
+          <w:rFonts w:ascii="Arial" w:cs="Arial" w:eastAsia="Arial" w:hAnsi="Arial"/>
+          <w:sz w:val="22"/>
+          <w:szCs w:val="22"/>
+        </w:rPr>
+        <w:t xml:space="preserve">, con comercio, categoría, edad, distancia y población con su nombre real, y </w:t>
+      </w:r>
+      <w:r>
+        <w:rPr>
+          <w:rFonts w:ascii="Arial" w:cs="Arial" w:eastAsia="Arial" w:hAnsi="Arial"/>
+          <w:b/>
+          <w:bCs/>
+          <w:sz w:val="22"/>
+          <w:szCs w:val="22"/>
+        </w:rPr>
+        <w:t xml:space="preserve">reducido</w:t>
+      </w:r>
+      <w:r>
+        <w:rPr>
+          <w:rFonts w:ascii="Arial" w:cs="Arial" w:eastAsia="Arial" w:hAnsi="Arial"/>
+          <w:sz w:val="22"/>
+          <w:szCs w:val="22"/>
+        </w:rPr>
+        <w:t xml:space="preserve">, con esas mismas cinco variables anonimizadas como var_1 a var_5 —el mismo techo de legibilidad que impone el conjunto ULB— y solo importe y hora conservando su nombre. Las contribuciones numéricas son idénticas en ambas versiones; solo cambia si la etiqueta dice algo reconocible.</w:t>
+      </w:r>
+    </w:p>
+    <w:p>
+      <w:pPr>
+        <w:spacing w:after="160" w:line="360" w:lineRule="auto"/>
+        <w:ind w:firstLine="425"/>
+        <w:jc w:val="both"/>
+      </w:pPr>
+      <w:r>
+        <w:rPr>
+          <w:rFonts w:ascii="Arial" w:cs="Arial" w:eastAsia="Arial" w:hAnsi="Arial"/>
+          <w:sz w:val="22"/>
+          <w:szCs w:val="22"/>
+        </w:rPr>
+        <w:t xml:space="preserve">Los casos no se eligieron por posición en un ranking, sino por desacuerdo entre el detector y la realidad: los seis fraudes reales con la probabilidad más baja de todo el conjunto de prueba (entre 0,0018 y 0,0205 — el detector apenas los nota) y los tres legítimos con la probabilidad más alta (1,0000 — falsos positivos con la máxima confianza posible). Son los casos donde el criterio del modelo, si aporta algo distinto del detector, tendría más ocasión de notarse.</w:t>
+      </w:r>
+    </w:p>
+    <w:tbl>
+      <w:tblPr>
+        <w:tblW w:type="dxa" w:w="9000"/>
+        <w:tblBorders>
+          <w:top w:val="single" w:color="auto" w:sz="4"/>
+          <w:left w:val="single" w:color="auto" w:sz="4"/>
+          <w:bottom w:val="single" w:color="auto" w:sz="4"/>
+          <w:right w:val="single" w:color="auto" w:sz="4"/>
+          <w:insideH w:val="single" w:color="auto" w:sz="4"/>
+          <w:insideV w:val="single" w:color="auto" w:sz="4"/>
+        </w:tblBorders>
+      </w:tblPr>
+      <w:tblGrid>
+        <w:gridCol w:w="1800"/>
+        <w:gridCol w:w="1800"/>
+        <w:gridCol w:w="1800"/>
+        <w:gridCol w:w="1800"/>
+        <w:gridCol w:w="1800"/>
+      </w:tblGrid>
+      <w:tr>
+        <w:tc>
+          <w:tcPr>
+            <w:tcW w:type="dxa" w:w="1800"/>
+            <w:shd w:fill="D9D9D9" w:val="clear"/>
+          </w:tcPr>
+          <w:p>
+            <w:pPr>
+              <w:spacing w:after="0"/>
+            </w:pPr>
+            <w:r>
+              <w:rPr>
+                <w:rFonts w:ascii="Arial" w:cs="Arial" w:eastAsia="Arial" w:hAnsi="Arial"/>
+                <w:b/>
+                <w:bCs/>
+                <w:sz w:val="20"/>
+                <w:szCs w:val="20"/>
+              </w:rPr>
+              <w:t xml:space="preserve">Caso</w:t>
+            </w:r>
+          </w:p>
+        </w:tc>
+        <w:tc>
+          <w:tcPr>
+            <w:tcW w:type="dxa" w:w="1800"/>
+            <w:shd w:fill="D9D9D9" w:val="clear"/>
+          </w:tcPr>
+          <w:p>
+            <w:pPr>
+              <w:spacing w:after="0"/>
+            </w:pPr>
+            <w:r>
+              <w:rPr>
+                <w:rFonts w:ascii="Arial" w:cs="Arial" w:eastAsia="Arial" w:hAnsi="Arial"/>
+                <w:b/>
+                <w:bCs/>
+                <w:sz w:val="20"/>
+                <w:szCs w:val="20"/>
+              </w:rPr>
+              <w:t xml:space="preserve">Real</w:t>
+            </w:r>
+          </w:p>
+        </w:tc>
+        <w:tc>
+          <w:tcPr>
+            <w:tcW w:type="dxa" w:w="1800"/>
+            <w:shd w:fill="D9D9D9" w:val="clear"/>
+          </w:tcPr>
+          <w:p>
+            <w:pPr>
+              <w:spacing w:after="0"/>
+            </w:pPr>
+            <w:r>
+              <w:rPr>
+                <w:rFonts w:ascii="Arial" w:cs="Arial" w:eastAsia="Arial" w:hAnsi="Arial"/>
+                <w:b/>
+                <w:bCs/>
+                <w:sz w:val="20"/>
+                <w:szCs w:val="20"/>
+              </w:rPr>
+              <w:t xml:space="preserve">Importe</w:t>
+            </w:r>
+          </w:p>
+        </w:tc>
+        <w:tc>
+          <w:tcPr>
+            <w:tcW w:type="dxa" w:w="1800"/>
+            <w:shd w:fill="D9D9D9" w:val="clear"/>
+          </w:tcPr>
+          <w:p>
+            <w:pPr>
+              <w:spacing w:after="0"/>
+            </w:pPr>
+            <w:r>
+              <w:rPr>
+                <w:rFonts w:ascii="Arial" w:cs="Arial" w:eastAsia="Arial" w:hAnsi="Arial"/>
+                <w:b/>
+                <w:bCs/>
+                <w:sz w:val="20"/>
+                <w:szCs w:val="20"/>
+              </w:rPr>
+              <w:t xml:space="preserve">Completo</w:t>
+            </w:r>
+          </w:p>
+        </w:tc>
+        <w:tc>
+          <w:tcPr>
+            <w:tcW w:type="dxa" w:w="1800"/>
+            <w:shd w:fill="D9D9D9" w:val="clear"/>
+          </w:tcPr>
+          <w:p>
+            <w:pPr>
+              <w:spacing w:after="0"/>
+            </w:pPr>
+            <w:r>
+              <w:rPr>
+                <w:rFonts w:ascii="Arial" w:cs="Arial" w:eastAsia="Arial" w:hAnsi="Arial"/>
+                <w:b/>
+                <w:bCs/>
+                <w:sz w:val="20"/>
+                <w:szCs w:val="20"/>
+              </w:rPr>
+              <w:t xml:space="preserve">Reducido</w:t>
+            </w:r>
+          </w:p>
+        </w:tc>
+      </w:tr>
+      <w:tr>
+        <w:tc>
+          <w:tcPr>
+            <w:tcW w:type="dxa" w:w="1800"/>
+          </w:tcPr>
+          <w:p>
+            <w:pPr>
+              <w:spacing w:after="0"/>
+            </w:pPr>
+            <w:r>
+              <w:rPr>
+                <w:rFonts w:ascii="Arial" w:cs="Arial" w:eastAsia="Arial" w:hAnsi="Arial"/>
+                <w:b w:val="false"/>
+                <w:bCs w:val="false"/>
+                <w:sz w:val="20"/>
+                <w:szCs w:val="20"/>
+              </w:rPr>
+              <w:t xml:space="preserve">1-6</w:t>
+            </w:r>
+          </w:p>
+        </w:tc>
+        <w:tc>
+          <w:tcPr>
+            <w:tcW w:type="dxa" w:w="1800"/>
+          </w:tcPr>
+          <w:p>
+            <w:pPr>
+              <w:spacing w:after="0"/>
+            </w:pPr>
+            <w:r>
+              <w:rPr>
+                <w:rFonts w:ascii="Arial" w:cs="Arial" w:eastAsia="Arial" w:hAnsi="Arial"/>
+                <w:b w:val="false"/>
+                <w:bCs w:val="false"/>
+                <w:sz w:val="20"/>
+                <w:szCs w:val="20"/>
+              </w:rPr>
+              <w:t xml:space="preserve">fraude</w:t>
+            </w:r>
+          </w:p>
+        </w:tc>
+        <w:tc>
+          <w:tcPr>
+            <w:tcW w:type="dxa" w:w="1800"/>
+          </w:tcPr>
+          <w:p>
+            <w:pPr>
+              <w:spacing w:after="0"/>
+            </w:pPr>
+            <w:r>
+              <w:rPr>
+                <w:rFonts w:ascii="Arial" w:cs="Arial" w:eastAsia="Arial" w:hAnsi="Arial"/>
+                <w:b w:val="false"/>
+                <w:bCs w:val="false"/>
+                <w:sz w:val="20"/>
+                <w:szCs w:val="20"/>
+              </w:rPr>
+              <w:t xml:space="preserve">9,67 a 156,52 USD</w:t>
+            </w:r>
+          </w:p>
+        </w:tc>
+        <w:tc>
+          <w:tcPr>
+            <w:tcW w:type="dxa" w:w="1800"/>
+          </w:tcPr>
+          <w:p>
+            <w:pPr>
+              <w:spacing w:after="0"/>
+            </w:pPr>
+            <w:r>
+              <w:rPr>
+                <w:rFonts w:ascii="Arial" w:cs="Arial" w:eastAsia="Arial" w:hAnsi="Arial"/>
+                <w:b w:val="false"/>
+                <w:bCs w:val="false"/>
+                <w:sz w:val="20"/>
+                <w:szCs w:val="20"/>
+              </w:rPr>
+              <w:t xml:space="preserve">DESCARTADO</w:t>
+            </w:r>
+          </w:p>
+        </w:tc>
+        <w:tc>
+          <w:tcPr>
+            <w:tcW w:type="dxa" w:w="1800"/>
+          </w:tcPr>
+          <w:p>
+            <w:pPr>
+              <w:spacing w:after="0"/>
+            </w:pPr>
+            <w:r>
+              <w:rPr>
+                <w:rFonts w:ascii="Arial" w:cs="Arial" w:eastAsia="Arial" w:hAnsi="Arial"/>
+                <w:b w:val="false"/>
+                <w:bCs w:val="false"/>
+                <w:sz w:val="20"/>
+                <w:szCs w:val="20"/>
+              </w:rPr>
+              <w:t xml:space="preserve">DESCARTADO</w:t>
+            </w:r>
+          </w:p>
+        </w:tc>
+      </w:tr>
+      <w:tr>
+        <w:tc>
+          <w:tcPr>
+            <w:tcW w:type="dxa" w:w="1800"/>
+          </w:tcPr>
+          <w:p>
+            <w:pPr>
+              <w:spacing w:after="0"/>
+            </w:pPr>
+            <w:r>
+              <w:rPr>
+                <w:rFonts w:ascii="Arial" w:cs="Arial" w:eastAsia="Arial" w:hAnsi="Arial"/>
+                <w:b w:val="false"/>
+                <w:bCs w:val="false"/>
+                <w:sz w:val="20"/>
+                <w:szCs w:val="20"/>
+              </w:rPr>
+              <w:t xml:space="preserve">7-9</w:t>
+            </w:r>
+          </w:p>
+        </w:tc>
+        <w:tc>
+          <w:tcPr>
+            <w:tcW w:type="dxa" w:w="1800"/>
+          </w:tcPr>
+          <w:p>
+            <w:pPr>
+              <w:spacing w:after="0"/>
+            </w:pPr>
+            <w:r>
+              <w:rPr>
+                <w:rFonts w:ascii="Arial" w:cs="Arial" w:eastAsia="Arial" w:hAnsi="Arial"/>
+                <w:b w:val="false"/>
+                <w:bCs w:val="false"/>
+                <w:sz w:val="20"/>
+                <w:szCs w:val="20"/>
+              </w:rPr>
+              <w:t xml:space="preserve">legítima</w:t>
+            </w:r>
+          </w:p>
+        </w:tc>
+        <w:tc>
+          <w:tcPr>
+            <w:tcW w:type="dxa" w:w="1800"/>
+          </w:tcPr>
+          <w:p>
+            <w:pPr>
+              <w:spacing w:after="0"/>
+            </w:pPr>
+            <w:r>
+              <w:rPr>
+                <w:rFonts w:ascii="Arial" w:cs="Arial" w:eastAsia="Arial" w:hAnsi="Arial"/>
+                <w:b w:val="false"/>
+                <w:bCs w:val="false"/>
+                <w:sz w:val="20"/>
+                <w:szCs w:val="20"/>
+              </w:rPr>
+              <w:t xml:space="preserve">955 a 2.135 USD</w:t>
+            </w:r>
+          </w:p>
+        </w:tc>
+        <w:tc>
+          <w:tcPr>
+            <w:tcW w:type="dxa" w:w="1800"/>
+          </w:tcPr>
+          <w:p>
+            <w:pPr>
+              <w:spacing w:after="0"/>
+            </w:pPr>
+            <w:r>
+              <w:rPr>
+                <w:rFonts w:ascii="Arial" w:cs="Arial" w:eastAsia="Arial" w:hAnsi="Arial"/>
+                <w:b w:val="false"/>
+                <w:bCs w:val="false"/>
+                <w:sz w:val="20"/>
+                <w:szCs w:val="20"/>
+              </w:rPr>
+              <w:t xml:space="preserve">CONFIRMADO</w:t>
+            </w:r>
+          </w:p>
+        </w:tc>
+        <w:tc>
+          <w:tcPr>
+            <w:tcW w:type="dxa" w:w="1800"/>
+          </w:tcPr>
+          <w:p>
+            <w:pPr>
+              <w:spacing w:after="0"/>
+            </w:pPr>
+            <w:r>
+              <w:rPr>
+                <w:rFonts w:ascii="Arial" w:cs="Arial" w:eastAsia="Arial" w:hAnsi="Arial"/>
+                <w:b w:val="false"/>
+                <w:bCs w:val="false"/>
+                <w:sz w:val="20"/>
+                <w:szCs w:val="20"/>
+              </w:rPr>
+              <w:t xml:space="preserve">CONFIRMADO</w:t>
+            </w:r>
+          </w:p>
+        </w:tc>
+      </w:tr>
+    </w:tbl>
+    <w:p>
+      <w:pPr>
+        <w:spacing w:after="160"/>
+      </w:pPr>
+    </w:p>
+    <w:p>
+      <w:pPr>
+        <w:spacing w:after="160" w:line="360" w:lineRule="auto"/>
+        <w:ind w:firstLine="425"/>
+        <w:jc w:val="both"/>
+      </w:pPr>
+      <w:r>
+        <w:rPr>
+          <w:rFonts w:ascii="Arial" w:cs="Arial" w:eastAsia="Arial" w:hAnsi="Arial"/>
+          <w:b/>
+          <w:bCs/>
+          <w:sz w:val="22"/>
+          <w:szCs w:val="22"/>
+        </w:rPr>
+        <w:t xml:space="preserve">El veredicto es idéntico entre las dos versiones en los nueve casos, sin una sola excepción.</w:t>
+      </w:r>
+      <w:r>
+        <w:rPr>
+          <w:rFonts w:ascii="Arial" w:cs="Arial" w:eastAsia="Arial" w:hAnsi="Arial"/>
+          <w:sz w:val="22"/>
+          <w:szCs w:val="22"/>
+        </w:rPr>
+        <w:t xml:space="preserve"> Ni un fraude se recupera al dar nombre a las variables, ni un falso positivo se corrige al quitárselo. El modelo reproduce con exactitud el error del detector: confirma los tres legítimos que el detector puntúa alto y descarta los seis fraudes que puntúa bajo, tenga o no delante los nombres de las variables.</w:t>
+      </w:r>
+    </w:p>
+    <w:p>
+      <w:pPr>
+        <w:spacing w:after="160" w:line="360" w:lineRule="auto"/>
+        <w:ind w:firstLine="425"/>
+        <w:jc w:val="both"/>
+      </w:pPr>
+      <w:r>
+        <w:rPr>
+          <w:rFonts w:ascii="Arial" w:cs="Arial" w:eastAsia="Arial" w:hAnsi="Arial"/>
+          <w:sz w:val="22"/>
+          <w:szCs w:val="22"/>
+        </w:rPr>
+        <w:t xml:space="preserve">La prosa sí es distinta, y de forma sistemática: en la versión completa nombra el comercio, comenta la categoría en sus propios términos —"servicios de transporte de gas", "categoría de comida y bebida"— y pondera explícitamente la edad o la distancia. En la reducida, la misma estructura argumental se sostiene sobre "var_1" y "var_2" sin perder coherencia interna. Es la confirmación experimental de 6.2.3 en su forma más limpia: el modelo no necesita entender qué es una variable para basar su veredicto en su magnitud, y entenderlo tampoco le hace decidir distinto. La legibilidad de negocio cambia lo que el texto puede argumentar, no lo que el sistema decide.</w:t>
+      </w:r>
+    </w:p>
+    <w:p>
+      <w:pPr>
+        <w:pStyle w:val="Heading3"/>
+        <w:spacing w:after="200" w:before="360"/>
+      </w:pPr>
+      <w:r>
+        <w:rPr>
+          <w:rFonts w:ascii="Arial" w:cs="Arial" w:eastAsia="Arial" w:hAnsi="Arial"/>
+          <w:b/>
+          <w:bCs/>
+          <w:color w:val="000000"/>
+          <w:sz w:val="24"/>
+          <w:szCs w:val="24"/>
+        </w:rPr>
         <w:t xml:space="preserve">Alcance</w:t>
       </w:r>
     </w:p>
@@ -26377,22 +26854,22 @@
           <w:sz w:val="22"/>
           <w:szCs w:val="22"/>
         </w:rPr>
-        <w:t xml:space="preserve">Un solo modelo, sin hiperparámetros ajustados, sobre datos simulados y con una sola semilla de generación. No permite ninguna de las afirmaciones de significación estadística del resto del capítulo. Los cinco casos probados con el Investigador son además los de mayor probabilidad, no los de cola: comprueban que la prosa usa variables de negocio cuando la evidencia es clara, no si eso corrige el sesgo del importe bajo sobre casos ambiguos, que es la pregunta que 5.12 y 5.14 responden sobre el conjunto ULB. Repetir esa prueba concreta sobre la cola de este dataset queda como trabajo futuro.</w:t>
-      </w:r>
-    </w:p>
-    <w:p>
-      <w:pPr>
-        <w:spacing w:after="160" w:line="360" w:lineRule="auto"/>
-        <w:ind w:firstLine="425"/>
-        <w:jc w:val="both"/>
-      </w:pPr>
-      <w:r>
-        <w:rPr>
-          <w:rFonts w:ascii="Arial" w:cs="Arial" w:eastAsia="Arial" w:hAnsi="Arial"/>
-          <w:sz w:val="22"/>
-          <w:szCs w:val="22"/>
-        </w:rPr>
-        <w:t xml:space="preserve">Lo que sí permite, y es lo que se buscaba, es comprobar que la limitación de 4.2.1 —las explicaciones no pueden ser de negocio porque el dato no lo es— es del dataset y no del sistema: con otro dataset, las mismas herramientas producen expedientes legibles por un humano y explicaciones que los aprovechan, sin cambiar una sola línea de la capa 2.</w:t>
+        <w:t xml:space="preserve">Un solo modelo, sin hiperparámetros ajustados, sobre datos simulados y con una sola semilla de generación. Nueve casos por versión no permiten ningún contraste estadístico, igual que las demostraciones de 5.11 y 5.14: es un resultado cualitativo y así debe leerse. Los cinco casos de la primera prueba y los nueve de la ablación no se solapan, y ambos apuntan en la misma dirección.</w:t>
+      </w:r>
+    </w:p>
+    <w:p>
+      <w:pPr>
+        <w:spacing w:after="160" w:line="360" w:lineRule="auto"/>
+        <w:ind w:firstLine="425"/>
+        <w:jc w:val="both"/>
+      </w:pPr>
+      <w:r>
+        <w:rPr>
+          <w:rFonts w:ascii="Arial" w:cs="Arial" w:eastAsia="Arial" w:hAnsi="Arial"/>
+          <w:sz w:val="22"/>
+          <w:szCs w:val="22"/>
+        </w:rPr>
+        <w:t xml:space="preserve">Lo que sí permite, y es lo que se buscaba, es comprobar dos cosas por separado. Primera, que la limitación de 4.2.1 —las explicaciones no pueden ser de negocio porque el dato no lo es— es del dataset y no del sistema: con otro dataset, las mismas herramientas producen expedientes legibles por un humano y explicaciones que los aprovechan, sin cambiar una sola línea de la capa 2. Segunda, y más incómoda, que esa legibilidad no basta: sobre los mismos nueve casos de mayor desacuerdo entre el detector y la realidad, saber qué significa cada variable no cambió ni un veredicto. El problema que 5.12 y 5.14 documentan sobre ULB no es que el modelo no entienda las variables; es que su veredicto no depende de entenderlas.</w:t>
       </w:r>
     </w:p>
     <w:p>
@@ -28413,6 +28890,21 @@
     </w:p>
     <w:p>
       <w:pPr>
+        <w:spacing w:after="160" w:line="360" w:lineRule="auto"/>
+        <w:ind w:firstLine="425"/>
+        <w:jc w:val="both"/>
+      </w:pPr>
+      <w:r>
+        <w:rPr>
+          <w:rFonts w:ascii="Arial" w:cs="Arial" w:eastAsia="Arial" w:hAnsi="Arial"/>
+          <w:sz w:val="22"/>
+          <w:szCs w:val="22"/>
+        </w:rPr>
+        <w:t xml:space="preserve">La ablación de 5.13 sobre el dataset Sparkov lo confirma desde un ángulo que ULB no permitía probar. Sobre los mismos nueve casos —seis fraudes que el detector apenas nota y tres falsos positivos que señala con máxima confianza—, dar nombre real a comercio, categoría, edad y distancia frente a anonimizarlos como var_1 a var_5 no cambió un solo veredicto: el modelo reproduce el error del detector en los nueve casos, tenga o no delante el significado de las variables. Que el modelo entienda o no la variable es irrelevante para su decisión; lo relevante es su magnitud. La legibilidad de negocio mejora lo que el texto puede argumentar y no toca, en esta comprobación, lo que el sistema decide.</w:t>
+      </w:r>
+    </w:p>
+    <w:p>
+      <w:pPr>
         <w:pStyle w:val="Heading3"/>
         <w:spacing w:after="200" w:before="360"/>
       </w:pPr>
@@ -28856,7 +29348,7 @@
           <w:sz w:val="22"/>
           <w:szCs w:val="22"/>
         </w:rPr>
-        <w:t xml:space="preserve">La extensión de 5.13 sobre variables de negocio usa un dataset simulado, no transacciones reales, con un único modelo sin ajuste de hiperparámetros. La prueba con el Investigador se hizo sobre los cinco casos de mayor probabilidad, no sobre casos de cola ambiguos como los de 5.12 y 5.14. Demuestra que las contribuciones y la prosa pueden ser legibles por negocio; no repite sobre ellas ninguna de las validaciones estadísticas del resto del capítulo, ni comprueba si eso corrige el sesgo del importe bajo en casos difíciles.</w:t>
+        <w:t xml:space="preserve">La extensión de 5.13 sobre variables de negocio usa un dataset simulado, no transacciones reales, con un único modelo sin ajuste de hiperparámetros. Ni la prueba de los cinco casos de mayor probabilidad ni la ablación completo/reducido sobre los nueve de mayor desacuerdo permiten ningún contraste estadístico: son catorce casos en total y así deben leerse, como demostraciones y no como series.</w:t>
       </w:r>
     </w:p>
     <w:p>
@@ -28959,15 +29451,15 @@
           <w:sz w:val="22"/>
           <w:szCs w:val="22"/>
         </w:rPr>
-        <w:t xml:space="preserve">Repetir la prueba de agentes de la extensión de negocio sobre casos de cola, y con datos reales.</w:t>
-      </w:r>
-      <w:r>
-        <w:rPr>
-          <w:rFonts w:ascii="Arial" w:cs="Arial" w:eastAsia="Arial" w:hAnsi="Arial"/>
-          <w:sz w:val="22"/>
-          <w:szCs w:val="22"/>
-        </w:rPr>
-        <w:t xml:space="preserve"> La sección 5.13 comprobó, sobre un dataset simulado (Sparkov) con un año de periodo, que tanto las contribuciones del detector como la prosa del Investigador pasan a citar comercio, categoría, distancia y edad en vez de componentes anónimas, exactamente las variables que 4.2.1 declaraba fuera de alcance sobre el conjunto ULB. La prueba se hizo sobre los cinco casos de mayor probabilidad, no sobre la cola: queda por comprobar si esas mismas variables de negocio bastan para corregir el sesgo del importe bajo en los casos ambiguos, que es donde 5.12 y 5.14 documentan que el enunciado y el ajuste fino fallan por igual sobre el conjunto ULB, y si un modelo de razonamiento con ese contexto semántico podría llegar a ejercer de detector y no solo de explicador. Y, más allá de lo ya explorado, repetir el ejercicio con transacciones reales y no simuladas.</w:t>
+        <w:t xml:space="preserve">Repetir la extensión de negocio con transacciones reales y con un detector ajustado.</w:t>
+      </w:r>
+      <w:r>
+        <w:rPr>
+          <w:rFonts w:ascii="Arial" w:cs="Arial" w:eastAsia="Arial" w:hAnsi="Arial"/>
+          <w:sz w:val="22"/>
+          <w:szCs w:val="22"/>
+        </w:rPr>
+        <w:t xml:space="preserve"> La sección 5.13 agotó, dentro de lo razonable para una extensión exploratoria, la pregunta que la motivaba: sobre un dataset simulado (Sparkov) con variables de negocio, las contribuciones del detector y la prosa del Investigador dejan de citar componentes anónimas y pasan a citar comercio, categoría, distancia y edad; y una ablación que compara el mismo caso con esas variables legibles o anonimizadas muestra que esa legibilidad, por sí sola, no cambia ni un veredicto sobre los nueve casos de mayor desacuerdo entre el detector y la realidad. Queda pendiente repetir el ejercicio con transacciones reales y no simuladas, y con un detector que haya pasado por la misma búsqueda de hiperparámetros que el de ULB: la mediana de probabilidad de 0,95 sobre el conjunto de prueba de Sparkov sugiere que una parte del problema es de calibración, no solo de dominio, y separarlas requeriría ese ajuste.</w:t>
       </w:r>
     </w:p>
     <w:p>

</xml_diff>

<commit_message>
Sustituye la captura del arbol de directorios por un diagrama generado
</commit_message>
<xml_diff>
--- a/memoria/memoria_TFG.docx
+++ b/memoria/memoria_TFG.docx
@@ -29844,332 +29844,13 @@
     </w:p>
     <w:p>
       <w:pPr>
-        <w:pBdr>
-          <w:top w:val="dashed" w:color="C0392B" w:sz="6"/>
-          <w:bottom w:val="dashed" w:color="C0392B" w:sz="6"/>
-          <w:left w:val="dashed" w:color="C0392B" w:sz="6"/>
-          <w:right w:val="dashed" w:color="C0392B" w:sz="6"/>
-        </w:pBdr>
-        <w:shd w:fill="FDF2F0" w:val="clear"/>
-        <w:spacing w:after="200" w:before="200"/>
-      </w:pPr>
-      <w:r>
-        <w:rPr>
-          <w:rFonts w:ascii="Arial" w:cs="Arial" w:eastAsia="Arial" w:hAnsi="Arial"/>
-          <w:i/>
-          <w:iCs/>
-          <w:color w:val="C0392B"/>
-          <w:sz w:val="22"/>
-          <w:szCs w:val="22"/>
-        </w:rPr>
-        <w:t xml:space="preserve">[CAPTURA] Arbol de directorios del repositorio, con tree /F en PowerShell o la vista del explorador. Que se vea la separacion entre src, scripts, reports y memoria.</w:t>
-      </w:r>
-    </w:p>
-    <w:p>
-      <w:pPr>
-        <w:spacing w:after="160" w:line="360" w:lineRule="auto"/>
-        <w:ind w:firstLine="425"/>
-        <w:jc w:val="both"/>
-      </w:pPr>
-      <w:r>
-        <w:rPr>
-          <w:rFonts w:ascii="Arial" w:cs="Arial" w:eastAsia="Arial" w:hAnsi="Arial"/>
-          <w:sz w:val="22"/>
-          <w:szCs w:val="22"/>
-        </w:rPr>
-        <w:t xml:space="preserve">El repositorio se organiza en cuatro directorios con responsabilidades separadas.</w:t>
-      </w:r>
-    </w:p>
-    <w:tbl>
-      <w:tblPr>
-        <w:tblW w:type="dxa" w:w="9000"/>
-        <w:tblBorders>
-          <w:top w:val="single" w:color="auto" w:sz="4"/>
-          <w:left w:val="single" w:color="auto" w:sz="4"/>
-          <w:bottom w:val="single" w:color="auto" w:sz="4"/>
-          <w:right w:val="single" w:color="auto" w:sz="4"/>
-          <w:insideH w:val="single" w:color="auto" w:sz="4"/>
-          <w:insideV w:val="single" w:color="auto" w:sz="4"/>
-        </w:tblBorders>
-      </w:tblPr>
-      <w:tblGrid>
-        <w:gridCol w:w="4500"/>
-        <w:gridCol w:w="4500"/>
-      </w:tblGrid>
-      <w:tr>
-        <w:tc>
-          <w:tcPr>
-            <w:tcW w:type="dxa" w:w="4500"/>
-            <w:shd w:fill="D9D9D9" w:val="clear"/>
-          </w:tcPr>
-          <w:p>
-            <w:pPr>
-              <w:spacing w:after="0"/>
-            </w:pPr>
-            <w:r>
-              <w:rPr>
-                <w:rFonts w:ascii="Arial" w:cs="Arial" w:eastAsia="Arial" w:hAnsi="Arial"/>
-                <w:b/>
-                <w:bCs/>
-                <w:sz w:val="20"/>
-                <w:szCs w:val="20"/>
-              </w:rPr>
-              <w:t xml:space="preserve">Directorio</w:t>
-            </w:r>
-          </w:p>
-        </w:tc>
-        <w:tc>
-          <w:tcPr>
-            <w:tcW w:type="dxa" w:w="4500"/>
-            <w:shd w:fill="D9D9D9" w:val="clear"/>
-          </w:tcPr>
-          <w:p>
-            <w:pPr>
-              <w:spacing w:after="0"/>
-            </w:pPr>
-            <w:r>
-              <w:rPr>
-                <w:rFonts w:ascii="Arial" w:cs="Arial" w:eastAsia="Arial" w:hAnsi="Arial"/>
-                <w:b/>
-                <w:bCs/>
-                <w:sz w:val="20"/>
-                <w:szCs w:val="20"/>
-              </w:rPr>
-              <w:t xml:space="preserve">Contenido</w:t>
-            </w:r>
-          </w:p>
-        </w:tc>
-      </w:tr>
-      <w:tr>
-        <w:tc>
-          <w:tcPr>
-            <w:tcW w:type="dxa" w:w="4500"/>
-          </w:tcPr>
-          <w:p>
-            <w:pPr>
-              <w:spacing w:after="0"/>
-            </w:pPr>
-            <w:r>
-              <w:rPr>
-                <w:rFonts w:ascii="Arial" w:cs="Arial" w:eastAsia="Arial" w:hAnsi="Arial"/>
-                <w:b w:val="false"/>
-                <w:bCs w:val="false"/>
-                <w:sz w:val="20"/>
-                <w:szCs w:val="20"/>
-              </w:rPr>
-              <w:t xml:space="preserve">src/detector</w:t>
-            </w:r>
-          </w:p>
-        </w:tc>
-        <w:tc>
-          <w:tcPr>
-            <w:tcW w:type="dxa" w:w="4500"/>
-          </w:tcPr>
-          <w:p>
-            <w:pPr>
-              <w:spacing w:after="0"/>
-            </w:pPr>
-            <w:r>
-              <w:rPr>
-                <w:rFonts w:ascii="Arial" w:cs="Arial" w:eastAsia="Arial" w:hAnsi="Arial"/>
-                <w:b w:val="false"/>
-                <w:bCs w:val="false"/>
-                <w:sz w:val="20"/>
-                <w:szCs w:val="20"/>
-              </w:rPr>
-              <w:t xml:space="preserve">Carga de datos, entrenamiento y puntuación. Sin dependencias de la capa 2</w:t>
-            </w:r>
-          </w:p>
-        </w:tc>
-      </w:tr>
-      <w:tr>
-        <w:tc>
-          <w:tcPr>
-            <w:tcW w:type="dxa" w:w="4500"/>
-          </w:tcPr>
-          <w:p>
-            <w:pPr>
-              <w:spacing w:after="0"/>
-            </w:pPr>
-            <w:r>
-              <w:rPr>
-                <w:rFonts w:ascii="Arial" w:cs="Arial" w:eastAsia="Arial" w:hAnsi="Arial"/>
-                <w:b w:val="false"/>
-                <w:bCs w:val="false"/>
-                <w:sz w:val="20"/>
-                <w:szCs w:val="20"/>
-              </w:rPr>
-              <w:t xml:space="preserve">src/agents</w:t>
-            </w:r>
-          </w:p>
-        </w:tc>
-        <w:tc>
-          <w:tcPr>
-            <w:tcW w:type="dxa" w:w="4500"/>
-          </w:tcPr>
-          <w:p>
-            <w:pPr>
-              <w:spacing w:after="0"/>
-            </w:pPr>
-            <w:r>
-              <w:rPr>
-                <w:rFonts w:ascii="Arial" w:cs="Arial" w:eastAsia="Arial" w:hAnsi="Arial"/>
-                <w:b w:val="false"/>
-                <w:bCs w:val="false"/>
-                <w:sz w:val="20"/>
-                <w:szCs w:val="20"/>
-              </w:rPr>
-              <w:t xml:space="preserve">Definición de los agentes, herramientas y fragmentos de enunciado compartidos</w:t>
-            </w:r>
-          </w:p>
-        </w:tc>
-      </w:tr>
-      <w:tr>
-        <w:tc>
-          <w:tcPr>
-            <w:tcW w:type="dxa" w:w="4500"/>
-          </w:tcPr>
-          <w:p>
-            <w:pPr>
-              <w:spacing w:after="0"/>
-            </w:pPr>
-            <w:r>
-              <w:rPr>
-                <w:rFonts w:ascii="Arial" w:cs="Arial" w:eastAsia="Arial" w:hAnsi="Arial"/>
-                <w:b w:val="false"/>
-                <w:bCs w:val="false"/>
-                <w:sz w:val="20"/>
-                <w:szCs w:val="20"/>
-              </w:rPr>
-              <w:t xml:space="preserve">scripts</w:t>
-            </w:r>
-          </w:p>
-        </w:tc>
-        <w:tc>
-          <w:tcPr>
-            <w:tcW w:type="dxa" w:w="4500"/>
-          </w:tcPr>
-          <w:p>
-            <w:pPr>
-              <w:spacing w:after="0"/>
-            </w:pPr>
-            <w:r>
-              <w:rPr>
-                <w:rFonts w:ascii="Arial" w:cs="Arial" w:eastAsia="Arial" w:hAnsi="Arial"/>
-                <w:b w:val="false"/>
-                <w:bCs w:val="false"/>
-                <w:sz w:val="20"/>
-                <w:szCs w:val="20"/>
-              </w:rPr>
-              <w:t xml:space="preserve">Un guion por experimento, cada uno con su justificación en la cabecera</w:t>
-            </w:r>
-          </w:p>
-        </w:tc>
-      </w:tr>
-      <w:tr>
-        <w:tc>
-          <w:tcPr>
-            <w:tcW w:type="dxa" w:w="4500"/>
-          </w:tcPr>
-          <w:p>
-            <w:pPr>
-              <w:spacing w:after="0"/>
-            </w:pPr>
-            <w:r>
-              <w:rPr>
-                <w:rFonts w:ascii="Arial" w:cs="Arial" w:eastAsia="Arial" w:hAnsi="Arial"/>
-                <w:b w:val="false"/>
-                <w:bCs w:val="false"/>
-                <w:sz w:val="20"/>
-                <w:szCs w:val="20"/>
-              </w:rPr>
-              <w:t xml:space="preserve">reports</w:t>
-            </w:r>
-          </w:p>
-        </w:tc>
-        <w:tc>
-          <w:tcPr>
-            <w:tcW w:type="dxa" w:w="4500"/>
-          </w:tcPr>
-          <w:p>
-            <w:pPr>
-              <w:spacing w:after="0"/>
-            </w:pPr>
-            <w:r>
-              <w:rPr>
-                <w:rFonts w:ascii="Arial" w:cs="Arial" w:eastAsia="Arial" w:hAnsi="Arial"/>
-                <w:b w:val="false"/>
-                <w:bCs w:val="false"/>
-                <w:sz w:val="20"/>
-                <w:szCs w:val="20"/>
-              </w:rPr>
-              <w:t xml:space="preserve">Resultados de todas las ejecuciones, versionados</w:t>
-            </w:r>
-          </w:p>
-        </w:tc>
-      </w:tr>
-    </w:tbl>
-    <w:p>
-      <w:pPr>
-        <w:spacing w:after="160"/>
-      </w:pPr>
-    </w:p>
-    <w:p>
-      <w:pPr>
-        <w:spacing w:after="160" w:line="360" w:lineRule="auto"/>
-        <w:ind w:firstLine="425"/>
-        <w:jc w:val="both"/>
-      </w:pPr>
-      <w:r>
-        <w:rPr>
-          <w:rFonts w:ascii="Arial" w:cs="Arial" w:eastAsia="Arial" w:hAnsi="Arial"/>
-          <w:sz w:val="22"/>
-          <w:szCs w:val="22"/>
-        </w:rPr>
-        <w:t xml:space="preserve">La reproducción completa requiere Python 3.12, un servidor de modelos local y el conjunto de datos, que no se distribuye con el repositorio por su tamaño.</w:t>
-      </w:r>
-    </w:p>
-    <w:p>
-      <w:pPr>
-        <w:spacing w:after="160" w:line="360" w:lineRule="auto"/>
-        <w:ind w:firstLine="425"/>
-        <w:jc w:val="both"/>
-      </w:pPr>
-      <w:r>
-        <w:rPr>
-          <w:rFonts w:ascii="Arial" w:cs="Arial" w:eastAsia="Arial" w:hAnsi="Arial"/>
-          <w:sz w:val="22"/>
-          <w:szCs w:val="22"/>
-        </w:rPr>
-        <w:t xml:space="preserve">Todos los resultados experimentales están bajo control de versiones junto al código que los generó, de modo que cualquier cifra de esta memoria puede rastrearse hasta la ejecución concreta que la produjo y hasta la versión del código vigente en ese momento. Los guiones registran en cada fichero de salida los parámetros con que fueron invocados, incluidos los que afectan a la comparabilidad entre tandas, como el presupuesto de tokens por caso.</w:t>
-      </w:r>
-    </w:p>
-    <w:p>
-      <w:pPr>
-        <w:pStyle w:val="Heading2"/>
-        <w:spacing w:after="200" w:before="360"/>
-      </w:pPr>
-      <w:r>
-        <w:rPr>
-          <w:rFonts w:ascii="Arial" w:cs="Arial" w:eastAsia="Arial" w:hAnsi="Arial"/>
-          <w:b/>
-          <w:bCs/>
-          <w:color w:val="000000"/>
-          <w:sz w:val="26"/>
-          <w:szCs w:val="26"/>
-        </w:rPr>
-        <w:t xml:space="preserve">B. Código fuente</w:t>
-      </w:r>
-    </w:p>
-    <w:p>
-      <w:pPr>
         <w:spacing w:after="80" w:before="240"/>
         <w:jc w:val="center"/>
       </w:pPr>
       <w:r>
         <w:drawing>
           <wp:inline distT="0" distB="0" distL="0" distR="0">
-            <wp:extent cx="5400675" cy="3914775"/>
+            <wp:extent cx="5400675" cy="4324350"/>
             <wp:effectExtent t="0" r="0" b="0" l="0"/>
             <wp:docPr id="1" name="" descr="" title=""/>
             <wp:cNvGraphicFramePr>
@@ -30194,6 +29875,363 @@
                   <pic:spPr bwMode="auto">
                     <a:xfrm>
                       <a:off x="0" y="0"/>
+                      <a:ext cx="5400675" cy="4324350"/>
+                    </a:xfrm>
+                    <a:prstGeom prst="rect">
+                      <a:avLst/>
+                    </a:prstGeom>
+                  </pic:spPr>
+                </pic:pic>
+              </a:graphicData>
+            </a:graphic>
+          </wp:inline>
+        </w:drawing>
+      </w:r>
+    </w:p>
+    <w:p>
+      <w:pPr>
+        <w:spacing w:after="240"/>
+        <w:jc w:val="center"/>
+      </w:pPr>
+      <w:r>
+        <w:rPr>
+          <w:i/>
+          <w:iCs/>
+          <w:sz w:val="20"/>
+          <w:szCs w:val="20"/>
+        </w:rPr>
+        <w:t xml:space="preserve">Figura 23. Estructura del repositorio. En azul el código determinista de la capa 1, en rojo el estocástico de la capa 2, en verde los guiones de experimentación, en gris los datos y la documentación.</w:t>
+      </w:r>
+    </w:p>
+    <w:p>
+      <w:pPr>
+        <w:spacing w:after="160" w:line="360" w:lineRule="auto"/>
+        <w:ind w:firstLine="425"/>
+        <w:jc w:val="both"/>
+      </w:pPr>
+      <w:r>
+        <w:rPr>
+          <w:rFonts w:ascii="Arial" w:cs="Arial" w:eastAsia="Arial" w:hAnsi="Arial"/>
+          <w:sz w:val="22"/>
+          <w:szCs w:val="22"/>
+        </w:rPr>
+        <w:t xml:space="preserve">El repositorio se organiza en cuatro directorios con responsabilidades separadas.</w:t>
+      </w:r>
+    </w:p>
+    <w:tbl>
+      <w:tblPr>
+        <w:tblW w:type="dxa" w:w="9000"/>
+        <w:tblBorders>
+          <w:top w:val="single" w:color="auto" w:sz="4"/>
+          <w:left w:val="single" w:color="auto" w:sz="4"/>
+          <w:bottom w:val="single" w:color="auto" w:sz="4"/>
+          <w:right w:val="single" w:color="auto" w:sz="4"/>
+          <w:insideH w:val="single" w:color="auto" w:sz="4"/>
+          <w:insideV w:val="single" w:color="auto" w:sz="4"/>
+        </w:tblBorders>
+      </w:tblPr>
+      <w:tblGrid>
+        <w:gridCol w:w="4500"/>
+        <w:gridCol w:w="4500"/>
+      </w:tblGrid>
+      <w:tr>
+        <w:tc>
+          <w:tcPr>
+            <w:tcW w:type="dxa" w:w="4500"/>
+            <w:shd w:fill="D9D9D9" w:val="clear"/>
+          </w:tcPr>
+          <w:p>
+            <w:pPr>
+              <w:spacing w:after="0"/>
+            </w:pPr>
+            <w:r>
+              <w:rPr>
+                <w:rFonts w:ascii="Arial" w:cs="Arial" w:eastAsia="Arial" w:hAnsi="Arial"/>
+                <w:b/>
+                <w:bCs/>
+                <w:sz w:val="20"/>
+                <w:szCs w:val="20"/>
+              </w:rPr>
+              <w:t xml:space="preserve">Directorio</w:t>
+            </w:r>
+          </w:p>
+        </w:tc>
+        <w:tc>
+          <w:tcPr>
+            <w:tcW w:type="dxa" w:w="4500"/>
+            <w:shd w:fill="D9D9D9" w:val="clear"/>
+          </w:tcPr>
+          <w:p>
+            <w:pPr>
+              <w:spacing w:after="0"/>
+            </w:pPr>
+            <w:r>
+              <w:rPr>
+                <w:rFonts w:ascii="Arial" w:cs="Arial" w:eastAsia="Arial" w:hAnsi="Arial"/>
+                <w:b/>
+                <w:bCs/>
+                <w:sz w:val="20"/>
+                <w:szCs w:val="20"/>
+              </w:rPr>
+              <w:t xml:space="preserve">Contenido</w:t>
+            </w:r>
+          </w:p>
+        </w:tc>
+      </w:tr>
+      <w:tr>
+        <w:tc>
+          <w:tcPr>
+            <w:tcW w:type="dxa" w:w="4500"/>
+          </w:tcPr>
+          <w:p>
+            <w:pPr>
+              <w:spacing w:after="0"/>
+            </w:pPr>
+            <w:r>
+              <w:rPr>
+                <w:rFonts w:ascii="Arial" w:cs="Arial" w:eastAsia="Arial" w:hAnsi="Arial"/>
+                <w:b w:val="false"/>
+                <w:bCs w:val="false"/>
+                <w:sz w:val="20"/>
+                <w:szCs w:val="20"/>
+              </w:rPr>
+              <w:t xml:space="preserve">src/detector</w:t>
+            </w:r>
+          </w:p>
+        </w:tc>
+        <w:tc>
+          <w:tcPr>
+            <w:tcW w:type="dxa" w:w="4500"/>
+          </w:tcPr>
+          <w:p>
+            <w:pPr>
+              <w:spacing w:after="0"/>
+            </w:pPr>
+            <w:r>
+              <w:rPr>
+                <w:rFonts w:ascii="Arial" w:cs="Arial" w:eastAsia="Arial" w:hAnsi="Arial"/>
+                <w:b w:val="false"/>
+                <w:bCs w:val="false"/>
+                <w:sz w:val="20"/>
+                <w:szCs w:val="20"/>
+              </w:rPr>
+              <w:t xml:space="preserve">Carga de datos, entrenamiento y puntuación. Sin dependencias de la capa 2</w:t>
+            </w:r>
+          </w:p>
+        </w:tc>
+      </w:tr>
+      <w:tr>
+        <w:tc>
+          <w:tcPr>
+            <w:tcW w:type="dxa" w:w="4500"/>
+          </w:tcPr>
+          <w:p>
+            <w:pPr>
+              <w:spacing w:after="0"/>
+            </w:pPr>
+            <w:r>
+              <w:rPr>
+                <w:rFonts w:ascii="Arial" w:cs="Arial" w:eastAsia="Arial" w:hAnsi="Arial"/>
+                <w:b w:val="false"/>
+                <w:bCs w:val="false"/>
+                <w:sz w:val="20"/>
+                <w:szCs w:val="20"/>
+              </w:rPr>
+              <w:t xml:space="preserve">src/agents</w:t>
+            </w:r>
+          </w:p>
+        </w:tc>
+        <w:tc>
+          <w:tcPr>
+            <w:tcW w:type="dxa" w:w="4500"/>
+          </w:tcPr>
+          <w:p>
+            <w:pPr>
+              <w:spacing w:after="0"/>
+            </w:pPr>
+            <w:r>
+              <w:rPr>
+                <w:rFonts w:ascii="Arial" w:cs="Arial" w:eastAsia="Arial" w:hAnsi="Arial"/>
+                <w:b w:val="false"/>
+                <w:bCs w:val="false"/>
+                <w:sz w:val="20"/>
+                <w:szCs w:val="20"/>
+              </w:rPr>
+              <w:t xml:space="preserve">Definición de los agentes, herramientas y fragmentos de enunciado compartidos</w:t>
+            </w:r>
+          </w:p>
+        </w:tc>
+      </w:tr>
+      <w:tr>
+        <w:tc>
+          <w:tcPr>
+            <w:tcW w:type="dxa" w:w="4500"/>
+          </w:tcPr>
+          <w:p>
+            <w:pPr>
+              <w:spacing w:after="0"/>
+            </w:pPr>
+            <w:r>
+              <w:rPr>
+                <w:rFonts w:ascii="Arial" w:cs="Arial" w:eastAsia="Arial" w:hAnsi="Arial"/>
+                <w:b w:val="false"/>
+                <w:bCs w:val="false"/>
+                <w:sz w:val="20"/>
+                <w:szCs w:val="20"/>
+              </w:rPr>
+              <w:t xml:space="preserve">scripts</w:t>
+            </w:r>
+          </w:p>
+        </w:tc>
+        <w:tc>
+          <w:tcPr>
+            <w:tcW w:type="dxa" w:w="4500"/>
+          </w:tcPr>
+          <w:p>
+            <w:pPr>
+              <w:spacing w:after="0"/>
+            </w:pPr>
+            <w:r>
+              <w:rPr>
+                <w:rFonts w:ascii="Arial" w:cs="Arial" w:eastAsia="Arial" w:hAnsi="Arial"/>
+                <w:b w:val="false"/>
+                <w:bCs w:val="false"/>
+                <w:sz w:val="20"/>
+                <w:szCs w:val="20"/>
+              </w:rPr>
+              <w:t xml:space="preserve">Un guion por experimento, cada uno con su justificación en la cabecera</w:t>
+            </w:r>
+          </w:p>
+        </w:tc>
+      </w:tr>
+      <w:tr>
+        <w:tc>
+          <w:tcPr>
+            <w:tcW w:type="dxa" w:w="4500"/>
+          </w:tcPr>
+          <w:p>
+            <w:pPr>
+              <w:spacing w:after="0"/>
+            </w:pPr>
+            <w:r>
+              <w:rPr>
+                <w:rFonts w:ascii="Arial" w:cs="Arial" w:eastAsia="Arial" w:hAnsi="Arial"/>
+                <w:b w:val="false"/>
+                <w:bCs w:val="false"/>
+                <w:sz w:val="20"/>
+                <w:szCs w:val="20"/>
+              </w:rPr>
+              <w:t xml:space="preserve">reports</w:t>
+            </w:r>
+          </w:p>
+        </w:tc>
+        <w:tc>
+          <w:tcPr>
+            <w:tcW w:type="dxa" w:w="4500"/>
+          </w:tcPr>
+          <w:p>
+            <w:pPr>
+              <w:spacing w:after="0"/>
+            </w:pPr>
+            <w:r>
+              <w:rPr>
+                <w:rFonts w:ascii="Arial" w:cs="Arial" w:eastAsia="Arial" w:hAnsi="Arial"/>
+                <w:b w:val="false"/>
+                <w:bCs w:val="false"/>
+                <w:sz w:val="20"/>
+                <w:szCs w:val="20"/>
+              </w:rPr>
+              <w:t xml:space="preserve">Resultados de todas las ejecuciones, versionados</w:t>
+            </w:r>
+          </w:p>
+        </w:tc>
+      </w:tr>
+    </w:tbl>
+    <w:p>
+      <w:pPr>
+        <w:spacing w:after="160"/>
+      </w:pPr>
+    </w:p>
+    <w:p>
+      <w:pPr>
+        <w:spacing w:after="160" w:line="360" w:lineRule="auto"/>
+        <w:ind w:firstLine="425"/>
+        <w:jc w:val="both"/>
+      </w:pPr>
+      <w:r>
+        <w:rPr>
+          <w:rFonts w:ascii="Arial" w:cs="Arial" w:eastAsia="Arial" w:hAnsi="Arial"/>
+          <w:sz w:val="22"/>
+          <w:szCs w:val="22"/>
+        </w:rPr>
+        <w:t xml:space="preserve">La reproducción completa requiere Python 3.12, un servidor de modelos local y el conjunto de datos, que no se distribuye con el repositorio por su tamaño.</w:t>
+      </w:r>
+    </w:p>
+    <w:p>
+      <w:pPr>
+        <w:spacing w:after="160" w:line="360" w:lineRule="auto"/>
+        <w:ind w:firstLine="425"/>
+        <w:jc w:val="both"/>
+      </w:pPr>
+      <w:r>
+        <w:rPr>
+          <w:rFonts w:ascii="Arial" w:cs="Arial" w:eastAsia="Arial" w:hAnsi="Arial"/>
+          <w:sz w:val="22"/>
+          <w:szCs w:val="22"/>
+        </w:rPr>
+        <w:t xml:space="preserve">Todos los resultados experimentales están bajo control de versiones junto al código que los generó, de modo que cualquier cifra de esta memoria puede rastrearse hasta la ejecución concreta que la produjo y hasta la versión del código vigente en ese momento. Los guiones registran en cada fichero de salida los parámetros con que fueron invocados, incluidos los que afectan a la comparabilidad entre tandas, como el presupuesto de tokens por caso.</w:t>
+      </w:r>
+    </w:p>
+    <w:p>
+      <w:pPr>
+        <w:pStyle w:val="Heading2"/>
+        <w:spacing w:after="200" w:before="360"/>
+      </w:pPr>
+      <w:r>
+        <w:rPr>
+          <w:rFonts w:ascii="Arial" w:cs="Arial" w:eastAsia="Arial" w:hAnsi="Arial"/>
+          <w:b/>
+          <w:bCs/>
+          <w:color w:val="000000"/>
+          <w:sz w:val="26"/>
+          <w:szCs w:val="26"/>
+        </w:rPr>
+        <w:t xml:space="preserve">B. Código fuente</w:t>
+      </w:r>
+    </w:p>
+    <w:p>
+      <w:pPr>
+        <w:spacing w:after="80" w:before="240"/>
+        <w:jc w:val="center"/>
+      </w:pPr>
+      <w:r>
+        <w:drawing>
+          <wp:inline distT="0" distB="0" distL="0" distR="0">
+            <wp:extent cx="5400675" cy="3914775"/>
+            <wp:effectExtent t="0" r="0" b="0" l="0"/>
+            <wp:docPr id="1" name="" descr="" title=""/>
+            <wp:cNvGraphicFramePr>
+              <a:graphicFrameLocks xmlns:a="http://schemas.openxmlformats.org/drawingml/2006/main" noChangeAspect="1"/>
+            </wp:cNvGraphicFramePr>
+            <a:graphic xmlns:a="http://schemas.openxmlformats.org/drawingml/2006/main">
+              <a:graphicData uri="http://schemas.openxmlformats.org/drawingml/2006/picture">
+                <pic:pic xmlns:pic="http://schemas.openxmlformats.org/drawingml/2006/picture">
+                  <pic:nvPicPr>
+                    <pic:cNvPr id="0" name="" descr=""/>
+                    <pic:cNvPicPr>
+                      <a:picLocks noChangeAspect="1" noChangeArrowheads="1"/>
+                    </pic:cNvPicPr>
+                  </pic:nvPicPr>
+                  <pic:blipFill>
+                    <a:blip r:embed="rId32" cstate="none"/>
+                    <a:srcRect/>
+                    <a:stretch>
+                      <a:fillRect/>
+                    </a:stretch>
+                  </pic:blipFill>
+                  <pic:spPr bwMode="auto">
+                    <a:xfrm>
+                      <a:off x="0" y="0"/>
                       <a:ext cx="5400675" cy="3914775"/>
                     </a:xfrm>
                     <a:prstGeom prst="rect">
@@ -30219,7 +30257,7 @@
           <w:sz w:val="20"/>
           <w:szCs w:val="20"/>
         </w:rPr>
-        <w:t xml:space="preserve">Figura 23. La función de selección de casos del detector, con la documentación de sus decisiones de diseño.</w:t>
+        <w:t xml:space="preserve">Figura 24. La función de selección de casos del detector, con la documentación de sus decisiones de diseño.</w:t>
       </w:r>
     </w:p>
     <w:p>

</xml_diff>

<commit_message>
Cierra 3.6 (horas hasta el 30 ago), bibliografia arXiv:2406.16308 y numeracion 4.7/4.8
</commit_message>
<xml_diff>
--- a/memoria/memoria_TFG.docx
+++ b/memoria/memoria_TFG.docx
@@ -6771,6 +6771,108 @@
                 <w:sz w:val="20"/>
                 <w:szCs w:val="20"/>
               </w:rPr>
+              <w:t xml:space="preserve">15 ago – 30 ago</w:t>
+            </w:r>
+          </w:p>
+        </w:tc>
+        <w:tc>
+          <w:tcPr>
+            <w:tcW w:type="dxa" w:w="1800"/>
+          </w:tcPr>
+          <w:p>
+            <w:pPr>
+              <w:spacing w:after="0"/>
+            </w:pPr>
+            <w:r>
+              <w:rPr>
+                <w:rFonts w:ascii="Arial" w:cs="Arial" w:eastAsia="Arial" w:hAnsi="Arial"/>
+                <w:b w:val="false"/>
+                <w:bCs w:val="false"/>
+                <w:sz w:val="20"/>
+                <w:szCs w:val="20"/>
+              </w:rPr>
+              <w:t xml:space="preserve">16</w:t>
+            </w:r>
+          </w:p>
+        </w:tc>
+        <w:tc>
+          <w:tcPr>
+            <w:tcW w:type="dxa" w:w="1800"/>
+          </w:tcPr>
+          <w:p>
+            <w:pPr>
+              <w:spacing w:after="0"/>
+            </w:pPr>
+            <w:r>
+              <w:rPr>
+                <w:rFonts w:ascii="Arial" w:cs="Arial" w:eastAsia="Arial" w:hAnsi="Arial"/>
+                <w:b w:val="false"/>
+                <w:bCs w:val="false"/>
+                <w:sz w:val="20"/>
+                <w:szCs w:val="20"/>
+              </w:rPr>
+              <w:t xml:space="preserve">—</w:t>
+            </w:r>
+          </w:p>
+        </w:tc>
+        <w:tc>
+          <w:tcPr>
+            <w:tcW w:type="dxa" w:w="1800"/>
+          </w:tcPr>
+          <w:p>
+            <w:pPr>
+              <w:spacing w:after="0"/>
+            </w:pPr>
+            <w:r>
+              <w:rPr>
+                <w:rFonts w:ascii="Arial" w:cs="Arial" w:eastAsia="Arial" w:hAnsi="Arial"/>
+                <w:b w:val="false"/>
+                <w:bCs w:val="false"/>
+                <w:sz w:val="20"/>
+                <w:szCs w:val="20"/>
+              </w:rPr>
+              <w:t xml:space="preserve">≥ 60 h (estimación)</w:t>
+            </w:r>
+          </w:p>
+        </w:tc>
+        <w:tc>
+          <w:tcPr>
+            <w:tcW w:type="dxa" w:w="1800"/>
+          </w:tcPr>
+          <w:p>
+            <w:pPr>
+              <w:spacing w:after="0"/>
+            </w:pPr>
+            <w:r>
+              <w:rPr>
+                <w:rFonts w:ascii="Arial" w:cs="Arial" w:eastAsia="Arial" w:hAnsi="Arial"/>
+                <w:b w:val="false"/>
+                <w:bCs w:val="false"/>
+                <w:sz w:val="20"/>
+                <w:szCs w:val="20"/>
+              </w:rPr>
+              <w:t xml:space="preserve">Demostrador web, 19 capturas, dataset Sparkov, ajuste QLoRA, comparativa con AirLLM</w:t>
+            </w:r>
+          </w:p>
+        </w:tc>
+      </w:tr>
+      <w:tr>
+        <w:tc>
+          <w:tcPr>
+            <w:tcW w:type="dxa" w:w="1800"/>
+          </w:tcPr>
+          <w:p>
+            <w:pPr>
+              <w:spacing w:after="0"/>
+            </w:pPr>
+            <w:r>
+              <w:rPr>
+                <w:rFonts w:ascii="Arial" w:cs="Arial" w:eastAsia="Arial" w:hAnsi="Arial"/>
+                <w:b w:val="false"/>
+                <w:bCs w:val="false"/>
+                <w:sz w:val="20"/>
+                <w:szCs w:val="20"/>
+              </w:rPr>
               <w:t xml:space="preserve">**Total a la fecha**</w:t>
             </w:r>
           </w:p>
@@ -6791,7 +6893,7 @@
                 <w:sz w:val="20"/>
                 <w:szCs w:val="20"/>
               </w:rPr>
-              <w:t xml:space="preserve">**109**</w:t>
+              <w:t xml:space="preserve">**125**</w:t>
             </w:r>
           </w:p>
         </w:tc>
@@ -6831,7 +6933,7 @@
                 <w:sz w:val="20"/>
                 <w:szCs w:val="20"/>
               </w:rPr>
-              <w:t xml:space="preserve">**151 h**</w:t>
+              <w:t xml:space="preserve">**≥ 211 h**</w:t>
             </w:r>
           </w:p>
         </w:tc>
@@ -6851,7 +6953,7 @@
                 <w:sz w:val="20"/>
                 <w:szCs w:val="20"/>
               </w:rPr>
-              <w:t xml:space="preserve">**50 % de las 300 h nominales**</w:t>
+              <w:t xml:space="preserve">**≥ 70 % de las 300 h nominales**</w:t>
             </w:r>
           </w:p>
         </w:tc>
@@ -6875,6 +6977,21 @@
           <w:szCs w:val="22"/>
         </w:rPr>
         <w:t xml:space="preserve">Las franjas horarias que registran los ficheros de resultados delimitan las jornadas del último tramo: entre el 2 y el 6 de agosto hay actividad desde las 00:57 hasta las 21:31 según el día. En ese periodo se cerró el objetivo específico 4 —incluida una ejecución desatendida de siete horas y cuarenta minutos—, se construyeron dos guiones de experimentación completos, se leyeron cinco trabajos de la literatura y se redactó la memoria.</w:t>
+      </w:r>
+    </w:p>
+    <w:p>
+      <w:pPr>
+        <w:spacing w:after="160" w:line="360" w:lineRule="auto"/>
+        <w:ind w:firstLine="425"/>
+        <w:jc w:val="both"/>
+      </w:pPr>
+      <w:r>
+        <w:rPr>
+          <w:rFonts w:ascii="Arial" w:cs="Arial" w:eastAsia="Arial" w:hAnsi="Arial"/>
+          <w:sz w:val="22"/>
+          <w:szCs w:val="22"/>
+        </w:rPr>
+        <w:t xml:space="preserve">El tramo del 15 al 30 de agosto no se reconstruye con el mismo detalle que los anteriores: la evidencia documental (commits del 18, 20, 21, 25 y 26 de agosto; entrenamiento QLoRA de 29,6 horas, con dos apagones del equipo de por medio; ejecución de AirLLM de 2 h 28 min) confirma en qué días hubo trabajo, pero no cuántas horas activas exactamente, y de ese entrenamiento y esa ejecución la mayor parte fue cómputo desatendido y no dedicación. La cifra de 60 horas es una estimación propia a la baja, no una reconstrucción a partir de registros.</w:t>
       </w:r>
     </w:p>
     <w:p>
@@ -11102,7 +11219,7 @@
           <w:sz w:val="26"/>
           <w:szCs w:val="26"/>
         </w:rPr>
-        <w:t xml:space="preserve">4.8 Demostrador web</w:t>
+        <w:t xml:space="preserve">4.7 Demostrador web</w:t>
       </w:r>
     </w:p>
     <w:p>
@@ -11302,7 +11419,7 @@
           <w:sz w:val="26"/>
           <w:szCs w:val="26"/>
         </w:rPr>
-        <w:t xml:space="preserve">4.7 Seguimiento del desarrollo</w:t>
+        <w:t xml:space="preserve">4.8 Seguimiento del desarrollo</w:t>
       </w:r>
     </w:p>
     <w:p>
@@ -29558,7 +29675,7 @@
           <w:sz w:val="22"/>
           <w:szCs w:val="22"/>
         </w:rPr>
-        <w:t xml:space="preserve">Anomaly Detection of Tabular Data Using LLMs (2024). arXiv:2406.16308. [Completar autores desde arxiv.org/abs/2406.16308 antes de entregar: no se han verificado.]</w:t>
+        <w:t xml:space="preserve">Baisholanova, K., et al. (2025). FraudX AI: An Interpretable Machine Learning Framework for Credit Card Fraud Detection on Imbalanced Datasets. Computers, 14(4), 120. https://doi.org/10.3390/computers14040120</w:t>
       </w:r>
     </w:p>
     <w:p>
@@ -29572,7 +29689,7 @@
           <w:sz w:val="22"/>
           <w:szCs w:val="22"/>
         </w:rPr>
-        <w:t xml:space="preserve">Baisholanova, K., et al. (2025). FraudX AI: An Interpretable Machine Learning Framework for Credit Card Fraud Detection on Imbalanced Datasets. Computers, 14(4), 120. https://doi.org/10.3390/computers14040120</w:t>
+        <w:t xml:space="preserve">Bhattacharya, G., et al. (2025). MASCA: LLM based-Multi Agents System for Credit Assessment. arXiv:2507.22758.</w:t>
       </w:r>
     </w:p>
     <w:p>
@@ -29586,7 +29703,7 @@
           <w:sz w:val="22"/>
           <w:szCs w:val="22"/>
         </w:rPr>
-        <w:t xml:space="preserve">Bhattacharya, G., et al. (2025). MASCA: LLM based-Multi Agents System for Credit Assessment. arXiv:2507.22758.</w:t>
+        <w:t xml:space="preserve">Bilal, A., Ebert, D., &amp; Lin, B. (2025). LLMs for Explainable AI: A Comprehensive Survey. arXiv:2504.00125.</w:t>
       </w:r>
     </w:p>
     <w:p>
@@ -29600,7 +29717,7 @@
           <w:sz w:val="22"/>
           <w:szCs w:val="22"/>
         </w:rPr>
-        <w:t xml:space="preserve">Bilal, A., Ebert, D., &amp; Lin, B. (2025). LLMs for Explainable AI: A Comprehensive Survey. arXiv:2504.00125.</w:t>
+        <w:t xml:space="preserve">Breiman, L. (2001). Random Forests. Machine Learning, 45(1), 5-32.</w:t>
       </w:r>
     </w:p>
     <w:p>
@@ -29614,7 +29731,7 @@
           <w:sz w:val="22"/>
           <w:szCs w:val="22"/>
         </w:rPr>
-        <w:t xml:space="preserve">Breiman, L. (2001). Random Forests. Machine Learning, 45(1), 5-32.</w:t>
+        <w:t xml:space="preserve">Chen, T., &amp; Guestrin, C. (2016). XGBoost: A Scalable Tree Boosting System. En Proceedings of the 22nd ACM SIGKDD International Conference on Knowledge Discovery and Data Mining (pp. 785-794). ACM.</w:t>
       </w:r>
     </w:p>
     <w:p>
@@ -29628,7 +29745,7 @@
           <w:sz w:val="22"/>
           <w:szCs w:val="22"/>
         </w:rPr>
-        <w:t xml:space="preserve">Chen, T., &amp; Guestrin, C. (2016). XGBoost: A Scalable Tree Boosting System. En Proceedings of the 22nd ACM SIGKDD International Conference on Knowledge Discovery and Data Mining (pp. 785-794). ACM.</w:t>
+        <w:t xml:space="preserve">CrewAI. (2026). CrewAI documentation. https://docs.crewai.com</w:t>
       </w:r>
     </w:p>
     <w:p>
@@ -29642,7 +29759,7 @@
           <w:sz w:val="22"/>
           <w:szCs w:val="22"/>
         </w:rPr>
-        <w:t xml:space="preserve">CrewAI. (2026). CrewAI documentation. https://docs.crewai.com</w:t>
+        <w:t xml:space="preserve">Dal Pozzolo, A., Caelen, O., Johnson, R. A., &amp; Bontempi, G. (2015). Calibrating Probability with Undersampling for Unbalanced Classification. En 2015 IEEE Symposium Series on Computational Intelligence (pp. 159-166). IEEE.</w:t>
       </w:r>
     </w:p>
     <w:p>
@@ -29656,7 +29773,7 @@
           <w:sz w:val="22"/>
           <w:szCs w:val="22"/>
         </w:rPr>
-        <w:t xml:space="preserve">Dal Pozzolo, A., Caelen, O., Johnson, R. A., &amp; Bontempi, G. (2015). Calibrating Probability with Undersampling for Unbalanced Classification. En 2015 IEEE Symposium Series on Computational Intelligence (pp. 159-166). IEEE.</w:t>
+        <w:t xml:space="preserve">Kabane, S. (2024). Impact of Sampling Techniques and Data Leakage on XGBoost Performance in Credit Card Fraud Detection. arXiv:2412.07437.</w:t>
       </w:r>
     </w:p>
     <w:p>
@@ -29670,7 +29787,7 @@
           <w:sz w:val="22"/>
           <w:szCs w:val="22"/>
         </w:rPr>
-        <w:t xml:space="preserve">Kabane, S. (2024). Impact of Sampling Techniques and Data Leakage on XGBoost Performance in Credit Card Fraud Detection. arXiv:2412.07437.</w:t>
+        <w:t xml:space="preserve">Li, A., Zhao, Y., Qiu, C., Kloft, M., Smyth, P., Rudolph, M., &amp; Mandt, S. (2024). Anomaly Detection of Tabular Data Using LLMs. arXiv:2406.16308.</w:t>
       </w:r>
     </w:p>
     <w:p>

</xml_diff>

<commit_message>
3.6: separa las 15 h de redaccion/revision de la memoria de las 60 h tecnicas
</commit_message>
<xml_diff>
--- a/memoria/memoria_TFG.docx
+++ b/memoria/memoria_TFG.docx
@@ -6873,6 +6873,108 @@
                 <w:sz w:val="20"/>
                 <w:szCs w:val="20"/>
               </w:rPr>
+              <w:t xml:space="preserve">15 ago – 30 ago</w:t>
+            </w:r>
+          </w:p>
+        </w:tc>
+        <w:tc>
+          <w:tcPr>
+            <w:tcW w:type="dxa" w:w="1800"/>
+          </w:tcPr>
+          <w:p>
+            <w:pPr>
+              <w:spacing w:after="0"/>
+            </w:pPr>
+            <w:r>
+              <w:rPr>
+                <w:rFonts w:ascii="Arial" w:cs="Arial" w:eastAsia="Arial" w:hAnsi="Arial"/>
+                <w:b w:val="false"/>
+                <w:bCs w:val="false"/>
+                <w:sz w:val="20"/>
+                <w:szCs w:val="20"/>
+              </w:rPr>
+              <w:t xml:space="preserve">—</w:t>
+            </w:r>
+          </w:p>
+        </w:tc>
+        <w:tc>
+          <w:tcPr>
+            <w:tcW w:type="dxa" w:w="1800"/>
+          </w:tcPr>
+          <w:p>
+            <w:pPr>
+              <w:spacing w:after="0"/>
+            </w:pPr>
+            <w:r>
+              <w:rPr>
+                <w:rFonts w:ascii="Arial" w:cs="Arial" w:eastAsia="Arial" w:hAnsi="Arial"/>
+                <w:b w:val="false"/>
+                <w:bCs w:val="false"/>
+                <w:sz w:val="20"/>
+                <w:szCs w:val="20"/>
+              </w:rPr>
+              <w:t xml:space="preserve">—</w:t>
+            </w:r>
+          </w:p>
+        </w:tc>
+        <w:tc>
+          <w:tcPr>
+            <w:tcW w:type="dxa" w:w="1800"/>
+          </w:tcPr>
+          <w:p>
+            <w:pPr>
+              <w:spacing w:after="0"/>
+            </w:pPr>
+            <w:r>
+              <w:rPr>
+                <w:rFonts w:ascii="Arial" w:cs="Arial" w:eastAsia="Arial" w:hAnsi="Arial"/>
+                <w:b w:val="false"/>
+                <w:bCs w:val="false"/>
+                <w:sz w:val="20"/>
+                <w:szCs w:val="20"/>
+              </w:rPr>
+              <w:t xml:space="preserve">≥ 15 h (estimación)</w:t>
+            </w:r>
+          </w:p>
+        </w:tc>
+        <w:tc>
+          <w:tcPr>
+            <w:tcW w:type="dxa" w:w="1800"/>
+          </w:tcPr>
+          <w:p>
+            <w:pPr>
+              <w:spacing w:after="0"/>
+            </w:pPr>
+            <w:r>
+              <w:rPr>
+                <w:rFonts w:ascii="Arial" w:cs="Arial" w:eastAsia="Arial" w:hAnsi="Arial"/>
+                <w:b w:val="false"/>
+                <w:bCs w:val="false"/>
+                <w:sz w:val="20"/>
+                <w:szCs w:val="20"/>
+              </w:rPr>
+              <w:t xml:space="preserve">Redacción y revisión de la memoria: capítulo 4 reescrito, secciones 5.13 y 5.14, capítulo 6 revisado dos veces</w:t>
+            </w:r>
+          </w:p>
+        </w:tc>
+      </w:tr>
+      <w:tr>
+        <w:tc>
+          <w:tcPr>
+            <w:tcW w:type="dxa" w:w="1800"/>
+          </w:tcPr>
+          <w:p>
+            <w:pPr>
+              <w:spacing w:after="0"/>
+            </w:pPr>
+            <w:r>
+              <w:rPr>
+                <w:rFonts w:ascii="Arial" w:cs="Arial" w:eastAsia="Arial" w:hAnsi="Arial"/>
+                <w:b w:val="false"/>
+                <w:bCs w:val="false"/>
+                <w:sz w:val="20"/>
+                <w:szCs w:val="20"/>
+              </w:rPr>
               <w:t xml:space="preserve">**Total a la fecha**</w:t>
             </w:r>
           </w:p>
@@ -6933,7 +7035,7 @@
                 <w:sz w:val="20"/>
                 <w:szCs w:val="20"/>
               </w:rPr>
-              <w:t xml:space="preserve">**≥ 211 h**</w:t>
+              <w:t xml:space="preserve">**≥ 226 h**</w:t>
             </w:r>
           </w:p>
         </w:tc>
@@ -6953,7 +7055,7 @@
                 <w:sz w:val="20"/>
                 <w:szCs w:val="20"/>
               </w:rPr>
-              <w:t xml:space="preserve">**≥ 70 % de las 300 h nominales**</w:t>
+              <w:t xml:space="preserve">**≥ 75 % de las 300 h nominales**</w:t>
             </w:r>
           </w:p>
         </w:tc>
@@ -6991,7 +7093,7 @@
           <w:sz w:val="22"/>
           <w:szCs w:val="22"/>
         </w:rPr>
-        <w:t xml:space="preserve">El tramo del 15 al 30 de agosto no se reconstruye con el mismo detalle que los anteriores: la evidencia documental (commits del 18, 20, 21, 25 y 26 de agosto; entrenamiento QLoRA de 29,6 horas, con dos apagones del equipo de por medio; ejecución de AirLLM de 2 h 28 min) confirma en qué días hubo trabajo, pero no cuántas horas activas exactamente, y de ese entrenamiento y esa ejecución la mayor parte fue cómputo desatendido y no dedicación. La cifra de 60 horas es una estimación propia a la baja, no una reconstrucción a partir de registros.</w:t>
+        <w:t xml:space="preserve">El tramo del 15 al 30 de agosto no se reconstruye con el mismo detalle que los anteriores: la evidencia documental (commits del 18, 20, 21, 25 y 26 de agosto; entrenamiento QLoRA de 29,6 horas, con dos apagones del equipo de por medio; ejecución de AirLLM de 2 h 28 min) confirma en qué días hubo trabajo, pero no cuántas horas activas exactamente, y de ese entrenamiento y esa ejecución la mayor parte fue cómputo desatendido y no dedicación. Las cifras de 60 y 15 horas son estimaciones propias a la baja, no una reconstrucción a partir de registros; se reportan por separado porque cubren trabajo de naturaleza distinta —ejecución técnica frente a redacción y revisión del texto— aunque ambas caen en el mismo periodo de calendario.</w:t>
       </w:r>
     </w:p>
     <w:p>

</xml_diff>

<commit_message>
3.6/3.7: 25h de redaccion (corregido de 15), fase de bibliografia y plan de relectura final
</commit_message>
<xml_diff>
--- a/memoria/memoria_TFG.docx
+++ b/memoria/memoria_TFG.docx
@@ -6933,7 +6933,7 @@
                 <w:sz w:val="20"/>
                 <w:szCs w:val="20"/>
               </w:rPr>
-              <w:t xml:space="preserve">≥ 15 h (estimación)</w:t>
+              <w:t xml:space="preserve">≥ 25 h (estimación)</w:t>
             </w:r>
           </w:p>
         </w:tc>
@@ -6975,6 +6975,108 @@
                 <w:sz w:val="20"/>
                 <w:szCs w:val="20"/>
               </w:rPr>
+              <w:t xml:space="preserve">1 ago – 30 ago</w:t>
+            </w:r>
+          </w:p>
+        </w:tc>
+        <w:tc>
+          <w:tcPr>
+            <w:tcW w:type="dxa" w:w="1800"/>
+          </w:tcPr>
+          <w:p>
+            <w:pPr>
+              <w:spacing w:after="0"/>
+            </w:pPr>
+            <w:r>
+              <w:rPr>
+                <w:rFonts w:ascii="Arial" w:cs="Arial" w:eastAsia="Arial" w:hAnsi="Arial"/>
+                <w:b w:val="false"/>
+                <w:bCs w:val="false"/>
+                <w:sz w:val="20"/>
+                <w:szCs w:val="20"/>
+              </w:rPr>
+              <w:t xml:space="preserve">—</w:t>
+            </w:r>
+          </w:p>
+        </w:tc>
+        <w:tc>
+          <w:tcPr>
+            <w:tcW w:type="dxa" w:w="1800"/>
+          </w:tcPr>
+          <w:p>
+            <w:pPr>
+              <w:spacing w:after="0"/>
+            </w:pPr>
+            <w:r>
+              <w:rPr>
+                <w:rFonts w:ascii="Arial" w:cs="Arial" w:eastAsia="Arial" w:hAnsi="Arial"/>
+                <w:b w:val="false"/>
+                <w:bCs w:val="false"/>
+                <w:sz w:val="20"/>
+                <w:szCs w:val="20"/>
+              </w:rPr>
+              <w:t xml:space="preserve">—</w:t>
+            </w:r>
+          </w:p>
+        </w:tc>
+        <w:tc>
+          <w:tcPr>
+            <w:tcW w:type="dxa" w:w="1800"/>
+          </w:tcPr>
+          <w:p>
+            <w:pPr>
+              <w:spacing w:after="0"/>
+            </w:pPr>
+            <w:r>
+              <w:rPr>
+                <w:rFonts w:ascii="Arial" w:cs="Arial" w:eastAsia="Arial" w:hAnsi="Arial"/>
+                <w:b w:val="false"/>
+                <w:bCs w:val="false"/>
+                <w:sz w:val="20"/>
+                <w:szCs w:val="20"/>
+              </w:rPr>
+              <w:t xml:space="preserve">≥ 20 h (estimación)</w:t>
+            </w:r>
+          </w:p>
+        </w:tc>
+        <w:tc>
+          <w:tcPr>
+            <w:tcW w:type="dxa" w:w="1800"/>
+          </w:tcPr>
+          <w:p>
+            <w:pPr>
+              <w:spacing w:after="0"/>
+            </w:pPr>
+            <w:r>
+              <w:rPr>
+                <w:rFonts w:ascii="Arial" w:cs="Arial" w:eastAsia="Arial" w:hAnsi="Arial"/>
+                <w:b w:val="false"/>
+                <w:bCs w:val="false"/>
+                <w:sz w:val="20"/>
+                <w:szCs w:val="20"/>
+              </w:rPr>
+              <w:t xml:space="preserve">Búsqueda y lectura de los ocho trabajos del capítulo 2, y redacción del posicionamiento (2.6)</w:t>
+            </w:r>
+          </w:p>
+        </w:tc>
+      </w:tr>
+      <w:tr>
+        <w:tc>
+          <w:tcPr>
+            <w:tcW w:type="dxa" w:w="1800"/>
+          </w:tcPr>
+          <w:p>
+            <w:pPr>
+              <w:spacing w:after="0"/>
+            </w:pPr>
+            <w:r>
+              <w:rPr>
+                <w:rFonts w:ascii="Arial" w:cs="Arial" w:eastAsia="Arial" w:hAnsi="Arial"/>
+                <w:b w:val="false"/>
+                <w:bCs w:val="false"/>
+                <w:sz w:val="20"/>
+                <w:szCs w:val="20"/>
+              </w:rPr>
               <w:t xml:space="preserve">**Total a la fecha**</w:t>
             </w:r>
           </w:p>
@@ -7035,7 +7137,7 @@
                 <w:sz w:val="20"/>
                 <w:szCs w:val="20"/>
               </w:rPr>
-              <w:t xml:space="preserve">**≥ 226 h**</w:t>
+              <w:t xml:space="preserve">**≥ 256 h**</w:t>
             </w:r>
           </w:p>
         </w:tc>
@@ -7055,7 +7157,7 @@
                 <w:sz w:val="20"/>
                 <w:szCs w:val="20"/>
               </w:rPr>
-              <w:t xml:space="preserve">**≥ 75 % de las 300 h nominales**</w:t>
+              <w:t xml:space="preserve">**≥ 85 % de las 300 h nominales**</w:t>
             </w:r>
           </w:p>
         </w:tc>
@@ -7093,7 +7195,7 @@
           <w:sz w:val="22"/>
           <w:szCs w:val="22"/>
         </w:rPr>
-        <w:t xml:space="preserve">El tramo del 15 al 30 de agosto no se reconstruye con el mismo detalle que los anteriores: la evidencia documental (commits del 18, 20, 21, 25 y 26 de agosto; entrenamiento QLoRA de 29,6 horas, con dos apagones del equipo de por medio; ejecución de AirLLM de 2 h 28 min) confirma en qué días hubo trabajo, pero no cuántas horas activas exactamente, y de ese entrenamiento y esa ejecución la mayor parte fue cómputo desatendido y no dedicación. Las cifras de 60 y 15 horas son estimaciones propias a la baja, no una reconstrucción a partir de registros; se reportan por separado porque cubren trabajo de naturaleza distinta —ejecución técnica frente a redacción y revisión del texto— aunque ambas caen en el mismo periodo de calendario.</w:t>
+        <w:t xml:space="preserve">El tramo del 15 al 30 de agosto no se reconstruye con el mismo detalle que los anteriores: la evidencia documental (commits del 18, 20, 21, 25 y 26 de agosto; entrenamiento QLoRA de 29,6 horas, con dos apagones del equipo de por medio; ejecución de AirLLM de 2 h 28 min) confirma en qué días hubo trabajo, pero no cuántas horas activas exactamente, y de ese entrenamiento y esa ejecución la mayor parte fue cómputo desatendido y no dedicación. Las cifras de 60, 25 y 20 horas son estimaciones propias a la baja, no una reconstrucción a partir de registros; se reportan por separado porque cubren trabajo de naturaleza distinta —ejecución técnica, redacción y revisión del texto, y búsqueda y lectura de literatura— aunque las tres se solapan en el calendario. La última no se limita a agosto: la búsqueda de trabajos relacionados empezó nada más reorientar el proyecto a finales de julio y continuó según el capítulo 2 lo fue necesitando.</w:t>
       </w:r>
     </w:p>
     <w:p>
@@ -7125,22 +7227,22 @@
           <w:sz w:val="22"/>
           <w:szCs w:val="22"/>
         </w:rPr>
-        <w:t xml:space="preserve">El proyecto se sitúa a mitad de la dedicación nominal con la fase experimental cerrada. La explicación está en el capítulo 4: al desaparecer la dependencia del entorno externo, el desarrollo técnico que la planificación inicial situaba en cuatro meses se resolvió en poco más de dos semanas. La reorientación, que fue el mayor contratiempo del proyecto, redujo a la vez su coste de ejecución.</w:t>
-      </w:r>
-    </w:p>
-    <w:p>
-      <w:pPr>
-        <w:spacing w:after="160" w:line="360" w:lineRule="auto"/>
-        <w:ind w:firstLine="425"/>
-        <w:jc w:val="both"/>
-      </w:pPr>
-      <w:r>
-        <w:rPr>
-          <w:rFonts w:ascii="Arial" w:cs="Arial" w:eastAsia="Arial" w:hAnsi="Arial"/>
-          <w:sz w:val="22"/>
-          <w:szCs w:val="22"/>
-        </w:rPr>
-        <w:t xml:space="preserve">El esfuerzo restante se destina a la extensión descrita en 3.7 y a la redacción, revisión y preparación de la defensa.</w:t>
+        <w:t xml:space="preserve">El proyecto se sitúa en torno al 85 % de la dedicación nominal, con la fase experimental y las dos extensiones exploratorias (Sparkov, QLoRA) cerradas. La explicación de que el conjunto quede por debajo de las 300 h nominales pese al volumen de trabajo hecho está en el capítulo 4: al desaparecer la dependencia del entorno externo, el desarrollo técnico que la planificación inicial situaba en cuatro meses se resolvió en poco más de dos semanas. La reorientación, que fue el mayor contratiempo del proyecto, redujo a la vez su coste de ejecución.</w:t>
+      </w:r>
+    </w:p>
+    <w:p>
+      <w:pPr>
+        <w:spacing w:after="160" w:line="360" w:lineRule="auto"/>
+        <w:ind w:firstLine="425"/>
+        <w:jc w:val="both"/>
+      </w:pPr>
+      <w:r>
+        <w:rPr>
+          <w:rFonts w:ascii="Arial" w:cs="Arial" w:eastAsia="Arial" w:hAnsi="Arial"/>
+          <w:sz w:val="22"/>
+          <w:szCs w:val="22"/>
+        </w:rPr>
+        <w:t xml:space="preserve">El esfuerzo restante se destina a la relectura final de la memoria y a la preparación de la defensa, descritas en 3.7.</w:t>
       </w:r>
     </w:p>
     <w:p>
@@ -7249,6 +7351,21 @@
           <w:szCs w:val="22"/>
         </w:rPr>
         <w:t xml:space="preserve">El plan restante invierte la proporción entre experimentación y redacción respecto a lo hecho hasta ahora, por una razón deliberada: la fase experimental está cerrada y el riesgo dominante pasa a ser la subestimación del tiempo de escritura.</w:t>
+      </w:r>
+    </w:p>
+    <w:p>
+      <w:pPr>
+        <w:spacing w:after="160" w:line="360" w:lineRule="auto"/>
+        <w:ind w:firstLine="425"/>
+        <w:jc w:val="both"/>
+      </w:pPr>
+      <w:r>
+        <w:rPr>
+          <w:rFonts w:ascii="Arial" w:cs="Arial" w:eastAsia="Arial" w:hAnsi="Arial"/>
+          <w:sz w:val="22"/>
+          <w:szCs w:val="22"/>
+        </w:rPr>
+        <w:t xml:space="preserve">A partir del 31 de agosto se inicia una relectura completa de la memoria, capítulo por capítulo, de la que se espera que surjan dudas y correcciones puntuales de contenido que se resolverán sobre la marcha; ese tiempo no está incluido en la cifra de 3.6 porque todavía no se ha empleado. Queda además por confirmar si la defensa exige una presentación aparte, que en ese caso se sumaría al plan.</w:t>
       </w:r>
     </w:p>
     <w:tbl>

</xml_diff>